<commit_message>
[ADD] CFA + Material ZIP
</commit_message>
<xml_diff>
--- a/fuentes/621209_CF2_DU.docx
+++ b/fuentes/621209_CF2_DU.docx
@@ -5276,7 +5276,7 @@
           <w:noProof/>
         </w:rPr>
         <w:drawing>
-          <wp:inline distT="0" distB="0" distL="0" distR="0" wp14:anchorId="2920DA82" wp14:editId="20AB347F">
+          <wp:inline distT="0" distB="0" distL="0" distR="0" wp14:anchorId="2920DA82" wp14:editId="6B8A37D8">
             <wp:extent cx="4680000" cy="2632387"/>
             <wp:effectExtent l="0" t="0" r="6350" b="0"/>
             <wp:docPr id="1785472502" name="Imagen 5">
@@ -5363,7 +5363,7 @@
         <w:tblLook w:val="04A0" w:firstRow="1" w:lastRow="0" w:firstColumn="1" w:lastColumn="0" w:noHBand="0" w:noVBand="1"/>
       </w:tblPr>
       <w:tblGrid>
-        <w:gridCol w:w="9962"/>
+        <w:gridCol w:w="9776"/>
       </w:tblGrid>
       <w:tr>
         <w:trPr>
@@ -5371,7 +5371,7 @@
         </w:trPr>
         <w:tc>
           <w:tcPr>
-            <w:tcW w:w="9962" w:type="dxa"/>
+            <w:tcW w:w="9776" w:type="dxa"/>
           </w:tcPr>
           <w:p>
             <w:pPr>
@@ -5394,7 +5394,13 @@
               <w:t xml:space="preserve">Transcripción del video: </w:t>
             </w:r>
             <w:r>
-              <w:t>Canales de distribución</w:t>
+              <w:rPr>
+                <w:bCs/>
+              </w:rPr>
+              <w:t>c</w:t>
+            </w:r>
+            <w:r>
+              <w:t>anales de distribución</w:t>
             </w:r>
             <w:r>
               <w:t>: introducción</w:t>
@@ -5405,7 +5411,7 @@
       <w:tr>
         <w:tc>
           <w:tcPr>
-            <w:tcW w:w="9962" w:type="dxa"/>
+            <w:tcW w:w="9776" w:type="dxa"/>
           </w:tcPr>
           <w:p>
             <w:pPr>
@@ -5436,7 +5442,13 @@
               <w:t>Mayorista:</w:t>
             </w:r>
             <w:r>
-              <w:t xml:space="preserve"> El mayorista es un intermediario que compra a los productores grandes volúmenes con los cuales surte a los detallistas o les vende directamente a empresas que, por el alto nivel de consumo de un producto, deben reducir costos evitando intermediarios. Es el caso de hospitales, hoteles, clubes sociales, entre otros.</w:t>
+              <w:t xml:space="preserve"> </w:t>
+            </w:r>
+            <w:r>
+              <w:t>e</w:t>
+            </w:r>
+            <w:r>
+              <w:t>l mayorista es un intermediario que compra a los productores grandes volúmenes con los cuales surte a los detallistas o les vende directamente a empresas que, por el alto nivel de consumo de un producto, deben reducir costos evitando intermediarios. Es el caso de hospitales, hoteles, clubes sociales, entre otros.</w:t>
             </w:r>
           </w:p>
           <w:p>
@@ -5456,7 +5468,13 @@
               <w:t>Detallista:</w:t>
             </w:r>
             <w:r>
-              <w:t xml:space="preserve"> Es el último intermediario utilizado para llevarle el producto al consumidor final. El segmento meta de los detallistas son los consumidores </w:t>
+              <w:t xml:space="preserve"> </w:t>
+            </w:r>
+            <w:r>
+              <w:t>e</w:t>
+            </w:r>
+            <w:r>
+              <w:t xml:space="preserve">s el último intermediario utilizado para llevarle el producto al consumidor final. El segmento meta de los detallistas son los consumidores </w:t>
             </w:r>
             <w:r>
               <w:lastRenderedPageBreak/>
@@ -5480,7 +5498,13 @@
               <w:t>Agentes:</w:t>
             </w:r>
             <w:r>
-              <w:t xml:space="preserve"> Los agentes pueden ser personas naturales o jurídicas que ayudan a la venta de un producto y representan al proveedor ante el comprador. No adquieren el producto en propiedad, simplemente trabajan bajo una comisión pactada previamente.</w:t>
+              <w:t xml:space="preserve"> </w:t>
+            </w:r>
+            <w:r>
+              <w:t>l</w:t>
+            </w:r>
+            <w:r>
+              <w:t>os agentes pueden ser personas naturales o jurídicas que ayudan a la venta de un producto y representan al proveedor ante el comprador. No adquieren el producto en propiedad, simplemente trabajan bajo una comisión pactada previamente.</w:t>
             </w:r>
           </w:p>
           <w:p>
@@ -7958,7 +7982,7 @@
           <w:noProof/>
         </w:rPr>
         <w:drawing>
-          <wp:inline distT="0" distB="0" distL="0" distR="0" wp14:anchorId="633C3DE0" wp14:editId="5EFCBB52">
+          <wp:inline distT="0" distB="0" distL="0" distR="0" wp14:anchorId="633C3DE0" wp14:editId="4CDD942C">
             <wp:extent cx="4680000" cy="2632500"/>
             <wp:effectExtent l="0" t="0" r="6350" b="0"/>
             <wp:docPr id="3" name="Imagen 1">
@@ -10610,7 +10634,21 @@
                 <w:rFonts w:cs="Calibri"/>
                 <w:lang w:eastAsia="es-CO"/>
               </w:rPr>
-              <w:t xml:space="preserve"> ¿A quién no le ha pasado? Compran un producto y les prometen que llegará en dos o tres días, pero pasa una semana, pasan dos y el pedido no aparece por ninguna parte.</w:t>
+              <w:t xml:space="preserve"> ¿</w:t>
+            </w:r>
+            <w:r>
+              <w:rPr>
+                <w:rFonts w:cs="Calibri"/>
+                <w:lang w:eastAsia="es-CO"/>
+              </w:rPr>
+              <w:t>a</w:t>
+            </w:r>
+            <w:r>
+              <w:rPr>
+                <w:rFonts w:cs="Calibri"/>
+                <w:lang w:eastAsia="es-CO"/>
+              </w:rPr>
+              <w:t xml:space="preserve"> quién no le ha pasado? Compran un producto y les prometen que llegará en dos o tres días, pero pasa una semana, pasan dos y el pedido no aparece por ninguna parte.</w:t>
             </w:r>
           </w:p>
           <w:p>
@@ -10641,7 +10679,21 @@
                 <w:rFonts w:cs="Calibri"/>
                 <w:lang w:eastAsia="es-CO"/>
               </w:rPr>
-              <w:t xml:space="preserve"> Y cuando por fin llega, resulta que no era lo que esperaban. Entonces toca devolverlo, reclamar o empezar otro proceso que puede ser igual de demorado.</w:t>
+              <w:t xml:space="preserve"> </w:t>
+            </w:r>
+            <w:r>
+              <w:rPr>
+                <w:rFonts w:cs="Calibri"/>
+                <w:lang w:eastAsia="es-CO"/>
+              </w:rPr>
+              <w:t>y</w:t>
+            </w:r>
+            <w:r>
+              <w:rPr>
+                <w:rFonts w:cs="Calibri"/>
+                <w:lang w:eastAsia="es-CO"/>
+              </w:rPr>
+              <w:t xml:space="preserve"> cuando por fin llega, resulta que no era lo que esperaban. Entonces toca devolverlo, reclamar o empezar otro proceso que puede ser igual de demorado.</w:t>
             </w:r>
           </w:p>
           <w:p>
@@ -10671,7 +10723,21 @@
                 <w:rFonts w:cs="Calibri"/>
                 <w:lang w:eastAsia="es-CO"/>
               </w:rPr>
-              <w:t xml:space="preserve"> Cuando eso pasa, casi siempre responsabilizamos a la empresa transportadora.</w:t>
+              <w:t xml:space="preserve"> </w:t>
+            </w:r>
+            <w:r>
+              <w:rPr>
+                <w:rFonts w:cs="Calibri"/>
+                <w:lang w:eastAsia="es-CO"/>
+              </w:rPr>
+              <w:t>c</w:t>
+            </w:r>
+            <w:r>
+              <w:rPr>
+                <w:rFonts w:cs="Calibri"/>
+                <w:lang w:eastAsia="es-CO"/>
+              </w:rPr>
+              <w:t>uando eso pasa, casi siempre responsabilizamos a la empresa transportadora.</w:t>
             </w:r>
           </w:p>
           <w:p>
@@ -10701,7 +10767,21 @@
                 <w:rFonts w:cs="Calibri"/>
                 <w:lang w:eastAsia="es-CO"/>
               </w:rPr>
-              <w:t xml:space="preserve"> Pero la verdad es que el problema puede estar incluso antes de que el producto siquiera salga de la bodega.</w:t>
+              <w:t xml:space="preserve"> </w:t>
+            </w:r>
+            <w:r>
+              <w:rPr>
+                <w:rFonts w:cs="Calibri"/>
+                <w:lang w:eastAsia="es-CO"/>
+              </w:rPr>
+              <w:t>p</w:t>
+            </w:r>
+            <w:r>
+              <w:rPr>
+                <w:rFonts w:cs="Calibri"/>
+                <w:lang w:eastAsia="es-CO"/>
+              </w:rPr>
+              <w:t>ero la verdad es que el problema puede estar incluso antes de que el producto siquiera salga de la bodega.</w:t>
             </w:r>
           </w:p>
           <w:p>
@@ -10731,7 +10811,21 @@
                 <w:rFonts w:cs="Calibri"/>
                 <w:lang w:eastAsia="es-CO"/>
               </w:rPr>
-              <w:t xml:space="preserve"> Para que ese pedido llegara a sus manos, alguien tuvo que revisar inventarios, preparar el producto, empacarlo y coordinar todo el envío.</w:t>
+              <w:t xml:space="preserve"> </w:t>
+            </w:r>
+            <w:r>
+              <w:rPr>
+                <w:rFonts w:cs="Calibri"/>
+                <w:lang w:eastAsia="es-CO"/>
+              </w:rPr>
+              <w:t>p</w:t>
+            </w:r>
+            <w:r>
+              <w:rPr>
+                <w:rFonts w:cs="Calibri"/>
+                <w:lang w:eastAsia="es-CO"/>
+              </w:rPr>
+              <w:t>ara que ese pedido llegara a sus manos, alguien tuvo que revisar inventarios, preparar el producto, empacarlo y coordinar todo el envío.</w:t>
             </w:r>
           </w:p>
           <w:p>
@@ -10761,7 +10855,21 @@
                 <w:rFonts w:cs="Calibri"/>
                 <w:lang w:eastAsia="es-CO"/>
               </w:rPr>
-              <w:t xml:space="preserve"> Y eso que parece tan sencillo es justamente lo que hace la logística.</w:t>
+              <w:t xml:space="preserve"> </w:t>
+            </w:r>
+            <w:r>
+              <w:rPr>
+                <w:rFonts w:cs="Calibri"/>
+                <w:lang w:eastAsia="es-CO"/>
+              </w:rPr>
+              <w:t>y</w:t>
+            </w:r>
+            <w:r>
+              <w:rPr>
+                <w:rFonts w:cs="Calibri"/>
+                <w:lang w:eastAsia="es-CO"/>
+              </w:rPr>
+              <w:t xml:space="preserve"> eso que parece tan sencillo es justamente lo que hace la logística.</w:t>
             </w:r>
           </w:p>
           <w:p>
@@ -10791,7 +10899,21 @@
                 <w:rFonts w:cs="Calibri"/>
                 <w:lang w:eastAsia="es-CO"/>
               </w:rPr>
-              <w:t xml:space="preserve"> Aunque muchas personas la asocian únicamente con el transporte, la logística empieza mucho antes de que un producto salga hacia su destino.</w:t>
+              <w:t xml:space="preserve"> </w:t>
+            </w:r>
+            <w:r>
+              <w:rPr>
+                <w:rFonts w:cs="Calibri"/>
+                <w:lang w:eastAsia="es-CO"/>
+              </w:rPr>
+              <w:t>a</w:t>
+            </w:r>
+            <w:r>
+              <w:rPr>
+                <w:rFonts w:cs="Calibri"/>
+                <w:lang w:eastAsia="es-CO"/>
+              </w:rPr>
+              <w:t>unque muchas personas la asocian únicamente con el transporte, la logística empieza mucho antes de que un producto salga hacia su destino.</w:t>
             </w:r>
           </w:p>
           <w:p>
@@ -10821,7 +10943,21 @@
                 <w:rFonts w:cs="Calibri"/>
                 <w:lang w:eastAsia="es-CO"/>
               </w:rPr>
-              <w:t xml:space="preserve"> Porque también incluye inventarios, almacenamiento, preparación de pedidos y toda la coordinación necesaria para que las entregas se den en los plazos y condiciones prometidas.</w:t>
+              <w:t xml:space="preserve"> </w:t>
+            </w:r>
+            <w:r>
+              <w:rPr>
+                <w:rFonts w:cs="Calibri"/>
+                <w:lang w:eastAsia="es-CO"/>
+              </w:rPr>
+              <w:t>p</w:t>
+            </w:r>
+            <w:r>
+              <w:rPr>
+                <w:rFonts w:cs="Calibri"/>
+                <w:lang w:eastAsia="es-CO"/>
+              </w:rPr>
+              <w:t>orque también incluye inventarios, almacenamiento, preparación de pedidos y toda la coordinación necesaria para que las entregas se den en los plazos y condiciones prometidas.</w:t>
             </w:r>
           </w:p>
           <w:p>
@@ -10851,7 +10987,21 @@
                 <w:rFonts w:cs="Calibri"/>
                 <w:lang w:eastAsia="es-CO"/>
               </w:rPr>
-              <w:t xml:space="preserve"> Cuando esos procesos están bien organizados, el cliente ni lo nota, simplemente recibe lo que compró.</w:t>
+              <w:t xml:space="preserve"> </w:t>
+            </w:r>
+            <w:r>
+              <w:rPr>
+                <w:rFonts w:cs="Calibri"/>
+                <w:lang w:eastAsia="es-CO"/>
+              </w:rPr>
+              <w:t>c</w:t>
+            </w:r>
+            <w:r>
+              <w:rPr>
+                <w:rFonts w:cs="Calibri"/>
+                <w:lang w:eastAsia="es-CO"/>
+              </w:rPr>
+              <w:t>uando esos procesos están bien organizados, el cliente ni lo nota, simplemente recibe lo que compró.</w:t>
             </w:r>
           </w:p>
           <w:p>
@@ -10881,7 +11031,21 @@
                 <w:rFonts w:cs="Calibri"/>
                 <w:lang w:eastAsia="es-CO"/>
               </w:rPr>
-              <w:t xml:space="preserve"> Pero cuando algo falla, es cuando empiezan los problemas: retrasos, errores en los pedidos o clientes que terminan frustrados.</w:t>
+              <w:t xml:space="preserve"> </w:t>
+            </w:r>
+            <w:r>
+              <w:rPr>
+                <w:rFonts w:cs="Calibri"/>
+                <w:lang w:eastAsia="es-CO"/>
+              </w:rPr>
+              <w:t>p</w:t>
+            </w:r>
+            <w:r>
+              <w:rPr>
+                <w:rFonts w:cs="Calibri"/>
+                <w:lang w:eastAsia="es-CO"/>
+              </w:rPr>
+              <w:t>ero cuando algo falla, es cuando empiezan los problemas: retrasos, errores en los pedidos o clientes que terminan frustrados.</w:t>
             </w:r>
           </w:p>
           <w:p>
@@ -10911,7 +11075,21 @@
                 <w:rFonts w:cs="Calibri"/>
                 <w:lang w:eastAsia="es-CO"/>
               </w:rPr>
-              <w:t xml:space="preserve"> Por eso la logística influye mucho más de lo que parece en la experiencia del cliente.</w:t>
+              <w:t xml:space="preserve"> </w:t>
+            </w:r>
+            <w:r>
+              <w:rPr>
+                <w:rFonts w:cs="Calibri"/>
+                <w:lang w:eastAsia="es-CO"/>
+              </w:rPr>
+              <w:t>p</w:t>
+            </w:r>
+            <w:r>
+              <w:rPr>
+                <w:rFonts w:cs="Calibri"/>
+                <w:lang w:eastAsia="es-CO"/>
+              </w:rPr>
+              <w:t>or eso la logística influye mucho más de lo que parece en la experiencia del cliente.</w:t>
             </w:r>
           </w:p>
           <w:p>
@@ -10941,7 +11119,21 @@
                 <w:rFonts w:cs="Calibri"/>
                 <w:lang w:eastAsia="es-CO"/>
               </w:rPr>
-              <w:t xml:space="preserve"> Porque al final, no se trata solo de entregar productos, se trata de cumplir lo que se prometió.</w:t>
+              <w:t xml:space="preserve"> </w:t>
+            </w:r>
+            <w:r>
+              <w:rPr>
+                <w:rFonts w:cs="Calibri"/>
+                <w:lang w:eastAsia="es-CO"/>
+              </w:rPr>
+              <w:t>p</w:t>
+            </w:r>
+            <w:r>
+              <w:rPr>
+                <w:rFonts w:cs="Calibri"/>
+                <w:lang w:eastAsia="es-CO"/>
+              </w:rPr>
+              <w:t>orque al final, no se trata solo de entregar productos, se trata de cumplir lo que se prometió.</w:t>
             </w:r>
           </w:p>
           <w:p>
@@ -10972,7 +11164,21 @@
                 <w:rFonts w:cs="Calibri"/>
                 <w:lang w:eastAsia="es-CO"/>
               </w:rPr>
-              <w:t xml:space="preserve"> Si una empresa promete una entrega rápida, debe tener la capacidad de responder.</w:t>
+              <w:t xml:space="preserve"> </w:t>
+            </w:r>
+            <w:r>
+              <w:rPr>
+                <w:rFonts w:cs="Calibri"/>
+                <w:lang w:eastAsia="es-CO"/>
+              </w:rPr>
+              <w:t>s</w:t>
+            </w:r>
+            <w:r>
+              <w:rPr>
+                <w:rFonts w:cs="Calibri"/>
+                <w:lang w:eastAsia="es-CO"/>
+              </w:rPr>
+              <w:t>i una empresa promete una entrega rápida, debe tener la capacidad de responder.</w:t>
             </w:r>
           </w:p>
           <w:p>
@@ -11002,7 +11208,21 @@
                 <w:rFonts w:cs="Calibri"/>
                 <w:lang w:eastAsia="es-CO"/>
               </w:rPr>
-              <w:t xml:space="preserve"> Y si surge algún inconveniente, debe contar con procesos que le permitan reaccionar de manera oportuna.</w:t>
+              <w:t xml:space="preserve"> </w:t>
+            </w:r>
+            <w:r>
+              <w:rPr>
+                <w:rFonts w:cs="Calibri"/>
+                <w:lang w:eastAsia="es-CO"/>
+              </w:rPr>
+              <w:t>y</w:t>
+            </w:r>
+            <w:r>
+              <w:rPr>
+                <w:rFonts w:cs="Calibri"/>
+                <w:lang w:eastAsia="es-CO"/>
+              </w:rPr>
+              <w:t xml:space="preserve"> si surge algún inconveniente, debe contar con procesos que le permitan reaccionar de manera oportuna.</w:t>
             </w:r>
           </w:p>
           <w:p>
@@ -11032,7 +11252,21 @@
                 <w:rFonts w:cs="Calibri"/>
                 <w:lang w:eastAsia="es-CO"/>
               </w:rPr>
-              <w:t xml:space="preserve"> Incluso cuando el cliente necesita devolver un producto, la logística sigue jugando un papel importante.</w:t>
+              <w:t xml:space="preserve"> </w:t>
+            </w:r>
+            <w:r>
+              <w:rPr>
+                <w:rFonts w:cs="Calibri"/>
+                <w:lang w:eastAsia="es-CO"/>
+              </w:rPr>
+              <w:t>i</w:t>
+            </w:r>
+            <w:r>
+              <w:rPr>
+                <w:rFonts w:cs="Calibri"/>
+                <w:lang w:eastAsia="es-CO"/>
+              </w:rPr>
+              <w:t>ncluso cuando el cliente necesita devolver un producto, la logística sigue jugando un papel importante.</w:t>
             </w:r>
           </w:p>
           <w:p>
@@ -11062,7 +11296,21 @@
                 <w:rFonts w:cs="Calibri"/>
                 <w:lang w:eastAsia="es-CO"/>
               </w:rPr>
-              <w:t xml:space="preserve"> A eso se le conoce como logística inversa, el conjunto de actividades que permiten gestionar cambios, devoluciones o retornos de mercancía.</w:t>
+              <w:t xml:space="preserve"> </w:t>
+            </w:r>
+            <w:r>
+              <w:rPr>
+                <w:rFonts w:cs="Calibri"/>
+                <w:lang w:eastAsia="es-CO"/>
+              </w:rPr>
+              <w:t>a</w:t>
+            </w:r>
+            <w:r>
+              <w:rPr>
+                <w:rFonts w:cs="Calibri"/>
+                <w:lang w:eastAsia="es-CO"/>
+              </w:rPr>
+              <w:t xml:space="preserve"> eso se le conoce como logística inversa, el conjunto de actividades que permiten gestionar cambios, devoluciones o retornos de mercancía.</w:t>
             </w:r>
           </w:p>
           <w:p>
@@ -11092,7 +11340,21 @@
                 <w:rFonts w:cs="Calibri"/>
                 <w:lang w:eastAsia="es-CO"/>
               </w:rPr>
-              <w:t xml:space="preserve"> Un proceso que cada día cobra más importancia, sobre todo porque cada vez compramos más cosas sin salir de casa.</w:t>
+              <w:t xml:space="preserve"> </w:t>
+            </w:r>
+            <w:r>
+              <w:rPr>
+                <w:rFonts w:cs="Calibri"/>
+                <w:lang w:eastAsia="es-CO"/>
+              </w:rPr>
+              <w:t>u</w:t>
+            </w:r>
+            <w:r>
+              <w:rPr>
+                <w:rFonts w:cs="Calibri"/>
+                <w:lang w:eastAsia="es-CO"/>
+              </w:rPr>
+              <w:t>n proceso que cada día cobra más importancia, sobre todo porque cada vez compramos más cosas sin salir de casa.</w:t>
             </w:r>
           </w:p>
           <w:p>
@@ -11122,7 +11384,21 @@
                 <w:rFonts w:cs="Calibri"/>
                 <w:lang w:eastAsia="es-CO"/>
               </w:rPr>
-              <w:t xml:space="preserve"> Porque la experiencia no termina cuando el producto llega a las manos del cliente, el compromiso es el mismo en caso de necesitar un retorno.</w:t>
+              <w:t xml:space="preserve"> </w:t>
+            </w:r>
+            <w:r>
+              <w:rPr>
+                <w:rFonts w:cs="Calibri"/>
+                <w:lang w:eastAsia="es-CO"/>
+              </w:rPr>
+              <w:t>p</w:t>
+            </w:r>
+            <w:r>
+              <w:rPr>
+                <w:rFonts w:cs="Calibri"/>
+                <w:lang w:eastAsia="es-CO"/>
+              </w:rPr>
+              <w:t>orque la experiencia no termina cuando el producto llega a las manos del cliente, el compromiso es el mismo en caso de necesitar un retorno.</w:t>
             </w:r>
           </w:p>
           <w:p>
@@ -11182,7 +11458,21 @@
                 <w:rFonts w:cs="Calibri"/>
                 <w:lang w:eastAsia="es-CO"/>
               </w:rPr>
-              <w:t xml:space="preserve"> Se trata de que las personas reciban lo que compraron cuando lo necesitan y de la manera en que se les prometió.</w:t>
+              <w:t xml:space="preserve"> </w:t>
+            </w:r>
+            <w:r>
+              <w:rPr>
+                <w:rFonts w:cs="Calibri"/>
+                <w:lang w:eastAsia="es-CO"/>
+              </w:rPr>
+              <w:t>s</w:t>
+            </w:r>
+            <w:r>
+              <w:rPr>
+                <w:rFonts w:cs="Calibri"/>
+                <w:lang w:eastAsia="es-CO"/>
+              </w:rPr>
+              <w:t>e trata de que las personas reciban lo que compraron cuando lo necesitan y de la manera en que se les prometió.</w:t>
             </w:r>
           </w:p>
           <w:p>
@@ -11212,7 +11502,21 @@
                 <w:rFonts w:cs="Calibri"/>
                 <w:lang w:eastAsia="es-CO"/>
               </w:rPr>
-              <w:t xml:space="preserve"> Porque buena parte de la satisfacción del cliente se construye justamente ahí, en la experiencia que viene después de hacer la compra.</w:t>
+              <w:t xml:space="preserve"> </w:t>
+            </w:r>
+            <w:r>
+              <w:rPr>
+                <w:rFonts w:cs="Calibri"/>
+                <w:lang w:eastAsia="es-CO"/>
+              </w:rPr>
+              <w:t>p</w:t>
+            </w:r>
+            <w:r>
+              <w:rPr>
+                <w:rFonts w:cs="Calibri"/>
+                <w:lang w:eastAsia="es-CO"/>
+              </w:rPr>
+              <w:t>orque buena parte de la satisfacción del cliente se construye justamente ahí, en la experiencia que viene después de hacer la compra.</w:t>
             </w:r>
           </w:p>
           <w:p>
@@ -11242,7 +11546,21 @@
                 <w:rFonts w:cs="Calibri"/>
                 <w:lang w:eastAsia="es-CO"/>
               </w:rPr>
-              <w:t xml:space="preserve"> Y cuando esa experiencia es positiva, no solo gana el cliente, también gana la empresa, porque la confianza se convierte en una razón para volver.</w:t>
+              <w:t xml:space="preserve"> </w:t>
+            </w:r>
+            <w:r>
+              <w:rPr>
+                <w:rFonts w:cs="Calibri"/>
+                <w:lang w:eastAsia="es-CO"/>
+              </w:rPr>
+              <w:t>y</w:t>
+            </w:r>
+            <w:r>
+              <w:rPr>
+                <w:rFonts w:cs="Calibri"/>
+                <w:lang w:eastAsia="es-CO"/>
+              </w:rPr>
+              <w:t xml:space="preserve"> cuando esa experiencia es positiva, no solo gana el cliente, también gana la empresa, porque la confianza se convierte en una razón para volver.</w:t>
             </w:r>
           </w:p>
         </w:tc>
@@ -12899,13 +13217,19 @@
               <w:rPr>
                 <w:b/>
               </w:rPr>
-              <w:t xml:space="preserve">Transcripción del video: </w:t>
+              <w:t>Transcripción del video</w:t>
+            </w:r>
+            <w:r>
+              <w:rPr>
+                <w:b/>
+              </w:rPr>
+              <w:t xml:space="preserve">.  </w:t>
             </w:r>
             <w:r>
               <w:rPr>
                 <w:bCs/>
               </w:rPr>
-              <w:t>s</w:t>
+              <w:t>S</w:t>
             </w:r>
             <w:r>
               <w:rPr>
@@ -12966,176 +13290,190 @@
     </w:tbl>
     <w:p>
       <w:pPr>
+        <w:spacing w:before="0" w:after="0"/>
+        <w:rPr>
+          <w:rStyle w:val="Extranjerismo"/>
+        </w:rPr>
+      </w:pPr>
+      <w:bookmarkStart w:id="20" w:name="_Toc236327538"/>
+    </w:p>
+    <w:p>
+      <w:pPr>
         <w:pStyle w:val="Ttulo2"/>
         <w:rPr>
           <w:lang w:val="es-419"/>
         </w:rPr>
       </w:pPr>
-      <w:bookmarkStart w:id="20" w:name="_Toc236327538"/>
       <w:r>
         <w:rPr>
           <w:rStyle w:val="Extranjerismo"/>
         </w:rPr>
+        <w:t xml:space="preserve">4.3. </w:t>
+      </w:r>
+      <w:r>
+        <w:rPr>
+          <w:rStyle w:val="Extranjerismo"/>
+        </w:rPr>
+        <w:t>Stock</w:t>
+      </w:r>
+      <w:r>
+        <w:rPr>
+          <w:lang w:val="es-419"/>
+        </w:rPr>
+        <w:t xml:space="preserve"> de inventarios o existencias: concepto, beneficios y ubicación</w:t>
+      </w:r>
+      <w:bookmarkEnd w:id="20"/>
+    </w:p>
+    <w:p>
+      <w:pPr>
+        <w:spacing w:before="0" w:after="0"/>
+        <w:ind w:firstLine="708"/>
+        <w:rPr>
+          <w:rFonts w:cs="Calibri"/>
+          <w:lang w:eastAsia="es-CO"/>
+        </w:rPr>
+      </w:pPr>
+      <w:r>
+        <w:rPr>
+          <w:rFonts w:cs="Calibri"/>
+          <w:lang w:eastAsia="es-CO"/>
+        </w:rPr>
+        <w:t>Dentro de la gestión de la distribución comercial, mantener niveles adecuados de productos disponibles es fundamental para garantizar la continuidad de las operaciones y la atención oportuna de la demanda.</w:t>
+      </w:r>
+    </w:p>
+    <w:p>
+      <w:pPr>
+        <w:spacing w:before="0" w:after="0"/>
+        <w:ind w:firstLine="708"/>
+        <w:rPr>
+          <w:rFonts w:cs="Calibri"/>
+          <w:lang w:eastAsia="es-CO"/>
+        </w:rPr>
+      </w:pPr>
+      <w:r>
+        <w:rPr>
+          <w:rFonts w:cs="Calibri"/>
+          <w:lang w:eastAsia="es-CO"/>
+        </w:rPr>
+        <w:t xml:space="preserve">El </w:t>
+      </w:r>
+      <w:r>
+        <w:rPr>
+          <w:rStyle w:val="Extranjerismo"/>
+          <w:lang w:eastAsia="es-CO"/>
+        </w:rPr>
+        <w:t>stock</w:t>
+      </w:r>
+      <w:r>
+        <w:rPr>
+          <w:rFonts w:cs="Calibri"/>
+          <w:lang w:eastAsia="es-CO"/>
+        </w:rPr>
+        <w:t xml:space="preserve"> de inventarios permite a las empresas responder de manera eficiente a las necesidades del mercado, evitando tanto el desabastecimiento como el exceso de productos.</w:t>
+      </w:r>
+    </w:p>
+    <w:p>
+      <w:pPr>
+        <w:spacing w:before="0" w:after="0"/>
+        <w:ind w:firstLine="708"/>
+        <w:rPr>
+          <w:rFonts w:cs="Calibri"/>
+          <w:lang w:eastAsia="es-CO"/>
+        </w:rPr>
+      </w:pPr>
+      <w:r>
+        <w:rPr>
+          <w:rFonts w:cs="Calibri"/>
+          <w:lang w:eastAsia="es-CO"/>
+        </w:rPr>
+        <w:t xml:space="preserve">El </w:t>
+      </w:r>
+      <w:r>
+        <w:rPr>
+          <w:rStyle w:val="Extranjerismo"/>
+          <w:lang w:eastAsia="es-CO"/>
+        </w:rPr>
+        <w:t>stock</w:t>
+      </w:r>
+      <w:r>
+        <w:rPr>
+          <w:rFonts w:cs="Calibri"/>
+          <w:lang w:eastAsia="es-CO"/>
+        </w:rPr>
+        <w:t xml:space="preserve"> de inventarios, también denominado existencias, corresponde a la cantidad de productos que una empresa mantiene disponibles para satisfacer la demanda de sus clientes. Este concepto está directamente relacionado con la gestión del inventario, ya que implica definir niveles óptimos que permitan garantizar disponibilidad sin generar costos innecesarios.</w:t>
+      </w:r>
+    </w:p>
+    <w:p>
+      <w:pPr>
+        <w:spacing w:before="0" w:after="0"/>
+        <w:ind w:firstLine="708"/>
+        <w:rPr>
+          <w:rFonts w:cs="Calibri"/>
+          <w:lang w:eastAsia="es-CO"/>
+        </w:rPr>
+      </w:pPr>
+      <w:r>
+        <w:rPr>
+          <w:rFonts w:cs="Calibri"/>
+          <w:lang w:eastAsia="es-CO"/>
+        </w:rPr>
+        <w:t>Un adecuado control del </w:t>
+      </w:r>
+      <w:r>
+        <w:rPr>
+          <w:rStyle w:val="Extranjerismo"/>
+          <w:lang w:eastAsia="es-CO"/>
+        </w:rPr>
+        <w:t>stock</w:t>
+      </w:r>
+      <w:r>
+        <w:rPr>
+          <w:rFonts w:cs="Calibri"/>
+          <w:lang w:eastAsia="es-CO"/>
+        </w:rPr>
+        <w:t> permite equilibrar la oferta y la demanda, evitando pérdidas por faltantes o por acumulación de productos. En el contexto empresarial, algunas tiendas manejan niveles de </w:t>
+      </w:r>
+      <w:r>
+        <w:rPr>
+          <w:rStyle w:val="Extranjerismo"/>
+          <w:lang w:eastAsia="es-CO"/>
+        </w:rPr>
+        <w:t>stock</w:t>
+      </w:r>
+      <w:r>
+        <w:rPr>
+          <w:rFonts w:cs="Calibri"/>
+          <w:lang w:eastAsia="es-CO"/>
+        </w:rPr>
+        <w:t xml:space="preserve"> ajustados para garantizar alta </w:t>
+      </w:r>
+      <w:r>
+        <w:rPr>
+          <w:rFonts w:cs="Calibri"/>
+          <w:lang w:eastAsia="es-CO"/>
+        </w:rPr>
         <w:lastRenderedPageBreak/>
-        <w:t xml:space="preserve">4.3. </w:t>
-      </w:r>
+        <w:t>rotación y reducción de costos, mientras que empresas de comercio electrónico utilizan sistemas automatizados para mantener niveles óptimos según la demanda.</w:t>
+      </w:r>
+    </w:p>
+    <w:p>
+      <w:pPr>
+        <w:spacing w:before="0" w:after="0"/>
+        <w:ind w:firstLine="708"/>
+        <w:rPr>
+          <w:rFonts w:cs="Calibri"/>
+          <w:b/>
+          <w:bCs/>
+          <w:lang w:eastAsia="es-CO"/>
+        </w:rPr>
+      </w:pPr>
       <w:r>
         <w:rPr>
           <w:rStyle w:val="Extranjerismo"/>
-        </w:rPr>
-        <w:t>Stock</w:t>
-      </w:r>
-      <w:r>
-        <w:rPr>
-          <w:lang w:val="es-419"/>
-        </w:rPr>
-        <w:t xml:space="preserve"> de inventarios o existencias: concepto, beneficios y ubicación</w:t>
-      </w:r>
-      <w:bookmarkEnd w:id="20"/>
-    </w:p>
-    <w:p>
-      <w:pPr>
-        <w:spacing w:before="0" w:after="0"/>
-        <w:ind w:firstLine="708"/>
-        <w:rPr>
-          <w:rFonts w:cs="Calibri"/>
-          <w:lang w:eastAsia="es-CO"/>
-        </w:rPr>
-      </w:pPr>
-      <w:r>
-        <w:rPr>
-          <w:rFonts w:cs="Calibri"/>
-          <w:lang w:eastAsia="es-CO"/>
-        </w:rPr>
-        <w:t>Dentro de la gestión de la distribución comercial, mantener niveles adecuados de productos disponibles es fundamental para garantizar la continuidad de las operaciones y la atención oportuna de la demanda.</w:t>
-      </w:r>
-    </w:p>
-    <w:p>
-      <w:pPr>
-        <w:spacing w:before="0" w:after="0"/>
-        <w:ind w:firstLine="708"/>
-        <w:rPr>
-          <w:rFonts w:cs="Calibri"/>
-          <w:lang w:eastAsia="es-CO"/>
-        </w:rPr>
-      </w:pPr>
-      <w:r>
-        <w:rPr>
-          <w:rFonts w:cs="Calibri"/>
-          <w:lang w:eastAsia="es-CO"/>
-        </w:rPr>
-        <w:t xml:space="preserve">El </w:t>
-      </w:r>
-      <w:r>
-        <w:rPr>
-          <w:rStyle w:val="Extranjerismo"/>
-          <w:lang w:eastAsia="es-CO"/>
-        </w:rPr>
-        <w:t>stock</w:t>
-      </w:r>
-      <w:r>
-        <w:rPr>
-          <w:rFonts w:cs="Calibri"/>
-          <w:lang w:eastAsia="es-CO"/>
-        </w:rPr>
-        <w:t xml:space="preserve"> de inventarios permite a las empresas responder de manera eficiente a las necesidades del mercado, evitando tanto el desabastecimiento como el exceso de productos.</w:t>
-      </w:r>
-    </w:p>
-    <w:p>
-      <w:pPr>
-        <w:spacing w:before="0" w:after="0"/>
-        <w:ind w:firstLine="708"/>
-        <w:rPr>
-          <w:rFonts w:cs="Calibri"/>
-          <w:lang w:eastAsia="es-CO"/>
-        </w:rPr>
-      </w:pPr>
-      <w:r>
-        <w:rPr>
-          <w:rFonts w:cs="Calibri"/>
-          <w:lang w:eastAsia="es-CO"/>
-        </w:rPr>
-        <w:t xml:space="preserve">El </w:t>
-      </w:r>
-      <w:r>
-        <w:rPr>
-          <w:rStyle w:val="Extranjerismo"/>
-          <w:lang w:eastAsia="es-CO"/>
-        </w:rPr>
-        <w:t>stock</w:t>
-      </w:r>
-      <w:r>
-        <w:rPr>
-          <w:rFonts w:cs="Calibri"/>
-          <w:lang w:eastAsia="es-CO"/>
-        </w:rPr>
-        <w:t xml:space="preserve"> de inventarios, también denominado existencias, corresponde a la cantidad de productos que una empresa mantiene disponibles para satisfacer la demanda de sus clientes. Este concepto está directamente relacionado con la gestión del inventario, ya que implica definir niveles óptimos que permitan garantizar disponibilidad sin generar costos innecesarios.</w:t>
-      </w:r>
-    </w:p>
-    <w:p>
-      <w:pPr>
-        <w:spacing w:before="0" w:after="0"/>
-        <w:ind w:firstLine="708"/>
-        <w:rPr>
-          <w:rFonts w:cs="Calibri"/>
-          <w:lang w:eastAsia="es-CO"/>
-        </w:rPr>
-      </w:pPr>
-      <w:r>
-        <w:rPr>
-          <w:rFonts w:cs="Calibri"/>
-          <w:lang w:eastAsia="es-CO"/>
-        </w:rPr>
-        <w:t>Un adecuado control del </w:t>
-      </w:r>
-      <w:r>
-        <w:rPr>
-          <w:rStyle w:val="Extranjerismo"/>
-          <w:lang w:eastAsia="es-CO"/>
-        </w:rPr>
-        <w:t>stock</w:t>
-      </w:r>
-      <w:r>
-        <w:rPr>
-          <w:rFonts w:cs="Calibri"/>
-          <w:lang w:eastAsia="es-CO"/>
-        </w:rPr>
-        <w:t> permite equilibrar la oferta y la demanda, evitando pérdidas por faltantes o por acumulación de productos. En el contexto empresarial, algunas tiendas manejan niveles de </w:t>
-      </w:r>
-      <w:r>
-        <w:rPr>
-          <w:rStyle w:val="Extranjerismo"/>
-          <w:lang w:eastAsia="es-CO"/>
-        </w:rPr>
-        <w:t>stock</w:t>
-      </w:r>
-      <w:r>
-        <w:rPr>
-          <w:rFonts w:cs="Calibri"/>
-          <w:lang w:eastAsia="es-CO"/>
-        </w:rPr>
-        <w:t> ajustados para garantizar alta rotación y reducción de costos, mientras que empresas de comercio electrónico utilizan sistemas automatizados para mantener niveles óptimos según la demanda.</w:t>
-      </w:r>
-    </w:p>
-    <w:p>
-      <w:pPr>
-        <w:spacing w:before="0" w:after="0"/>
-        <w:ind w:firstLine="708"/>
-        <w:rPr>
-          <w:rFonts w:cs="Calibri"/>
-          <w:b/>
-          <w:bCs/>
-          <w:lang w:eastAsia="es-CO"/>
-        </w:rPr>
-      </w:pPr>
-      <w:r>
-        <w:rPr>
-          <w:rStyle w:val="Extranjerismo"/>
-          <w:b/>
-          <w:bCs/>
-          <w:lang w:eastAsia="es-CO"/>
-        </w:rPr>
-        <w:lastRenderedPageBreak/>
+          <w:b/>
+          <w:bCs/>
+          <w:lang w:eastAsia="es-CO"/>
+        </w:rPr>
         <w:t>Stock</w:t>
       </w:r>
       <w:r>
@@ -16506,7 +16844,21 @@
                 <w:rFonts w:cs="Calibri"/>
                 <w:lang w:eastAsia="es-CO"/>
               </w:rPr>
-              <w:t xml:space="preserve"> Bienvenidos a este espacio formativo. En este episodio vamos a abordar el plan de distribución comercial, un tema en el que hablaremos sobre canales, rutas, recursos, indicadores y acciones de mejora. Imagine que una empresa recibe varios pedidos en diferentes zonas de la ciudad. Tiene el producto listo, pero no ha definido rutas, horarios, responsables ni indicadores. ¿Qué podría pasar si cada entrega se organiza de manera improvisada?</w:t>
+              <w:t xml:space="preserve"> </w:t>
+            </w:r>
+            <w:r>
+              <w:rPr>
+                <w:rFonts w:cs="Calibri"/>
+                <w:lang w:eastAsia="es-CO"/>
+              </w:rPr>
+              <w:t>b</w:t>
+            </w:r>
+            <w:r>
+              <w:rPr>
+                <w:rFonts w:cs="Calibri"/>
+                <w:lang w:eastAsia="es-CO"/>
+              </w:rPr>
+              <w:t>ienvenidos a este espacio formativo. En este episodio vamos a abordar el plan de distribución comercial, un tema en el que hablaremos sobre canales, rutas, recursos, indicadores y acciones de mejora. Imagine que una empresa recibe varios pedidos en diferentes zonas de la ciudad. Tiene el producto listo, pero no ha definido rutas, horarios, responsables ni indicadores. ¿Qué podría pasar si cada entrega se organiza de manera improvisada?</w:t>
             </w:r>
           </w:p>
           <w:p>
@@ -16532,7 +16884,21 @@
                 <w:rFonts w:cs="Calibri"/>
                 <w:lang w:eastAsia="es-CO"/>
               </w:rPr>
-              <w:t xml:space="preserve"> Probablemente se presenten retrasos, costos más altos, clientes inconformes y dificultad para saber si la distribución está funcionando bien.</w:t>
+              <w:t xml:space="preserve"> </w:t>
+            </w:r>
+            <w:r>
+              <w:rPr>
+                <w:rFonts w:cs="Calibri"/>
+                <w:lang w:eastAsia="es-CO"/>
+              </w:rPr>
+              <w:t>p</w:t>
+            </w:r>
+            <w:r>
+              <w:rPr>
+                <w:rFonts w:cs="Calibri"/>
+                <w:lang w:eastAsia="es-CO"/>
+              </w:rPr>
+              <w:t>robablemente se presenten retrasos, costos más altos, clientes inconformes y dificultad para saber si la distribución está funcionando bien.</w:t>
             </w:r>
           </w:p>
           <w:p>
@@ -16558,7 +16924,21 @@
                 <w:rFonts w:cs="Calibri"/>
                 <w:lang w:eastAsia="es-CO"/>
               </w:rPr>
-              <w:t xml:space="preserve"> Por eso el plan de distribución es tan importante. Este plan organiza las acciones, recursos y procesos necesarios para llevar los productos desde la empresa hasta el cliente final, en el lugar, momento y condiciones adecuadas. Bienvenidos.</w:t>
+              <w:t xml:space="preserve"> </w:t>
+            </w:r>
+            <w:r>
+              <w:rPr>
+                <w:rFonts w:cs="Calibri"/>
+                <w:lang w:eastAsia="es-CO"/>
+              </w:rPr>
+              <w:t>p</w:t>
+            </w:r>
+            <w:r>
+              <w:rPr>
+                <w:rFonts w:cs="Calibri"/>
+                <w:lang w:eastAsia="es-CO"/>
+              </w:rPr>
+              <w:t>or eso el plan de distribución es tan importante. Este plan organiza las acciones, recursos y procesos necesarios para llevar los productos desde la empresa hasta el cliente final, en el lugar, momento y condiciones adecuadas. Bienvenidos.</w:t>
             </w:r>
           </w:p>
           <w:p>
@@ -16584,7 +16964,21 @@
                 <w:rFonts w:cs="Calibri"/>
                 <w:lang w:eastAsia="es-CO"/>
               </w:rPr>
-              <w:t xml:space="preserve"> Entonces, el plan de distribución no es solo decidir quién entrega el producto, sino ordenar todo el proceso para que funcione mejor.</w:t>
+              <w:t xml:space="preserve"> </w:t>
+            </w:r>
+            <w:r>
+              <w:rPr>
+                <w:rFonts w:cs="Calibri"/>
+                <w:lang w:eastAsia="es-CO"/>
+              </w:rPr>
+              <w:t>e</w:t>
+            </w:r>
+            <w:r>
+              <w:rPr>
+                <w:rFonts w:cs="Calibri"/>
+                <w:lang w:eastAsia="es-CO"/>
+              </w:rPr>
+              <w:t>ntonces, el plan de distribución no es solo decidir quién entrega el producto, sino ordenar todo el proceso para que funcione mejor.</w:t>
             </w:r>
           </w:p>
           <w:p>
@@ -16610,7 +17004,21 @@
                 <w:rFonts w:cs="Calibri"/>
                 <w:lang w:eastAsia="es-CO"/>
               </w:rPr>
-              <w:t xml:space="preserve"> Exactamente. El plan de distribución permite definir los canales que se usarán, las rutas de entrega, los recursos logísticos, los niveles de inventario, los tiempos de atención y los indicadores que ayudarán a evaluar el desempeño. Es </w:t>
+              <w:t xml:space="preserve"> </w:t>
+            </w:r>
+            <w:r>
+              <w:rPr>
+                <w:rFonts w:cs="Calibri"/>
+                <w:lang w:eastAsia="es-CO"/>
+              </w:rPr>
+              <w:t>e</w:t>
+            </w:r>
+            <w:r>
+              <w:rPr>
+                <w:rFonts w:cs="Calibri"/>
+                <w:lang w:eastAsia="es-CO"/>
+              </w:rPr>
+              <w:t xml:space="preserve">xactamente. El plan de distribución permite definir los canales que se usarán, las rutas de entrega, los recursos logísticos, los niveles de inventario, los tiempos de atención y los indicadores que ayudarán a evaluar el desempeño. Es </w:t>
             </w:r>
             <w:r>
               <w:rPr>
@@ -16644,7 +17052,21 @@
                 <w:rFonts w:cs="Calibri"/>
                 <w:lang w:eastAsia="es-CO"/>
               </w:rPr>
-              <w:t xml:space="preserve"> ¿Y cuáles serían las principales razones para construir un plan de distribución en una empresa comercial?</w:t>
+              <w:t xml:space="preserve"> ¿</w:t>
+            </w:r>
+            <w:r>
+              <w:rPr>
+                <w:rFonts w:cs="Calibri"/>
+                <w:lang w:eastAsia="es-CO"/>
+              </w:rPr>
+              <w:t>y</w:t>
+            </w:r>
+            <w:r>
+              <w:rPr>
+                <w:rFonts w:cs="Calibri"/>
+                <w:lang w:eastAsia="es-CO"/>
+              </w:rPr>
+              <w:t xml:space="preserve"> cuáles serían las principales razones para construir un plan de distribución en una empresa comercial?</w:t>
             </w:r>
           </w:p>
           <w:p>
@@ -16670,7 +17092,21 @@
                 <w:rFonts w:cs="Calibri"/>
                 <w:lang w:eastAsia="es-CO"/>
               </w:rPr>
-              <w:t xml:space="preserve"> Hay tres razones clave:</w:t>
+              <w:t xml:space="preserve"> </w:t>
+            </w:r>
+            <w:r>
+              <w:rPr>
+                <w:rFonts w:cs="Calibri"/>
+                <w:lang w:eastAsia="es-CO"/>
+              </w:rPr>
+              <w:t>h</w:t>
+            </w:r>
+            <w:r>
+              <w:rPr>
+                <w:rFonts w:cs="Calibri"/>
+                <w:lang w:eastAsia="es-CO"/>
+              </w:rPr>
+              <w:t>ay tres razones clave:</w:t>
             </w:r>
           </w:p>
           <w:p>
@@ -16699,7 +17135,21 @@
                 <w:rFonts w:cs="Calibri"/>
                 <w:lang w:eastAsia="es-CO"/>
               </w:rPr>
-              <w:t xml:space="preserve"> El plan ayuda a definir a qué zonas, clientes o puntos de venta se quiere llegar.</w:t>
+              <w:t xml:space="preserve"> </w:t>
+            </w:r>
+            <w:r>
+              <w:rPr>
+                <w:rFonts w:cs="Calibri"/>
+                <w:lang w:eastAsia="es-CO"/>
+              </w:rPr>
+              <w:t>e</w:t>
+            </w:r>
+            <w:r>
+              <w:rPr>
+                <w:rFonts w:cs="Calibri"/>
+                <w:lang w:eastAsia="es-CO"/>
+              </w:rPr>
+              <w:t>l plan ayuda a definir a qué zonas, clientes o puntos de venta se quiere llegar.</w:t>
             </w:r>
           </w:p>
           <w:p>
@@ -16728,7 +17178,21 @@
                 <w:rFonts w:cs="Calibri"/>
                 <w:lang w:eastAsia="es-CO"/>
               </w:rPr>
-              <w:t xml:space="preserve"> Permite organizar transporte, personal, almacenamiento, herramientas tecnológicas y tiempos de entrega.</w:t>
+              <w:t xml:space="preserve"> </w:t>
+            </w:r>
+            <w:r>
+              <w:rPr>
+                <w:rFonts w:cs="Calibri"/>
+                <w:lang w:eastAsia="es-CO"/>
+              </w:rPr>
+              <w:t>p</w:t>
+            </w:r>
+            <w:r>
+              <w:rPr>
+                <w:rFonts w:cs="Calibri"/>
+                <w:lang w:eastAsia="es-CO"/>
+              </w:rPr>
+              <w:t>ermite organizar transporte, personal, almacenamiento, herramientas tecnológicas y tiempos de entrega.</w:t>
             </w:r>
           </w:p>
           <w:p>
@@ -16757,7 +17221,21 @@
                 <w:rFonts w:cs="Calibri"/>
                 <w:lang w:eastAsia="es-CO"/>
               </w:rPr>
-              <w:t xml:space="preserve"> Una distribución planificada reduce errores, retrasos y reprocesos.</w:t>
+              <w:t xml:space="preserve"> </w:t>
+            </w:r>
+            <w:r>
+              <w:rPr>
+                <w:rFonts w:cs="Calibri"/>
+                <w:lang w:eastAsia="es-CO"/>
+              </w:rPr>
+              <w:t>u</w:t>
+            </w:r>
+            <w:r>
+              <w:rPr>
+                <w:rFonts w:cs="Calibri"/>
+                <w:lang w:eastAsia="es-CO"/>
+              </w:rPr>
+              <w:t>na distribución planificada reduce errores, retrasos y reprocesos.</w:t>
             </w:r>
           </w:p>
           <w:p>
@@ -16783,7 +17261,21 @@
                 <w:rFonts w:cs="Calibri"/>
                 <w:lang w:eastAsia="es-CO"/>
               </w:rPr>
-              <w:t xml:space="preserve"> Suena muy sencillo y práctico. Pero, ¿podríamos pensarlo con un ejemplo cercano al contexto comercial?</w:t>
+              <w:t xml:space="preserve"> </w:t>
+            </w:r>
+            <w:r>
+              <w:rPr>
+                <w:rFonts w:cs="Calibri"/>
+                <w:lang w:eastAsia="es-CO"/>
+              </w:rPr>
+              <w:t>s</w:t>
+            </w:r>
+            <w:r>
+              <w:rPr>
+                <w:rFonts w:cs="Calibri"/>
+                <w:lang w:eastAsia="es-CO"/>
+              </w:rPr>
+              <w:t>uena muy sencillo y práctico. Pero, ¿podríamos pensarlo con un ejemplo cercano al contexto comercial?</w:t>
             </w:r>
           </w:p>
           <w:p>
@@ -16809,7 +17301,21 @@
                 <w:rFonts w:cs="Calibri"/>
                 <w:lang w:eastAsia="es-CO"/>
               </w:rPr>
-              <w:t xml:space="preserve"> Claro. Pensemos en una empresa ficticia que vende manteca de cerdo a domicilio en Bogotá. Esta empresa necesita saber quiénes son sus clientes, qué zonas tienen mayor demanda, qué canales recibirán los pedidos, qué recursos usará para entregar y cómo medirá si el proceso está funcionando. Podría recibir pedidos por WhatsApp Business y redes sociales, organizar entregas por sectores y usar herramientas de georreferenciación para definir rutas más eficientes.</w:t>
+              <w:t xml:space="preserve"> </w:t>
+            </w:r>
+            <w:r>
+              <w:rPr>
+                <w:rFonts w:cs="Calibri"/>
+                <w:lang w:eastAsia="es-CO"/>
+              </w:rPr>
+              <w:t>c</w:t>
+            </w:r>
+            <w:r>
+              <w:rPr>
+                <w:rFonts w:cs="Calibri"/>
+                <w:lang w:eastAsia="es-CO"/>
+              </w:rPr>
+              <w:t>laro. Pensemos en una empresa ficticia que vende manteca de cerdo a domicilio en Bogotá. Esta empresa necesita saber quiénes son sus clientes, qué zonas tienen mayor demanda, qué canales recibirán los pedidos, qué recursos usará para entregar y cómo medirá si el proceso está funcionando. Podría recibir pedidos por WhatsApp Business y redes sociales, organizar entregas por sectores y usar herramientas de georreferenciación para definir rutas más eficientes.</w:t>
             </w:r>
           </w:p>
           <w:p>
@@ -16835,7 +17341,21 @@
                 <w:rFonts w:cs="Calibri"/>
                 <w:lang w:eastAsia="es-CO"/>
               </w:rPr>
-              <w:t xml:space="preserve"> O sea que, si la empresa agrupa pedidos por zonas, evita recorrer la ciudad sin orden y puede ahorrar tiempo y costos.</w:t>
+              <w:t xml:space="preserve"> </w:t>
+            </w:r>
+            <w:r>
+              <w:rPr>
+                <w:rFonts w:cs="Calibri"/>
+                <w:lang w:eastAsia="es-CO"/>
+              </w:rPr>
+              <w:t>o</w:t>
+            </w:r>
+            <w:r>
+              <w:rPr>
+                <w:rFonts w:cs="Calibri"/>
+                <w:lang w:eastAsia="es-CO"/>
+              </w:rPr>
+              <w:t xml:space="preserve"> sea que, si la empresa agrupa pedidos por zonas, evita recorrer la ciudad sin orden y puede ahorrar tiempo y costos.</w:t>
             </w:r>
           </w:p>
           <w:p>
@@ -16861,7 +17381,21 @@
                 <w:rFonts w:cs="Calibri"/>
                 <w:lang w:eastAsia="es-CO"/>
               </w:rPr>
-              <w:t xml:space="preserve"> Así es. Si el plan se aplica correctamente, la empresa puede entregar más rápido, reducir desplazamientos innecesarios, cuidar la calidad del producto y mejorar la satisfacción del cliente. Pero si no se tiene en cuenta, pueden </w:t>
+              <w:t xml:space="preserve"> </w:t>
+            </w:r>
+            <w:r>
+              <w:rPr>
+                <w:rFonts w:cs="Calibri"/>
+                <w:lang w:eastAsia="es-CO"/>
+              </w:rPr>
+              <w:t>a</w:t>
+            </w:r>
+            <w:r>
+              <w:rPr>
+                <w:rFonts w:cs="Calibri"/>
+                <w:lang w:eastAsia="es-CO"/>
+              </w:rPr>
+              <w:t xml:space="preserve">sí es. Si el plan se aplica correctamente, la empresa puede entregar más rápido, reducir desplazamientos innecesarios, cuidar la calidad del producto y mejorar la satisfacción del cliente. Pero si no se tiene en cuenta, pueden </w:t>
             </w:r>
             <w:r>
               <w:rPr>
@@ -16895,7 +17429,21 @@
                 <w:rFonts w:cs="Calibri"/>
                 <w:lang w:eastAsia="es-CO"/>
               </w:rPr>
-              <w:t xml:space="preserve"> También veo que los indicadores son importantes. No basta con entregar, también hay que medir si se está entregando bien.</w:t>
+              <w:t xml:space="preserve"> </w:t>
+            </w:r>
+            <w:r>
+              <w:rPr>
+                <w:rFonts w:cs="Calibri"/>
+                <w:lang w:eastAsia="es-CO"/>
+              </w:rPr>
+              <w:t>t</w:t>
+            </w:r>
+            <w:r>
+              <w:rPr>
+                <w:rFonts w:cs="Calibri"/>
+                <w:lang w:eastAsia="es-CO"/>
+              </w:rPr>
+              <w:t>ambién veo que los indicadores son importantes. No basta con entregar, también hay que medir si se está entregando bien.</w:t>
             </w:r>
           </w:p>
           <w:p>
@@ -16921,7 +17469,21 @@
                 <w:rFonts w:cs="Calibri"/>
                 <w:lang w:eastAsia="es-CO"/>
               </w:rPr>
-              <w:t xml:space="preserve"> Correcto. Los indicadores permiten hacer seguimiento al plan. Por ejemplo: tiempo de entrega, nivel de cumplimiento, satisfacción del cliente y costos logísticos. Con esa información, la empresa puede tomar decisiones, ajustar rutas, ampliar cobertura o mejorar sus procesos. La mejora continua depende de revisar los resultados y hacer ajustes cuando sea necesario.</w:t>
+              <w:t xml:space="preserve"> </w:t>
+            </w:r>
+            <w:r>
+              <w:rPr>
+                <w:rFonts w:cs="Calibri"/>
+                <w:lang w:eastAsia="es-CO"/>
+              </w:rPr>
+              <w:t>c</w:t>
+            </w:r>
+            <w:r>
+              <w:rPr>
+                <w:rFonts w:cs="Calibri"/>
+                <w:lang w:eastAsia="es-CO"/>
+              </w:rPr>
+              <w:t>orrecto. Los indicadores permiten hacer seguimiento al plan. Por ejemplo: tiempo de entrega, nivel de cumplimiento, satisfacción del cliente y costos logísticos. Con esa información, la empresa puede tomar decisiones, ajustar rutas, ampliar cobertura o mejorar sus procesos. La mejora continua depende de revisar los resultados y hacer ajustes cuando sea necesario.</w:t>
             </w:r>
           </w:p>
           <w:p>
@@ -16947,7 +17509,21 @@
                 <w:rFonts w:cs="Calibri"/>
                 <w:lang w:eastAsia="es-CO"/>
               </w:rPr>
-              <w:t xml:space="preserve"> Entonces, una frase para resumir este tema sería: </w:t>
+              <w:t xml:space="preserve"> </w:t>
+            </w:r>
+            <w:r>
+              <w:rPr>
+                <w:rFonts w:cs="Calibri"/>
+                <w:lang w:eastAsia="es-CO"/>
+              </w:rPr>
+              <w:t>e</w:t>
+            </w:r>
+            <w:r>
+              <w:rPr>
+                <w:rFonts w:cs="Calibri"/>
+                <w:lang w:eastAsia="es-CO"/>
+              </w:rPr>
+              <w:t xml:space="preserve">ntonces, una frase para resumir este tema sería: </w:t>
             </w:r>
             <w:r>
               <w:rPr>
@@ -16982,7 +17558,21 @@
                 <w:rFonts w:cs="Calibri"/>
                 <w:lang w:eastAsia="es-CO"/>
               </w:rPr>
-              <w:t xml:space="preserve"> Muy buena frase. Para cerrar, lo invitamos a revisar el punto 5.2 del componente formativo donde se explica el concepto, la estructura, las etapas y el ejemplo aplicado de un plan de distribución.</w:t>
+              <w:t xml:space="preserve"> </w:t>
+            </w:r>
+            <w:r>
+              <w:rPr>
+                <w:rFonts w:cs="Calibri"/>
+                <w:lang w:eastAsia="es-CO"/>
+              </w:rPr>
+              <w:t>m</w:t>
+            </w:r>
+            <w:r>
+              <w:rPr>
+                <w:rFonts w:cs="Calibri"/>
+                <w:lang w:eastAsia="es-CO"/>
+              </w:rPr>
+              <w:t>uy buena frase. Para cerrar, lo invitamos a revisar el punto 5.2 del componente formativo donde se explica el concepto, la estructura, las etapas y el ejemplo aplicado de un plan de distribución.</w:t>
             </w:r>
           </w:p>
           <w:p>
@@ -17008,7 +17598,21 @@
                 <w:rFonts w:cs="Calibri"/>
                 <w:lang w:eastAsia="es-CO"/>
               </w:rPr>
-              <w:t xml:space="preserve"> Al hacerlo, identifique cómo los canales, las rutas, los recursos y los indicadores se articulan para llevar el producto al cliente final de manera eficiente. Gracias por acompañarnos en este episodio. Nos encontramos en una próxima experiencia de aprendizaje.</w:t>
+              <w:t xml:space="preserve"> </w:t>
+            </w:r>
+            <w:r>
+              <w:rPr>
+                <w:rFonts w:cs="Calibri"/>
+                <w:lang w:eastAsia="es-CO"/>
+              </w:rPr>
+              <w:t>a</w:t>
+            </w:r>
+            <w:r>
+              <w:rPr>
+                <w:rFonts w:cs="Calibri"/>
+                <w:lang w:eastAsia="es-CO"/>
+              </w:rPr>
+              <w:t>l hacerlo, identifique cómo los canales, las rutas, los recursos y los indicadores se articulan para llevar el producto al cliente final de manera eficiente. Gracias por acompañarnos en este episodio. Nos encontramos en una próxima experiencia de aprendizaje.</w:t>
             </w:r>
           </w:p>
         </w:tc>
@@ -25693,19 +26297,6 @@
 </file>
 
 <file path=customXml/item2.xml><?xml version="1.0" encoding="utf-8"?>
-<?mso-contentType ?>
-<FormTemplates xmlns="http://schemas.microsoft.com/sharepoint/v3/contenttype/forms">
-  <Display>DocumentLibraryForm</Display>
-  <Edit>DocumentLibraryForm</Edit>
-  <New>DocumentLibraryForm</New>
-</FormTemplates>
-</file>
-
-<file path=customXml/item3.xml><?xml version="1.0" encoding="utf-8"?>
-<b:Sources xmlns:b="http://schemas.openxmlformats.org/officeDocument/2006/bibliography" xmlns="http://schemas.openxmlformats.org/officeDocument/2006/bibliography" SelectedStyle="\APASixthEditionOfficeOnline.xsl" StyleName="APA" Version="6"/>
-</file>
-
-<file path=customXml/item4.xml><?xml version="1.0" encoding="utf-8"?>
 <ct:contentTypeSchema xmlns:ct="http://schemas.microsoft.com/office/2006/metadata/contentType" xmlns:ma="http://schemas.microsoft.com/office/2006/metadata/properties/metaAttributes" ct:_="" ma:_="" ma:contentTypeName="Documento" ma:contentTypeID="0x0101006A81D6BD42E8DF4C91013959704817E1" ma:contentTypeVersion="15" ma:contentTypeDescription="Crear nuevo documento." ma:contentTypeScope="" ma:versionID="bf4f72ffd194f0963ff564daca6869f7">
   <xsd:schema xmlns:xsd="http://www.w3.org/2001/XMLSchema" xmlns:xs="http://www.w3.org/2001/XMLSchema" xmlns:p="http://schemas.microsoft.com/office/2006/metadata/properties" xmlns:ns2="13c90a0b-73bc-4dc0-be5f-28d77b615beb" xmlns:ns3="13c93bba-48ce-428c-bfe5-88b42c19b028" targetNamespace="http://schemas.microsoft.com/office/2006/metadata/properties" ma:root="true" ma:fieldsID="8718d6f4873a5b1392a45044efa78385" ns2:_="" ns3:_="">
     <xsd:import namespace="13c90a0b-73bc-4dc0-be5f-28d77b615beb"/>
@@ -25940,6 +26531,19 @@
 </ct:contentTypeSchema>
 </file>
 
+<file path=customXml/item3.xml><?xml version="1.0" encoding="utf-8"?>
+<b:Sources xmlns:b="http://schemas.openxmlformats.org/officeDocument/2006/bibliography" xmlns="http://schemas.openxmlformats.org/officeDocument/2006/bibliography" SelectedStyle="\APASixthEditionOfficeOnline.xsl" StyleName="APA" Version="6"/>
+</file>
+
+<file path=customXml/item4.xml><?xml version="1.0" encoding="utf-8"?>
+<?mso-contentType ?>
+<FormTemplates xmlns="http://schemas.microsoft.com/sharepoint/v3/contenttype/forms">
+  <Display>DocumentLibraryForm</Display>
+  <Edit>DocumentLibraryForm</Edit>
+  <New>DocumentLibraryForm</New>
+</FormTemplates>
+</file>
+
 <file path=customXml/itemProps1.xml><?xml version="1.0" encoding="utf-8"?>
 <ds:datastoreItem xmlns:ds="http://schemas.openxmlformats.org/officeDocument/2006/customXml" ds:itemID="{CEECB56F-E1D8-45BF-A0A3-B5258E7263D4}">
   <ds:schemaRefs>
@@ -25952,22 +26556,6 @@
 </file>
 
 <file path=customXml/itemProps2.xml><?xml version="1.0" encoding="utf-8"?>
-<ds:datastoreItem xmlns:ds="http://schemas.openxmlformats.org/officeDocument/2006/customXml" ds:itemID="{91756AAB-0645-4FFC-990B-34BB6096B23B}">
-  <ds:schemaRefs>
-    <ds:schemaRef ds:uri="http://schemas.microsoft.com/sharepoint/v3/contenttype/forms"/>
-  </ds:schemaRefs>
-</ds:datastoreItem>
-</file>
-
-<file path=customXml/itemProps3.xml><?xml version="1.0" encoding="utf-8"?>
-<ds:datastoreItem xmlns:ds="http://schemas.openxmlformats.org/officeDocument/2006/customXml" ds:itemID="{1AF2C25B-FB23-49D7-861B-D97474F002D2}">
-  <ds:schemaRefs>
-    <ds:schemaRef ds:uri="http://schemas.openxmlformats.org/officeDocument/2006/bibliography"/>
-  </ds:schemaRefs>
-</ds:datastoreItem>
-</file>
-
-<file path=customXml/itemProps4.xml><?xml version="1.0" encoding="utf-8"?>
 <ds:datastoreItem xmlns:ds="http://schemas.openxmlformats.org/officeDocument/2006/customXml" ds:itemID="{4B3C6E78-634C-4AE7-B2E1-4D68F5BA9D52}">
   <ds:schemaRefs>
     <ds:schemaRef ds:uri="http://schemas.microsoft.com/office/2006/metadata/contentType"/>
@@ -25984,4 +26572,20 @@
     <ds:schemaRef ds:uri="http://schemas.microsoft.com/internal/obd"/>
   </ds:schemaRefs>
 </ds:datastoreItem>
+</file>
+
+<file path=customXml/itemProps3.xml><?xml version="1.0" encoding="utf-8"?>
+<ds:datastoreItem xmlns:ds="http://schemas.openxmlformats.org/officeDocument/2006/customXml" ds:itemID="{1AF2C25B-FB23-49D7-861B-D97474F002D2}">
+  <ds:schemaRefs>
+    <ds:schemaRef ds:uri="http://schemas.openxmlformats.org/officeDocument/2006/bibliography"/>
+  </ds:schemaRefs>
+</ds:datastoreItem>
+</file>
+
+<file path=customXml/itemProps4.xml><?xml version="1.0" encoding="utf-8"?>
+<ds:datastoreItem xmlns:ds="http://schemas.openxmlformats.org/officeDocument/2006/customXml" ds:itemID="{91756AAB-0645-4FFC-990B-34BB6096B23B}">
+  <ds:schemaRefs>
+    <ds:schemaRef ds:uri="http://schemas.microsoft.com/sharepoint/v3/contenttype/forms"/>
+  </ds:schemaRefs>
+</ds:datastoreItem>
 </file>
</xml_diff>

<commit_message>
[UPD] CFA + Material ZIP
</commit_message>
<xml_diff>
--- a/fuentes/621209_CF2_DU.docx
+++ b/fuentes/621209_CF2_DU.docx
@@ -5276,7 +5276,7 @@
           <w:noProof/>
         </w:rPr>
         <w:drawing>
-          <wp:inline distT="0" distB="0" distL="0" distR="0" wp14:anchorId="2920DA82" wp14:editId="6B8A37D8">
+          <wp:inline distT="0" distB="0" distL="0" distR="0" wp14:anchorId="2920DA82" wp14:editId="1CAA7091">
             <wp:extent cx="4680000" cy="2632387"/>
             <wp:effectExtent l="0" t="0" r="6350" b="0"/>
             <wp:docPr id="1785472502" name="Imagen 5">
@@ -5391,13 +5391,19 @@
               <w:rPr>
                 <w:b/>
               </w:rPr>
-              <w:t xml:space="preserve">Transcripción del video: </w:t>
+              <w:t>Transcripción del video</w:t>
+            </w:r>
+            <w:r>
+              <w:rPr>
+                <w:b/>
+              </w:rPr>
+              <w:t xml:space="preserve">. </w:t>
             </w:r>
             <w:r>
               <w:rPr>
                 <w:bCs/>
               </w:rPr>
-              <w:t>c</w:t>
+              <w:t>C</w:t>
             </w:r>
             <w:r>
               <w:t>anales de distribución</w:t>
@@ -5524,7 +5530,13 @@
               <w:t>Consumidor final:</w:t>
             </w:r>
             <w:r>
-              <w:t xml:space="preserve"> Es aquella persona natural que consume, usa y destruye el producto.</w:t>
+              <w:t xml:space="preserve"> </w:t>
+            </w:r>
+            <w:r>
+              <w:t>e</w:t>
+            </w:r>
+            <w:r>
+              <w:t>s aquella persona natural que consume, usa y destruye el producto.</w:t>
             </w:r>
           </w:p>
         </w:tc>
@@ -7982,7 +7994,7 @@
           <w:noProof/>
         </w:rPr>
         <w:drawing>
-          <wp:inline distT="0" distB="0" distL="0" distR="0" wp14:anchorId="633C3DE0" wp14:editId="4CDD942C">
+          <wp:inline distT="0" distB="0" distL="0" distR="0" wp14:anchorId="633C3DE0" wp14:editId="1433A76B">
             <wp:extent cx="4680000" cy="2632500"/>
             <wp:effectExtent l="0" t="0" r="6350" b="0"/>
             <wp:docPr id="3" name="Imagen 1">
@@ -10562,21 +10574,7 @@
                 <w:rFonts w:cs="Calibri"/>
                 <w:lang w:eastAsia="es-CO"/>
               </w:rPr>
-              <w:t>c</w:t>
-            </w:r>
-            <w:r>
-              <w:rPr>
-                <w:rFonts w:cs="Calibri"/>
-                <w:lang w:eastAsia="es-CO"/>
-              </w:rPr>
-              <w:t>ondiciones de trabajo y condiciones de salud</w:t>
-            </w:r>
-            <w:r>
-              <w:rPr>
-                <w:rFonts w:cs="Calibri"/>
-                <w:lang w:eastAsia="es-CO"/>
-              </w:rPr>
-              <w:t>.</w:t>
+              <w:t>la logística y la distribución hoy</w:t>
             </w:r>
           </w:p>
         </w:tc>
@@ -11428,7 +11426,21 @@
                 <w:rFonts w:cs="Calibri"/>
                 <w:lang w:eastAsia="es-CO"/>
               </w:rPr>
-              <w:t xml:space="preserve"> Al final, la logística no se trata solamente de mover productos de un lugar a otro.</w:t>
+              <w:t xml:space="preserve"> </w:t>
+            </w:r>
+            <w:r>
+              <w:rPr>
+                <w:rFonts w:cs="Calibri"/>
+                <w:lang w:eastAsia="es-CO"/>
+              </w:rPr>
+              <w:t>a</w:t>
+            </w:r>
+            <w:r>
+              <w:rPr>
+                <w:rFonts w:cs="Calibri"/>
+                <w:lang w:eastAsia="es-CO"/>
+              </w:rPr>
+              <w:t>l final, la logística no se trata solamente de mover productos de un lugar a otro.</w:t>
             </w:r>
           </w:p>
           <w:p>
@@ -26286,6 +26298,15 @@
 </file>
 
 <file path=customXml/item1.xml><?xml version="1.0" encoding="utf-8"?>
+<?mso-contentType ?>
+<FormTemplates xmlns="http://schemas.microsoft.com/sharepoint/v3/contenttype/forms">
+  <Display>DocumentLibraryForm</Display>
+  <Edit>DocumentLibraryForm</Edit>
+  <New>DocumentLibraryForm</New>
+</FormTemplates>
+</file>
+
+<file path=customXml/item2.xml><?xml version="1.0" encoding="utf-8"?>
 <p:properties xmlns:p="http://schemas.microsoft.com/office/2006/metadata/properties" xmlns:xsi="http://www.w3.org/2001/XMLSchema-instance" xmlns:pc="http://schemas.microsoft.com/office/infopath/2007/PartnerControls">
   <documentManagement>
     <TaxCatchAll xmlns="13c90a0b-73bc-4dc0-be5f-28d77b615beb" xsi:nil="true"/>
@@ -26296,7 +26317,7 @@
 </p:properties>
 </file>
 
-<file path=customXml/item2.xml><?xml version="1.0" encoding="utf-8"?>
+<file path=customXml/item3.xml><?xml version="1.0" encoding="utf-8"?>
 <ct:contentTypeSchema xmlns:ct="http://schemas.microsoft.com/office/2006/metadata/contentType" xmlns:ma="http://schemas.microsoft.com/office/2006/metadata/properties/metaAttributes" ct:_="" ma:_="" ma:contentTypeName="Documento" ma:contentTypeID="0x0101006A81D6BD42E8DF4C91013959704817E1" ma:contentTypeVersion="15" ma:contentTypeDescription="Crear nuevo documento." ma:contentTypeScope="" ma:versionID="bf4f72ffd194f0963ff564daca6869f7">
   <xsd:schema xmlns:xsd="http://www.w3.org/2001/XMLSchema" xmlns:xs="http://www.w3.org/2001/XMLSchema" xmlns:p="http://schemas.microsoft.com/office/2006/metadata/properties" xmlns:ns2="13c90a0b-73bc-4dc0-be5f-28d77b615beb" xmlns:ns3="13c93bba-48ce-428c-bfe5-88b42c19b028" targetNamespace="http://schemas.microsoft.com/office/2006/metadata/properties" ma:root="true" ma:fieldsID="8718d6f4873a5b1392a45044efa78385" ns2:_="" ns3:_="">
     <xsd:import namespace="13c90a0b-73bc-4dc0-be5f-28d77b615beb"/>
@@ -26531,20 +26552,19 @@
 </ct:contentTypeSchema>
 </file>
 
-<file path=customXml/item3.xml><?xml version="1.0" encoding="utf-8"?>
+<file path=customXml/item4.xml><?xml version="1.0" encoding="utf-8"?>
 <b:Sources xmlns:b="http://schemas.openxmlformats.org/officeDocument/2006/bibliography" xmlns="http://schemas.openxmlformats.org/officeDocument/2006/bibliography" SelectedStyle="\APASixthEditionOfficeOnline.xsl" StyleName="APA" Version="6"/>
 </file>
 
-<file path=customXml/item4.xml><?xml version="1.0" encoding="utf-8"?>
-<?mso-contentType ?>
-<FormTemplates xmlns="http://schemas.microsoft.com/sharepoint/v3/contenttype/forms">
-  <Display>DocumentLibraryForm</Display>
-  <Edit>DocumentLibraryForm</Edit>
-  <New>DocumentLibraryForm</New>
-</FormTemplates>
+<file path=customXml/itemProps1.xml><?xml version="1.0" encoding="utf-8"?>
+<ds:datastoreItem xmlns:ds="http://schemas.openxmlformats.org/officeDocument/2006/customXml" ds:itemID="{91756AAB-0645-4FFC-990B-34BB6096B23B}">
+  <ds:schemaRefs>
+    <ds:schemaRef ds:uri="http://schemas.microsoft.com/sharepoint/v3/contenttype/forms"/>
+  </ds:schemaRefs>
+</ds:datastoreItem>
 </file>
 
-<file path=customXml/itemProps1.xml><?xml version="1.0" encoding="utf-8"?>
+<file path=customXml/itemProps2.xml><?xml version="1.0" encoding="utf-8"?>
 <ds:datastoreItem xmlns:ds="http://schemas.openxmlformats.org/officeDocument/2006/customXml" ds:itemID="{CEECB56F-E1D8-45BF-A0A3-B5258E7263D4}">
   <ds:schemaRefs>
     <ds:schemaRef ds:uri="http://schemas.microsoft.com/office/2006/metadata/properties"/>
@@ -26555,7 +26575,7 @@
 </ds:datastoreItem>
 </file>
 
-<file path=customXml/itemProps2.xml><?xml version="1.0" encoding="utf-8"?>
+<file path=customXml/itemProps3.xml><?xml version="1.0" encoding="utf-8"?>
 <ds:datastoreItem xmlns:ds="http://schemas.openxmlformats.org/officeDocument/2006/customXml" ds:itemID="{4B3C6E78-634C-4AE7-B2E1-4D68F5BA9D52}">
   <ds:schemaRefs>
     <ds:schemaRef ds:uri="http://schemas.microsoft.com/office/2006/metadata/contentType"/>
@@ -26574,18 +26594,10 @@
 </ds:datastoreItem>
 </file>
 
-<file path=customXml/itemProps3.xml><?xml version="1.0" encoding="utf-8"?>
+<file path=customXml/itemProps4.xml><?xml version="1.0" encoding="utf-8"?>
 <ds:datastoreItem xmlns:ds="http://schemas.openxmlformats.org/officeDocument/2006/customXml" ds:itemID="{1AF2C25B-FB23-49D7-861B-D97474F002D2}">
   <ds:schemaRefs>
     <ds:schemaRef ds:uri="http://schemas.openxmlformats.org/officeDocument/2006/bibliography"/>
   </ds:schemaRefs>
 </ds:datastoreItem>
-</file>
-
-<file path=customXml/itemProps4.xml><?xml version="1.0" encoding="utf-8"?>
-<ds:datastoreItem xmlns:ds="http://schemas.openxmlformats.org/officeDocument/2006/customXml" ds:itemID="{91756AAB-0645-4FFC-990B-34BB6096B23B}">
-  <ds:schemaRefs>
-    <ds:schemaRef ds:uri="http://schemas.microsoft.com/sharepoint/v3/contenttype/forms"/>
-  </ds:schemaRefs>
-</ds:datastoreItem>
 </file>
</xml_diff>

<commit_message>
UPD - CFA + Creditos
</commit_message>
<xml_diff>
--- a/fuentes/621209_CF2_DU.docx
+++ b/fuentes/621209_CF2_DU.docx
@@ -1,6 +1,6 @@
 
 <file path=word/document.xml><?xml version="1.0" encoding="utf-8"?>
-<w:document xmlns:wpc="http://schemas.microsoft.com/office/word/2010/wordprocessingCanvas" xmlns:cx="http://schemas.microsoft.com/office/drawing/2014/chartex" xmlns:cx1="http://schemas.microsoft.com/office/drawing/2015/9/8/chartex" xmlns:cx2="http://schemas.microsoft.com/office/drawing/2015/10/21/chartex" xmlns:cx3="http://schemas.microsoft.com/office/drawing/2016/5/9/chartex" xmlns:cx4="http://schemas.microsoft.com/office/drawing/2016/5/10/chartex" xmlns:cx5="http://schemas.microsoft.com/office/drawing/2016/5/11/chartex" xmlns:cx6="http://schemas.microsoft.com/office/drawing/2016/5/12/chartex" xmlns:cx7="http://schemas.microsoft.com/office/drawing/2016/5/13/chartex" xmlns:cx8="http://schemas.microsoft.com/office/drawing/2016/5/14/chartex" xmlns:mc="http://schemas.openxmlformats.org/markup-compatibility/2006" xmlns:aink="http://schemas.microsoft.com/office/drawing/2016/ink" xmlns:am3d="http://schemas.microsoft.com/office/drawing/2017/model3d" xmlns:o="urn:schemas-microsoft-com:office:office" xmlns:oel="http://schemas.microsoft.com/office/2019/extlst" xmlns:r="http://schemas.openxmlformats.org/officeDocument/2006/relationships" xmlns:m="http://schemas.openxmlformats.org/officeDocument/2006/math" xmlns:v="urn:schemas-microsoft-com:vml" xmlns:wp14="http://schemas.microsoft.com/office/word/2010/wordprocessingDrawing" xmlns:wp="http://schemas.openxmlformats.org/drawingml/2006/wordprocessingDrawing" xmlns:w10="urn:schemas-microsoft-com:office:word" xmlns:w="http://schemas.openxmlformats.org/wordprocessingml/2006/main" xmlns:w14="http://schemas.microsoft.com/office/word/2010/wordml" xmlns:w15="http://schemas.microsoft.com/office/word/2012/wordml" xmlns:w16cei="http://schemas.microsoft.com/office/word/2026/wordml/cei" xmlns:w16cex="http://schemas.microsoft.com/office/word/2018/wordml/cex" xmlns:w16cid="http://schemas.microsoft.com/office/word/2016/wordml/cid" xmlns:w16="http://schemas.microsoft.com/office/word/2018/wordml" xmlns:w16du="http://schemas.microsoft.com/office/word/2023/wordml/word16du" xmlns:w16sdtdh="http://schemas.microsoft.com/office/word/2020/wordml/sdtdatahash" xmlns:w16sdtfl="http://schemas.microsoft.com/office/word/2024/wordml/sdtformatlock" xmlns:w16se="http://schemas.microsoft.com/office/word/2015/wordml/symex" xmlns:wpg="http://schemas.microsoft.com/office/word/2010/wordprocessingGroup" xmlns:wpi="http://schemas.microsoft.com/office/word/2010/wordprocessingInk" xmlns:wne="http://schemas.microsoft.com/office/word/2006/wordml" xmlns:wps="http://schemas.microsoft.com/office/word/2010/wordprocessingShape" mc:Ignorable="w14 w15 w16se w16cid w16 w16cex w16sdtdh w16sdtfl w16du wp14">
+<w:document xmlns:wpc="http://schemas.microsoft.com/office/word/2010/wordprocessingCanvas" xmlns:cx="http://schemas.microsoft.com/office/drawing/2014/chartex" xmlns:cx1="http://schemas.microsoft.com/office/drawing/2015/9/8/chartex" xmlns:cx2="http://schemas.microsoft.com/office/drawing/2015/10/21/chartex" xmlns:cx3="http://schemas.microsoft.com/office/drawing/2016/5/9/chartex" xmlns:cx4="http://schemas.microsoft.com/office/drawing/2016/5/10/chartex" xmlns:cx5="http://schemas.microsoft.com/office/drawing/2016/5/11/chartex" xmlns:cx6="http://schemas.microsoft.com/office/drawing/2016/5/12/chartex" xmlns:cx7="http://schemas.microsoft.com/office/drawing/2016/5/13/chartex" xmlns:cx8="http://schemas.microsoft.com/office/drawing/2016/5/14/chartex" xmlns:mc="http://schemas.openxmlformats.org/markup-compatibility/2006" xmlns:aink="http://schemas.microsoft.com/office/drawing/2016/ink" xmlns:am3d="http://schemas.microsoft.com/office/drawing/2017/model3d" xmlns:o="urn:schemas-microsoft-com:office:office" xmlns:oel="http://schemas.microsoft.com/office/2019/extlst" xmlns:r="http://schemas.openxmlformats.org/officeDocument/2006/relationships" xmlns:m="http://schemas.openxmlformats.org/officeDocument/2006/math" xmlns:v="urn:schemas-microsoft-com:vml" xmlns:wp14="http://schemas.microsoft.com/office/word/2010/wordprocessingDrawing" xmlns:wp="http://schemas.openxmlformats.org/drawingml/2006/wordprocessingDrawing" xmlns:w10="urn:schemas-microsoft-com:office:word" xmlns:w="http://schemas.openxmlformats.org/wordprocessingml/2006/main" xmlns:w14="http://schemas.microsoft.com/office/word/2010/wordml" xmlns:w15="http://schemas.microsoft.com/office/word/2012/wordml" xmlns:w16cex="http://schemas.microsoft.com/office/word/2018/wordml/cex" xmlns:w16cid="http://schemas.microsoft.com/office/word/2016/wordml/cid" xmlns:w16="http://schemas.microsoft.com/office/word/2018/wordml" xmlns:w16du="http://schemas.microsoft.com/office/word/2023/wordml/word16du" xmlns:w16sdtdh="http://schemas.microsoft.com/office/word/2020/wordml/sdtdatahash" xmlns:w16sdtfl="http://schemas.microsoft.com/office/word/2024/wordml/sdtformatlock" xmlns:w16se="http://schemas.microsoft.com/office/word/2015/wordml/symex" xmlns:wpg="http://schemas.microsoft.com/office/word/2010/wordprocessingGroup" xmlns:wpi="http://schemas.microsoft.com/office/word/2010/wordprocessingInk" xmlns:wne="http://schemas.microsoft.com/office/word/2006/wordml" xmlns:wps="http://schemas.microsoft.com/office/word/2010/wordprocessingShape" mc:Ignorable="w14 w15 w16se w16cid w16 w16cex w16sdtdh w16sdtfl w16du wp14">
   <w:body>
     <w:p>
       <w:pPr>
@@ -231,7 +231,7 @@
               </wp:anchor>
             </w:drawing>
           </mc:Choice>
-          <mc:Fallback>
+          <mc:Fallback xmlns:w16cei="http://schemas.microsoft.com/office/word/2026/wordml/cei">
             <w:pict>
               <v:rect w14:anchorId="25FE5F7A" id="Rectángulo 18" o:spid="_x0000_s1026" alt="&quot;&quot;" style="position:absolute;margin-left:-55.7pt;margin-top:29pt;width:613.85pt;height:204pt;z-index:-251662336;visibility:visible;mso-wrap-style:square;mso-width-percent:0;mso-height-percent:0;mso-wrap-distance-left:9pt;mso-wrap-distance-top:0;mso-wrap-distance-right:9pt;mso-wrap-distance-bottom:0;mso-position-horizontal:absolute;mso-position-horizontal-relative:text;mso-position-vertical:absolute;mso-position-vertical-relative:text;mso-width-percent:0;mso-height-percent:0;mso-width-relative:page;mso-height-relative:margin;v-text-anchor:middle" o:gfxdata="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" fillcolor="#00314d" stroked="f" strokeweight="1pt"/>
             </w:pict>
@@ -3727,7 +3727,23 @@
           <w:rFonts w:cs="Calibri"/>
           <w:lang w:eastAsia="es-CO"/>
         </w:rPr>
-        <w:t>En los entornos comerciales actuales, los canales integran medios físicos y digitales, configurando esquemas multicanal y omnicanal que responden a nuevos comportamientos de consumo. Por esta razón, seleccionar un canal no consiste únicamente en escoger un punto de venta, sino en definir cómo se conectan la empresa, el producto, los intermediarios y el cliente.</w:t>
+        <w:t xml:space="preserve">En los entornos comerciales actuales, los canales integran medios físicos y digitales, configurando esquemas multicanal y </w:t>
+      </w:r>
+      <w:proofErr w:type="spellStart"/>
+      <w:r>
+        <w:rPr>
+          <w:rFonts w:cs="Calibri"/>
+          <w:lang w:eastAsia="es-CO"/>
+        </w:rPr>
+        <w:t>omnicanal</w:t>
+      </w:r>
+      <w:proofErr w:type="spellEnd"/>
+      <w:r>
+        <w:rPr>
+          <w:rFonts w:cs="Calibri"/>
+          <w:lang w:eastAsia="es-CO"/>
+        </w:rPr>
+        <w:t xml:space="preserve"> que responden a nuevos comportamientos de consumo. Por esta razón, seleccionar un canal no consiste únicamente en escoger un punto de venta, sino en definir cómo se conectan la empresa, el producto, los intermediarios y el cliente.</w:t>
       </w:r>
     </w:p>
     <w:p>
@@ -4820,7 +4836,25 @@
                 <w:sz w:val="28"/>
                 <w:szCs w:val="28"/>
               </w:rPr>
-              <w:t>Analiza características como valor, volumen o perecibilidad.</w:t>
+              <w:t xml:space="preserve">Analiza características como valor, volumen o </w:t>
+            </w:r>
+            <w:proofErr w:type="spellStart"/>
+            <w:r>
+              <w:rPr>
+                <w:rFonts w:asciiTheme="minorHAnsi" w:hAnsiTheme="minorHAnsi" w:cstheme="minorHAnsi"/>
+                <w:sz w:val="28"/>
+                <w:szCs w:val="28"/>
+              </w:rPr>
+              <w:t>perecibilidad</w:t>
+            </w:r>
+            <w:proofErr w:type="spellEnd"/>
+            <w:r>
+              <w:rPr>
+                <w:rFonts w:asciiTheme="minorHAnsi" w:hAnsiTheme="minorHAnsi" w:cstheme="minorHAnsi"/>
+                <w:sz w:val="28"/>
+                <w:szCs w:val="28"/>
+              </w:rPr>
+              <w:t>.</w:t>
             </w:r>
           </w:p>
         </w:tc>
@@ -5246,6 +5280,26 @@
     </w:p>
     <w:p>
       <w:pPr>
+        <w:spacing w:before="0" w:after="0"/>
+        <w:ind w:firstLine="708"/>
+        <w:rPr>
+          <w:rFonts w:cs="Calibri"/>
+          <w:lang w:eastAsia="es-CO"/>
+        </w:rPr>
+      </w:pPr>
+    </w:p>
+    <w:p>
+      <w:pPr>
+        <w:spacing w:before="0" w:after="0"/>
+        <w:ind w:firstLine="708"/>
+        <w:rPr>
+          <w:rFonts w:cs="Calibri"/>
+          <w:lang w:eastAsia="es-CO"/>
+        </w:rPr>
+      </w:pPr>
+    </w:p>
+    <w:p>
+      <w:pPr>
         <w:pStyle w:val="Video"/>
         <w:jc w:val="left"/>
         <w:rPr>
@@ -5256,6 +5310,7 @@
         <w:rPr>
           <w:lang w:eastAsia="es-CO"/>
         </w:rPr>
+        <w:lastRenderedPageBreak/>
         <w:t>Canales de distribución</w:t>
       </w:r>
     </w:p>
@@ -5271,9 +5326,8 @@
         <w:rPr>
           <w:noProof/>
         </w:rPr>
-        <w:lastRenderedPageBreak/>
         <w:drawing>
-          <wp:inline distT="0" distB="0" distL="0" distR="0" wp14:anchorId="2920DA82" wp14:editId="7B204166">
+          <wp:inline distT="0" distB="0" distL="0" distR="0" wp14:anchorId="2920DA82" wp14:editId="48BED508">
             <wp:extent cx="4680000" cy="2632387"/>
             <wp:effectExtent l="0" t="0" r="6350" b="0"/>
             <wp:docPr id="1785472502" name="Imagen 5">
@@ -5477,11 +5531,11 @@
               <w:t>e</w:t>
             </w:r>
             <w:r>
-              <w:t xml:space="preserve">s el último intermediario utilizado para llevarle el producto al consumidor final. El segmento meta de los detallistas son los consumidores finales, quienes lógicamente compran para su uso personal. Un detallista puede ser una tienda con un nombre, una persona particular ubicada en un </w:t>
+              <w:t xml:space="preserve">s el último intermediario utilizado para llevarle el producto al consumidor final. El segmento meta de los detallistas son los consumidores </w:t>
             </w:r>
             <w:r>
               <w:lastRenderedPageBreak/>
-              <w:t>pequeño local, el vendedor de frutas o comestibles, o simplemente el vendedor callejero que utiliza las esquinas de los semáforos.</w:t>
+              <w:t>finales, quienes lógicamente compran para su uso personal. Un detallista puede ser una tienda con un nombre, una persona particular ubicada en un pequeño local, el vendedor de frutas o comestibles, o simplemente el vendedor callejero que utiliza las esquinas de los semáforos.</w:t>
             </w:r>
           </w:p>
           <w:p>
@@ -5610,7 +5664,15 @@
           <w:rFonts w:cs="Calibri"/>
           <w:lang w:eastAsia="es-CO"/>
         </w:rPr>
-        <w:t>Estos actores no solo cumplen funciones de compra y venta. También aportan valor mediante almacenamiento, transporte, promoción, negociación y servicio al cliente. Gracias a su participación, las empresas pueden concentrarse en la producción o en la estrategia comercial, mientras delegan parte de la distribución a actores especializados.</w:t>
+        <w:t xml:space="preserve">Estos actores no solo cumplen funciones de compra y venta. También aportan valor mediante almacenamiento, transporte, promoción, negociación y servicio al cliente. Gracias a su participación, las empresas pueden concentrarse en la producción </w:t>
+      </w:r>
+      <w:r>
+        <w:rPr>
+          <w:rFonts w:cs="Calibri"/>
+          <w:lang w:eastAsia="es-CO"/>
+        </w:rPr>
+        <w:lastRenderedPageBreak/>
+        <w:t>o en la estrategia comercial, mientras delegan parte de la distribución a actores especializados.</w:t>
       </w:r>
     </w:p>
     <w:p>
@@ -5631,7 +5693,6 @@
           <w:bCs/>
           <w:lang w:eastAsia="es-CO"/>
         </w:rPr>
-        <w:lastRenderedPageBreak/>
         <w:t>Papel de los intermediarios</w:t>
       </w:r>
     </w:p>
@@ -5901,6 +5962,7 @@
           <w:bCs/>
           <w:lang w:eastAsia="es-CO"/>
         </w:rPr>
+        <w:lastRenderedPageBreak/>
         <w:t>Clases de intermediarios</w:t>
       </w:r>
     </w:p>
@@ -5918,7 +5980,6 @@
           <w:rFonts w:cs="Calibri"/>
           <w:lang w:eastAsia="es-CO"/>
         </w:rPr>
-        <w:lastRenderedPageBreak/>
         <w:t>Las clases de intermediarios hacen referencia a la forma en que estos participan dentro del canal, según su nivel de independencia, relación contractual y funciones específicas. Esta clasificación ayuda a reconocer si el intermediario opera de manera autónoma, integrada, asociada o digital.</w:t>
       </w:r>
     </w:p>
@@ -6062,7 +6123,23 @@
           <w:rFonts w:cs="Calibri"/>
           <w:lang w:eastAsia="es-CO"/>
         </w:rPr>
-        <w:t>Se agrupan mediante acuerdos o alianzas comerciales. Las franquicias, como Subway o McDonald’s, son ejemplos de esta clase de intermediarios.</w:t>
+        <w:t xml:space="preserve">Se agrupan mediante acuerdos o alianzas comerciales. Las franquicias, como </w:t>
+      </w:r>
+      <w:proofErr w:type="spellStart"/>
+      <w:r>
+        <w:rPr>
+          <w:rFonts w:cs="Calibri"/>
+          <w:lang w:eastAsia="es-CO"/>
+        </w:rPr>
+        <w:t>Subway</w:t>
+      </w:r>
+      <w:proofErr w:type="spellEnd"/>
+      <w:r>
+        <w:rPr>
+          <w:rFonts w:cs="Calibri"/>
+          <w:lang w:eastAsia="es-CO"/>
+        </w:rPr>
+        <w:t xml:space="preserve"> o McDonald’s, son ejemplos de esta clase de intermediarios.</w:t>
       </w:r>
     </w:p>
     <w:p>
@@ -6105,7 +6182,23 @@
           <w:rFonts w:cs="Calibri"/>
           <w:lang w:eastAsia="es-CO"/>
         </w:rPr>
-        <w:t>Operan mediante plataformas tecnológicas que facilitan transacciones. Ejemplos de esta clase son Amazon, Mercado Libre y Rappi.</w:t>
+        <w:t xml:space="preserve">Operan mediante plataformas tecnológicas que facilitan transacciones. Ejemplos de esta clase son Amazon, Mercado Libre y </w:t>
+      </w:r>
+      <w:proofErr w:type="spellStart"/>
+      <w:r>
+        <w:rPr>
+          <w:rFonts w:cs="Calibri"/>
+          <w:lang w:eastAsia="es-CO"/>
+        </w:rPr>
+        <w:t>Rappi</w:t>
+      </w:r>
+      <w:proofErr w:type="spellEnd"/>
+      <w:r>
+        <w:rPr>
+          <w:rFonts w:cs="Calibri"/>
+          <w:lang w:eastAsia="es-CO"/>
+        </w:rPr>
+        <w:t>.</w:t>
       </w:r>
     </w:p>
     <w:p>
@@ -7018,7 +7111,7 @@
     <w:p>
       <w:pPr>
         <w:spacing w:before="0" w:after="0"/>
-        <w:ind w:left="993" w:firstLine="0"/>
+        <w:ind w:left="1416" w:firstLine="0"/>
         <w:rPr>
           <w:rFonts w:cs="Calibri"/>
           <w:lang w:eastAsia="es-CO"/>
@@ -7061,7 +7154,7 @@
     <w:p>
       <w:pPr>
         <w:spacing w:before="0" w:after="0"/>
-        <w:ind w:left="1058" w:firstLine="0"/>
+        <w:ind w:left="1416" w:firstLine="2"/>
         <w:rPr>
           <w:rFonts w:cs="Calibri"/>
           <w:lang w:eastAsia="es-CO"/>
@@ -7104,7 +7197,7 @@
     <w:p>
       <w:pPr>
         <w:spacing w:before="0" w:after="0"/>
-        <w:ind w:left="1058" w:firstLine="0"/>
+        <w:ind w:left="1416" w:firstLine="0"/>
         <w:rPr>
           <w:rFonts w:cs="Calibri"/>
           <w:lang w:eastAsia="es-CO"/>
@@ -7117,16 +7210,6 @@
         </w:rPr>
         <w:t>Corresponde a una gran superficie, con amplio surtido y alto volumen de ventas. Integra diferentes categorías de productos en un mismo espacio comercial.</w:t>
       </w:r>
-    </w:p>
-    <w:p>
-      <w:pPr>
-        <w:spacing w:before="0" w:after="0"/>
-        <w:ind w:left="1058" w:firstLine="0"/>
-        <w:rPr>
-          <w:rFonts w:cs="Calibri"/>
-          <w:lang w:eastAsia="es-CO"/>
-        </w:rPr>
-      </w:pPr>
     </w:p>
     <w:p>
       <w:pPr>
@@ -7158,7 +7241,7 @@
     <w:p>
       <w:pPr>
         <w:spacing w:before="0" w:after="0"/>
-        <w:ind w:left="1058" w:firstLine="0"/>
+        <w:ind w:left="1416" w:firstLine="0"/>
         <w:rPr>
           <w:rFonts w:cs="Calibri"/>
           <w:lang w:eastAsia="es-CO"/>
@@ -7201,7 +7284,7 @@
     <w:p>
       <w:pPr>
         <w:spacing w:before="0" w:after="0"/>
-        <w:ind w:left="1058" w:firstLine="0"/>
+        <w:ind w:left="1416" w:firstLine="0"/>
         <w:rPr>
           <w:rFonts w:cs="Calibri"/>
           <w:lang w:eastAsia="es-CO"/>
@@ -7948,7 +8031,7 @@
           <w:noProof/>
         </w:rPr>
         <w:drawing>
-          <wp:inline distT="0" distB="0" distL="0" distR="0" wp14:anchorId="633C3DE0" wp14:editId="5E97A84C">
+          <wp:inline distT="0" distB="0" distL="0" distR="0" wp14:anchorId="633C3DE0" wp14:editId="0BB20D8F">
             <wp:extent cx="4680000" cy="2632500"/>
             <wp:effectExtent l="0" t="0" r="6350" b="0"/>
             <wp:docPr id="3" name="Imagen 1">
@@ -8099,11 +8182,19 @@
             <w:r>
               <w:t>a logística es un término cada vez más utilizado en nuestros días. Originalmente, la palabra logística se utilizó como un concepto militar que proviene del francés (</w:t>
             </w:r>
+            <w:proofErr w:type="spellStart"/>
             <w:r>
               <w:rPr>
                 <w:rStyle w:val="Extranjerismo"/>
               </w:rPr>
-              <w:t>logistique / louis</w:t>
+              <w:t>logistique</w:t>
+            </w:r>
+            <w:proofErr w:type="spellEnd"/>
+            <w:r>
+              <w:rPr>
+                <w:rStyle w:val="Extranjerismo"/>
+              </w:rPr>
+              <w:t xml:space="preserve"> / louis</w:t>
             </w:r>
             <w:r>
               <w:t xml:space="preserve"> tics) para referirse al transporte, el suministro y el alojamiento de las tropas. En la actualidad, el término es utilizado en los sectores del </w:t>
@@ -12154,7 +12245,39 @@
           <w:rFonts w:cs="Calibri"/>
           <w:lang w:eastAsia="es-CO"/>
         </w:rPr>
-        <w:t>La estrategia puede ser multicanal u omnicanal. En la estrategia multicanal, se usan varios canales de venta. En la estrategia omnicanal, los canales se integran para ofrecer una experiencia unificada al cliente.</w:t>
+        <w:t xml:space="preserve">La estrategia puede ser multicanal u </w:t>
+      </w:r>
+      <w:proofErr w:type="spellStart"/>
+      <w:r>
+        <w:rPr>
+          <w:rFonts w:cs="Calibri"/>
+          <w:lang w:eastAsia="es-CO"/>
+        </w:rPr>
+        <w:t>omnicanal</w:t>
+      </w:r>
+      <w:proofErr w:type="spellEnd"/>
+      <w:r>
+        <w:rPr>
+          <w:rFonts w:cs="Calibri"/>
+          <w:lang w:eastAsia="es-CO"/>
+        </w:rPr>
+        <w:t xml:space="preserve">. En la estrategia multicanal, se usan varios canales de venta. En la estrategia </w:t>
+      </w:r>
+      <w:proofErr w:type="spellStart"/>
+      <w:r>
+        <w:rPr>
+          <w:rFonts w:cs="Calibri"/>
+          <w:lang w:eastAsia="es-CO"/>
+        </w:rPr>
+        <w:t>omnicanal</w:t>
+      </w:r>
+      <w:proofErr w:type="spellEnd"/>
+      <w:r>
+        <w:rPr>
+          <w:rFonts w:cs="Calibri"/>
+          <w:lang w:eastAsia="es-CO"/>
+        </w:rPr>
+        <w:t>, los canales se integran para ofrecer una experiencia unificada al cliente.</w:t>
       </w:r>
     </w:p>
     <w:p>
@@ -12182,7 +12305,23 @@
           <w:lang w:eastAsia="es-CO"/>
         </w:rPr>
         <w:lastRenderedPageBreak/>
-        <w:t>En el entorno actual, algunas empresas implementan estrategias omnicanal integrando tiendas físicas, comercio electrónico y aplicaciones móviles. Otras combinan estrategias directas e indirectas para ampliar su alcance y fortalecer su presencia en el mercado.</w:t>
+        <w:t xml:space="preserve">En el entorno actual, algunas empresas implementan estrategias </w:t>
+      </w:r>
+      <w:proofErr w:type="spellStart"/>
+      <w:r>
+        <w:rPr>
+          <w:rFonts w:cs="Calibri"/>
+          <w:lang w:eastAsia="es-CO"/>
+        </w:rPr>
+        <w:t>omnicanal</w:t>
+      </w:r>
+      <w:proofErr w:type="spellEnd"/>
+      <w:r>
+        <w:rPr>
+          <w:rFonts w:cs="Calibri"/>
+          <w:lang w:eastAsia="es-CO"/>
+        </w:rPr>
+        <w:t xml:space="preserve"> integrando tiendas físicas, comercio electrónico y aplicaciones móviles. Otras combinan estrategias directas e indirectas para ampliar su alcance y fortalecer su presencia en el mercado.</w:t>
       </w:r>
     </w:p>
     <w:p>
@@ -14259,7 +14398,23 @@
           <w:lang w:eastAsia="es-CO"/>
         </w:rPr>
         <w:lastRenderedPageBreak/>
-        <w:t>En el contexto empresarial, herramientas como Google Maps, ArcGIS y QGIS pueden utilizarse para planificar rutas de entrega, ubicar clientes y analizar zonas de cobertura. Asimismo, algunas plataformas de domicilios dependen de sistemas de georreferenciación para gestionar entregas en tiempo real.</w:t>
+        <w:t xml:space="preserve">En el contexto empresarial, herramientas como Google </w:t>
+      </w:r>
+      <w:proofErr w:type="spellStart"/>
+      <w:r>
+        <w:rPr>
+          <w:rFonts w:cs="Calibri"/>
+          <w:lang w:eastAsia="es-CO"/>
+        </w:rPr>
+        <w:t>Maps</w:t>
+      </w:r>
+      <w:proofErr w:type="spellEnd"/>
+      <w:r>
+        <w:rPr>
+          <w:rFonts w:cs="Calibri"/>
+          <w:lang w:eastAsia="es-CO"/>
+        </w:rPr>
+        <w:t>, ArcGIS y QGIS pueden utilizarse para planificar rutas de entrega, ubicar clientes y analizar zonas de cobertura. Asimismo, algunas plataformas de domicilios dependen de sistemas de georreferenciación para gestionar entregas en tiempo real.</w:t>
       </w:r>
     </w:p>
     <w:p>
@@ -15251,6 +15406,31 @@
     <w:p>
       <w:pPr>
         <w:pStyle w:val="Prrafodelista"/>
+        <w:numPr>
+          <w:ilvl w:val="0"/>
+          <w:numId w:val="26"/>
+        </w:numPr>
+        <w:spacing w:before="0" w:after="0"/>
+        <w:rPr>
+          <w:rFonts w:cs="Calibri"/>
+          <w:b/>
+          <w:bCs/>
+          <w:lang w:eastAsia="es-CO"/>
+        </w:rPr>
+      </w:pPr>
+      <w:r>
+        <w:rPr>
+          <w:rFonts w:cs="Calibri"/>
+          <w:b/>
+          <w:bCs/>
+          <w:lang w:eastAsia="es-CO"/>
+        </w:rPr>
+        <w:t>Indicadores</w:t>
+      </w:r>
+    </w:p>
+    <w:p>
+      <w:pPr>
+        <w:pStyle w:val="Prrafodelista"/>
         <w:spacing w:before="0" w:after="0"/>
         <w:ind w:left="1428" w:firstLine="0"/>
         <w:rPr>
@@ -15258,14 +15438,367 @@
           <w:lang w:eastAsia="es-CO"/>
         </w:rPr>
       </w:pPr>
+      <w:r>
+        <w:rPr>
+          <w:rFonts w:cs="Calibri"/>
+          <w:lang w:eastAsia="es-CO"/>
+        </w:rPr>
+        <w:t>Permiten medir el desempeño del plan. Pueden incluir tiempo de entrega, nivel de cumplimiento, satisfacción del cliente y costos logísticos.</w:t>
+      </w:r>
     </w:p>
     <w:p>
       <w:pPr>
         <w:pStyle w:val="Prrafodelista"/>
-        <w:spacing w:before="0" w:after="0"/>
-        <w:ind w:left="1428" w:firstLine="0"/>
-        <w:rPr>
-          <w:rFonts w:cs="Calibri"/>
+        <w:numPr>
+          <w:ilvl w:val="0"/>
+          <w:numId w:val="44"/>
+        </w:numPr>
+        <w:spacing w:before="0" w:after="0"/>
+        <w:rPr>
+          <w:rFonts w:cs="Calibri"/>
+          <w:b/>
+          <w:bCs/>
+          <w:lang w:eastAsia="es-CO"/>
+        </w:rPr>
+      </w:pPr>
+      <w:r>
+        <w:rPr>
+          <w:rFonts w:cs="Calibri"/>
+          <w:b/>
+          <w:bCs/>
+          <w:lang w:eastAsia="es-CO"/>
+        </w:rPr>
+        <w:lastRenderedPageBreak/>
+        <w:t>Etapas del plan de distribución</w:t>
+      </w:r>
+    </w:p>
+    <w:p>
+      <w:pPr>
+        <w:spacing w:before="0" w:after="0"/>
+        <w:ind w:left="349" w:firstLine="360"/>
+        <w:rPr>
+          <w:rFonts w:cs="Calibri"/>
+          <w:lang w:eastAsia="es-CO"/>
+        </w:rPr>
+      </w:pPr>
+      <w:r>
+        <w:rPr>
+          <w:rFonts w:cs="Calibri"/>
+          <w:lang w:eastAsia="es-CO"/>
+        </w:rPr>
+        <w:t>El desarrollo del plan de distribución implica una serie de etapas que permiten su diseño, ejecución, seguimiento y mejora. Estas etapas ayudan a organizar el proceso de manera ordenada y facilitan la toma de decisiones.</w:t>
+      </w:r>
+    </w:p>
+    <w:p>
+      <w:pPr>
+        <w:pStyle w:val="Prrafodelista"/>
+        <w:numPr>
+          <w:ilvl w:val="0"/>
+          <w:numId w:val="34"/>
+        </w:numPr>
+        <w:spacing w:before="0" w:after="0"/>
+        <w:ind w:left="1134"/>
+        <w:rPr>
+          <w:rFonts w:cs="Calibri"/>
+          <w:b/>
+          <w:bCs/>
+          <w:lang w:eastAsia="es-CO"/>
+        </w:rPr>
+      </w:pPr>
+      <w:r>
+        <w:rPr>
+          <w:rFonts w:cs="Calibri"/>
+          <w:b/>
+          <w:bCs/>
+          <w:lang w:eastAsia="es-CO"/>
+        </w:rPr>
+        <w:t>Etapas para construir un plan de distribución</w:t>
+      </w:r>
+    </w:p>
+    <w:p>
+      <w:pPr>
+        <w:pStyle w:val="Prrafodelista"/>
+        <w:numPr>
+          <w:ilvl w:val="0"/>
+          <w:numId w:val="35"/>
+        </w:numPr>
+        <w:spacing w:before="0" w:after="0"/>
+        <w:rPr>
+          <w:rFonts w:cs="Calibri"/>
+          <w:b/>
+          <w:bCs/>
+          <w:lang w:eastAsia="es-CO"/>
+        </w:rPr>
+      </w:pPr>
+      <w:r>
+        <w:rPr>
+          <w:rFonts w:cs="Calibri"/>
+          <w:b/>
+          <w:bCs/>
+          <w:lang w:eastAsia="es-CO"/>
+        </w:rPr>
+        <w:t>Análisis</w:t>
+      </w:r>
+    </w:p>
+    <w:p>
+      <w:pPr>
+        <w:spacing w:before="0" w:after="0"/>
+        <w:ind w:left="1416" w:firstLine="1"/>
+        <w:rPr>
+          <w:rFonts w:cs="Calibri"/>
+          <w:lang w:eastAsia="es-CO"/>
+        </w:rPr>
+      </w:pPr>
+      <w:r>
+        <w:rPr>
+          <w:rFonts w:cs="Calibri"/>
+          <w:lang w:eastAsia="es-CO"/>
+        </w:rPr>
+        <w:t>Se evalúan el mercado, la demanda y las condiciones logísticas. Esta etapa permite identificar necesidades del cliente y condiciones del entorno.</w:t>
+      </w:r>
+    </w:p>
+    <w:p>
+      <w:pPr>
+        <w:pStyle w:val="Prrafodelista"/>
+        <w:numPr>
+          <w:ilvl w:val="0"/>
+          <w:numId w:val="35"/>
+        </w:numPr>
+        <w:spacing w:before="0" w:after="0"/>
+        <w:rPr>
+          <w:rFonts w:cs="Calibri"/>
+          <w:b/>
+          <w:bCs/>
+          <w:lang w:eastAsia="es-CO"/>
+        </w:rPr>
+      </w:pPr>
+      <w:r>
+        <w:rPr>
+          <w:rFonts w:cs="Calibri"/>
+          <w:b/>
+          <w:bCs/>
+          <w:lang w:eastAsia="es-CO"/>
+        </w:rPr>
+        <w:t>Planeación</w:t>
+      </w:r>
+    </w:p>
+    <w:p>
+      <w:pPr>
+        <w:spacing w:before="0" w:after="0"/>
+        <w:ind w:left="1416" w:firstLine="0"/>
+        <w:rPr>
+          <w:rFonts w:cs="Calibri"/>
+          <w:lang w:eastAsia="es-CO"/>
+        </w:rPr>
+      </w:pPr>
+      <w:r>
+        <w:rPr>
+          <w:rFonts w:cs="Calibri"/>
+          <w:lang w:eastAsia="es-CO"/>
+        </w:rPr>
+        <w:t>Se definen estrategias, canales, rutas, recursos e indicadores. Esta etapa permite diseñar el plan de distribución.</w:t>
+      </w:r>
+    </w:p>
+    <w:p>
+      <w:pPr>
+        <w:pStyle w:val="Prrafodelista"/>
+        <w:numPr>
+          <w:ilvl w:val="0"/>
+          <w:numId w:val="35"/>
+        </w:numPr>
+        <w:spacing w:before="0" w:after="0"/>
+        <w:rPr>
+          <w:rFonts w:cs="Calibri"/>
+          <w:b/>
+          <w:bCs/>
+          <w:lang w:eastAsia="es-CO"/>
+        </w:rPr>
+      </w:pPr>
+      <w:r>
+        <w:rPr>
+          <w:rFonts w:cs="Calibri"/>
+          <w:b/>
+          <w:bCs/>
+          <w:lang w:eastAsia="es-CO"/>
+        </w:rPr>
+        <w:t>Implementación</w:t>
+      </w:r>
+    </w:p>
+    <w:p>
+      <w:pPr>
+        <w:spacing w:before="0" w:after="0"/>
+        <w:ind w:left="1416" w:firstLine="0"/>
+        <w:rPr>
+          <w:rFonts w:cs="Calibri"/>
+          <w:lang w:eastAsia="es-CO"/>
+        </w:rPr>
+      </w:pPr>
+      <w:r>
+        <w:rPr>
+          <w:rFonts w:cs="Calibri"/>
+          <w:lang w:eastAsia="es-CO"/>
+        </w:rPr>
+        <w:t>Se ejecutan las acciones definidas. Esta etapa corresponde a la operación logística y a la distribución del producto.</w:t>
+      </w:r>
+    </w:p>
+    <w:p>
+      <w:pPr>
+        <w:pStyle w:val="Prrafodelista"/>
+        <w:numPr>
+          <w:ilvl w:val="0"/>
+          <w:numId w:val="35"/>
+        </w:numPr>
+        <w:spacing w:before="0" w:after="0"/>
+        <w:rPr>
+          <w:rFonts w:cs="Calibri"/>
+          <w:b/>
+          <w:bCs/>
+          <w:lang w:eastAsia="es-CO"/>
+        </w:rPr>
+      </w:pPr>
+      <w:r>
+        <w:rPr>
+          <w:rFonts w:cs="Calibri"/>
+          <w:b/>
+          <w:bCs/>
+          <w:lang w:eastAsia="es-CO"/>
+        </w:rPr>
+        <w:t>Control</w:t>
+      </w:r>
+    </w:p>
+    <w:p>
+      <w:pPr>
+        <w:spacing w:before="0" w:after="0"/>
+        <w:ind w:left="1416" w:firstLine="0"/>
+        <w:rPr>
+          <w:rFonts w:cs="Calibri"/>
+          <w:lang w:eastAsia="es-CO"/>
+        </w:rPr>
+      </w:pPr>
+      <w:r>
+        <w:rPr>
+          <w:rFonts w:cs="Calibri"/>
+          <w:lang w:eastAsia="es-CO"/>
+        </w:rPr>
+        <w:t>Se realiza seguimiento y medición de resultados. Esta etapa permite evaluar indicadores y detectar oportunidades de mejora.</w:t>
+      </w:r>
+    </w:p>
+    <w:p>
+      <w:pPr>
+        <w:pStyle w:val="Prrafodelista"/>
+        <w:numPr>
+          <w:ilvl w:val="0"/>
+          <w:numId w:val="35"/>
+        </w:numPr>
+        <w:spacing w:before="0" w:after="0"/>
+        <w:rPr>
+          <w:rFonts w:cs="Calibri"/>
+          <w:b/>
+          <w:bCs/>
+          <w:lang w:eastAsia="es-CO"/>
+        </w:rPr>
+      </w:pPr>
+      <w:r>
+        <w:rPr>
+          <w:rFonts w:cs="Calibri"/>
+          <w:b/>
+          <w:bCs/>
+          <w:lang w:eastAsia="es-CO"/>
+        </w:rPr>
+        <w:t>Mejora</w:t>
+      </w:r>
+    </w:p>
+    <w:p>
+      <w:pPr>
+        <w:spacing w:before="0" w:after="0"/>
+        <w:ind w:left="1416" w:firstLine="0"/>
+        <w:rPr>
+          <w:rFonts w:cs="Calibri"/>
+          <w:lang w:eastAsia="es-CO"/>
+        </w:rPr>
+      </w:pPr>
+      <w:r>
+        <w:rPr>
+          <w:rFonts w:cs="Calibri"/>
+          <w:lang w:eastAsia="es-CO"/>
+        </w:rPr>
+        <w:t>Se ajusta el plan según los resultados obtenidos. Esta etapa permite optimizar rutas, recursos, cobertura y procesos logísticos.</w:t>
+      </w:r>
+    </w:p>
+    <w:p>
+      <w:pPr>
+        <w:spacing w:before="0" w:after="0"/>
+        <w:ind w:left="708" w:firstLine="708"/>
+        <w:rPr>
+          <w:rFonts w:cs="Calibri"/>
+          <w:lang w:eastAsia="es-CO"/>
+        </w:rPr>
+      </w:pPr>
+      <w:r>
+        <w:rPr>
+          <w:rFonts w:cs="Calibri"/>
+          <w:lang w:eastAsia="es-CO"/>
+        </w:rPr>
+        <w:t>En el contexto actual, las empresas pueden ajustar constantemente sus planes de distribución para responder a la demanda del mercado, reducir tiempos de entrega y mejorar el servicio al cliente mediante el análisis continuo de datos logísticos.</w:t>
+      </w:r>
+    </w:p>
+    <w:p>
+      <w:pPr>
+        <w:spacing w:before="0" w:after="0"/>
+        <w:ind w:left="708" w:firstLine="708"/>
+        <w:rPr>
+          <w:rFonts w:cs="Calibri"/>
+          <w:lang w:eastAsia="es-CO"/>
+        </w:rPr>
+      </w:pPr>
+    </w:p>
+    <w:p>
+      <w:pPr>
+        <w:spacing w:before="0" w:after="0"/>
+        <w:ind w:firstLine="708"/>
+        <w:rPr>
+          <w:rFonts w:cs="Calibri"/>
+          <w:b/>
+          <w:bCs/>
+          <w:lang w:eastAsia="es-CO"/>
+        </w:rPr>
+      </w:pPr>
+      <w:r>
+        <w:rPr>
+          <w:rFonts w:cs="Calibri"/>
+          <w:b/>
+          <w:bCs/>
+          <w:lang w:eastAsia="es-CO"/>
+        </w:rPr>
+        <w:lastRenderedPageBreak/>
+        <w:t>Ejemplo aplicado de plan de distribución</w:t>
+      </w:r>
+    </w:p>
+    <w:p>
+      <w:pPr>
+        <w:spacing w:before="0" w:after="0"/>
+        <w:ind w:firstLine="708"/>
+        <w:rPr>
+          <w:rFonts w:cs="Calibri"/>
+          <w:lang w:eastAsia="es-CO"/>
+        </w:rPr>
+      </w:pPr>
+      <w:r>
+        <w:rPr>
+          <w:rFonts w:cs="Calibri"/>
+          <w:lang w:eastAsia="es-CO"/>
+        </w:rPr>
+        <w:t>A continuación, se presenta un ejemplo hipotético de plan de distribución para una empresa ficticia dedicada a la comercialización de manteca de cerdo a domicilio en la ciudad de Bogotá. El nombre Mantecas Bogotá S.A.S. se utiliza únicamente con fines educativos, para facilitar la comprensión de cómo se integran canales, estrategia, recursos, rutas, proceso de distribución, indicadores y mejora continua.</w:t>
+      </w:r>
+    </w:p>
+    <w:p>
+      <w:pPr>
+        <w:spacing w:before="0" w:after="0"/>
+        <w:ind w:firstLine="708"/>
+        <w:rPr>
+          <w:rFonts w:cs="Calibri"/>
+          <w:b/>
+          <w:bCs/>
           <w:lang w:eastAsia="es-CO"/>
         </w:rPr>
       </w:pPr>
@@ -15278,47 +15811,483 @@
           <w:numId w:val="26"/>
         </w:numPr>
         <w:spacing w:before="0" w:after="0"/>
-        <w:rPr>
-          <w:rFonts w:cs="Calibri"/>
-          <w:b/>
-          <w:bCs/>
-          <w:lang w:eastAsia="es-CO"/>
-        </w:rPr>
-      </w:pPr>
-      <w:r>
-        <w:rPr>
-          <w:rFonts w:cs="Calibri"/>
-          <w:b/>
-          <w:bCs/>
+        <w:ind w:left="709"/>
+        <w:rPr>
+          <w:rFonts w:cs="Calibri"/>
+          <w:b/>
+          <w:bCs/>
+          <w:lang w:eastAsia="es-CO"/>
+        </w:rPr>
+      </w:pPr>
+      <w:r>
+        <w:rPr>
+          <w:rFonts w:cs="Calibri"/>
+          <w:b/>
+          <w:bCs/>
+          <w:lang w:eastAsia="es-CO"/>
+        </w:rPr>
+        <w:t>Plan de distribución de una empresa ficticia: Mantecas Bogotá S.A.S.</w:t>
+      </w:r>
+    </w:p>
+    <w:p>
+      <w:pPr>
+        <w:pStyle w:val="Prrafodelista"/>
+        <w:numPr>
+          <w:ilvl w:val="0"/>
+          <w:numId w:val="36"/>
+        </w:numPr>
+        <w:spacing w:before="0" w:after="0"/>
+        <w:ind w:left="993"/>
+        <w:rPr>
+          <w:rFonts w:cs="Calibri"/>
+          <w:b/>
+          <w:bCs/>
+          <w:lang w:eastAsia="es-CO"/>
+        </w:rPr>
+      </w:pPr>
+      <w:r>
+        <w:rPr>
+          <w:rFonts w:cs="Calibri"/>
+          <w:b/>
+          <w:bCs/>
+          <w:lang w:eastAsia="es-CO"/>
+        </w:rPr>
+        <w:t>Datos generales</w:t>
+      </w:r>
+    </w:p>
+    <w:p>
+      <w:pPr>
+        <w:spacing w:before="0" w:after="0"/>
+        <w:ind w:firstLine="708"/>
+        <w:rPr>
+          <w:rFonts w:cs="Calibri"/>
+          <w:lang w:eastAsia="es-CO"/>
+        </w:rPr>
+      </w:pPr>
+      <w:r>
+        <w:rPr>
+          <w:rFonts w:cs="Calibri"/>
+          <w:lang w:eastAsia="es-CO"/>
+        </w:rPr>
+        <w:t>Empresa: Mantecas Bogotá S.A.S.</w:t>
+      </w:r>
+    </w:p>
+    <w:p>
+      <w:pPr>
+        <w:spacing w:before="0" w:after="0"/>
+        <w:ind w:firstLine="708"/>
+        <w:rPr>
+          <w:rFonts w:cs="Calibri"/>
+          <w:lang w:eastAsia="es-CO"/>
+        </w:rPr>
+      </w:pPr>
+      <w:r>
+        <w:rPr>
+          <w:rFonts w:cs="Calibri"/>
+          <w:lang w:eastAsia="es-CO"/>
+        </w:rPr>
+        <w:t>Producto: manteca de cerdo 100 % natural.</w:t>
+      </w:r>
+    </w:p>
+    <w:p>
+      <w:pPr>
+        <w:spacing w:before="0" w:after="0"/>
+        <w:ind w:firstLine="708"/>
+        <w:rPr>
+          <w:rFonts w:cs="Calibri"/>
+          <w:lang w:eastAsia="es-CO"/>
+        </w:rPr>
+      </w:pPr>
+      <w:r>
+        <w:rPr>
+          <w:rFonts w:cs="Calibri"/>
+          <w:lang w:eastAsia="es-CO"/>
+        </w:rPr>
+        <w:t>Cobertura: Bogotá D. C.</w:t>
+      </w:r>
+    </w:p>
+    <w:p>
+      <w:pPr>
+        <w:spacing w:before="0" w:after="0"/>
+        <w:ind w:left="708" w:firstLine="0"/>
+        <w:rPr>
+          <w:rFonts w:cs="Calibri"/>
+          <w:lang w:eastAsia="es-CO"/>
+        </w:rPr>
+      </w:pPr>
+      <w:r>
+        <w:rPr>
+          <w:rFonts w:cs="Calibri"/>
+          <w:lang w:eastAsia="es-CO"/>
+        </w:rPr>
+        <w:t>Objetivo: garantizar la entrega eficiente del producto en diferentes zonas de la ciudad, optimizando tiempos de distribución, reduciendo costos logísticos y asegurando la calidad del producto hasta su entrega final.</w:t>
+      </w:r>
+    </w:p>
+    <w:p>
+      <w:pPr>
+        <w:pStyle w:val="Prrafodelista"/>
+        <w:numPr>
+          <w:ilvl w:val="0"/>
+          <w:numId w:val="36"/>
+        </w:numPr>
+        <w:spacing w:before="0" w:after="0"/>
+        <w:ind w:left="993"/>
+        <w:rPr>
+          <w:rFonts w:cs="Calibri"/>
+          <w:b/>
+          <w:bCs/>
+          <w:lang w:eastAsia="es-CO"/>
+        </w:rPr>
+      </w:pPr>
+      <w:r>
+        <w:rPr>
+          <w:rFonts w:cs="Calibri"/>
+          <w:b/>
+          <w:bCs/>
+          <w:lang w:eastAsia="es-CO"/>
+        </w:rPr>
+        <w:t>Mercado objetivo</w:t>
+      </w:r>
+    </w:p>
+    <w:p>
+      <w:pPr>
+        <w:spacing w:before="0" w:after="0"/>
+        <w:ind w:left="708" w:firstLine="0"/>
+        <w:rPr>
+          <w:rFonts w:cs="Calibri"/>
+          <w:lang w:eastAsia="es-CO"/>
+        </w:rPr>
+      </w:pPr>
+      <w:r>
+        <w:rPr>
+          <w:rFonts w:cs="Calibri"/>
+          <w:lang w:eastAsia="es-CO"/>
+        </w:rPr>
+        <w:t>El plan se dirige a hogares en zonas urbanas de estratos 2, 3 y 4, restaurantes pequeños, negocios de comida tradicional y emprendimientos gastronómicos.</w:t>
+      </w:r>
+    </w:p>
+    <w:p>
+      <w:pPr>
+        <w:spacing w:before="0" w:after="0"/>
+        <w:ind w:firstLine="708"/>
+        <w:rPr>
+          <w:rFonts w:cs="Calibri"/>
+          <w:lang w:eastAsia="es-CO"/>
+        </w:rPr>
+      </w:pPr>
+    </w:p>
+    <w:p>
+      <w:pPr>
+        <w:spacing w:before="0" w:after="0"/>
+        <w:ind w:firstLine="708"/>
+        <w:rPr>
+          <w:rFonts w:cs="Calibri"/>
+          <w:lang w:eastAsia="es-CO"/>
+        </w:rPr>
+      </w:pPr>
+    </w:p>
+    <w:p>
+      <w:pPr>
+        <w:pStyle w:val="Prrafodelista"/>
+        <w:numPr>
+          <w:ilvl w:val="0"/>
+          <w:numId w:val="36"/>
+        </w:numPr>
+        <w:spacing w:before="0" w:after="0"/>
+        <w:ind w:left="993"/>
+        <w:rPr>
+          <w:rFonts w:cs="Calibri"/>
+          <w:b/>
+          <w:bCs/>
+          <w:lang w:eastAsia="es-CO"/>
+        </w:rPr>
+      </w:pPr>
+      <w:r>
+        <w:rPr>
+          <w:rFonts w:cs="Calibri"/>
+          <w:b/>
+          <w:bCs/>
+          <w:lang w:eastAsia="es-CO"/>
+        </w:rPr>
+        <w:t>Canales de distribución</w:t>
+      </w:r>
+    </w:p>
+    <w:p>
+      <w:pPr>
+        <w:spacing w:before="0" w:after="0"/>
+        <w:ind w:left="633" w:firstLine="360"/>
+        <w:rPr>
+          <w:rFonts w:cs="Calibri"/>
+          <w:lang w:eastAsia="es-CO"/>
+        </w:rPr>
+      </w:pPr>
+      <w:r>
+        <w:rPr>
+          <w:rFonts w:cs="Calibri"/>
+          <w:lang w:eastAsia="es-CO"/>
+        </w:rPr>
+        <w:t xml:space="preserve">Se utilizan tres canales principales. El canal directo digital permite recibir pedidos a través de WhatsApp Business y redes sociales. La plataforma digital permite ampliar cobertura mediante aplicaciones de domicilios. La distribución </w:t>
+      </w:r>
+      <w:r>
+        <w:rPr>
+          <w:rFonts w:cs="Calibri"/>
           <w:lang w:eastAsia="es-CO"/>
         </w:rPr>
         <w:lastRenderedPageBreak/>
-        <w:t>Indicadores</w:t>
+        <w:t>propia permite realizar entregas con personal de la empresa, mantener control del servicio y fortalecer la fidelización.</w:t>
       </w:r>
     </w:p>
     <w:p>
       <w:pPr>
         <w:pStyle w:val="Prrafodelista"/>
-        <w:spacing w:before="0" w:after="0"/>
-        <w:ind w:left="1428" w:firstLine="0"/>
-        <w:rPr>
-          <w:rFonts w:cs="Calibri"/>
-          <w:lang w:eastAsia="es-CO"/>
-        </w:rPr>
-      </w:pPr>
-      <w:r>
-        <w:rPr>
-          <w:rFonts w:cs="Calibri"/>
-          <w:lang w:eastAsia="es-CO"/>
-        </w:rPr>
-        <w:t>Permiten medir el desempeño del plan. Pueden incluir tiempo de entrega, nivel de cumplimiento, satisfacción del cliente y costos logísticos.</w:t>
+        <w:numPr>
+          <w:ilvl w:val="0"/>
+          <w:numId w:val="36"/>
+        </w:numPr>
+        <w:spacing w:before="0" w:after="0"/>
+        <w:ind w:left="993"/>
+        <w:rPr>
+          <w:rFonts w:cs="Calibri"/>
+          <w:b/>
+          <w:bCs/>
+          <w:lang w:eastAsia="es-CO"/>
+        </w:rPr>
+      </w:pPr>
+      <w:r>
+        <w:rPr>
+          <w:rFonts w:cs="Calibri"/>
+          <w:b/>
+          <w:bCs/>
+          <w:lang w:eastAsia="es-CO"/>
+        </w:rPr>
+        <w:t>Estrategia de distribución</w:t>
+      </w:r>
+    </w:p>
+    <w:p>
+      <w:pPr>
+        <w:spacing w:before="0" w:after="0"/>
+        <w:ind w:left="633" w:firstLine="360"/>
+        <w:rPr>
+          <w:rFonts w:cs="Calibri"/>
+          <w:lang w:eastAsia="es-CO"/>
+        </w:rPr>
+      </w:pPr>
+      <w:r>
+        <w:rPr>
+          <w:rFonts w:cs="Calibri"/>
+          <w:lang w:eastAsia="es-CO"/>
+        </w:rPr>
+        <w:t>Se implementa una distribución selectiva, priorizando zonas con mayor demanda y accesibilidad logística, como Kennedy, Suba, Bosa y Engativá. Esta estrategia permite optimizar recursos, reducir costos operativos y garantizar una cobertura eficiente del mercado.</w:t>
       </w:r>
     </w:p>
     <w:p>
       <w:pPr>
         <w:pStyle w:val="Prrafodelista"/>
-        <w:spacing w:before="0" w:after="0"/>
-        <w:ind w:left="1428" w:firstLine="0"/>
+        <w:numPr>
+          <w:ilvl w:val="0"/>
+          <w:numId w:val="36"/>
+        </w:numPr>
+        <w:spacing w:before="0" w:after="0"/>
+        <w:ind w:left="993"/>
+        <w:rPr>
+          <w:rFonts w:cs="Calibri"/>
+          <w:b/>
+          <w:bCs/>
+          <w:lang w:eastAsia="es-CO"/>
+        </w:rPr>
+      </w:pPr>
+      <w:r>
+        <w:rPr>
+          <w:rFonts w:cs="Calibri"/>
+          <w:b/>
+          <w:bCs/>
+          <w:lang w:eastAsia="es-CO"/>
+        </w:rPr>
+        <w:t>Recursos logísticos</w:t>
+      </w:r>
+    </w:p>
+    <w:p>
+      <w:pPr>
+        <w:spacing w:before="0" w:after="0"/>
+        <w:ind w:left="633" w:firstLine="360"/>
+        <w:rPr>
+          <w:rFonts w:cs="Calibri"/>
+          <w:lang w:eastAsia="es-CO"/>
+        </w:rPr>
+      </w:pPr>
+      <w:r>
+        <w:rPr>
+          <w:rFonts w:cs="Calibri"/>
+          <w:lang w:eastAsia="es-CO"/>
+        </w:rPr>
+        <w:t xml:space="preserve">El plan contempla dos motocicletas para entregas ágiles en zona urbana, dos domiciliarios, una persona responsable de la logística, un espacio con condiciones adecuadas para la conservación del producto y el uso de herramientas como GPS, Google </w:t>
+      </w:r>
+      <w:proofErr w:type="spellStart"/>
+      <w:r>
+        <w:rPr>
+          <w:rFonts w:cs="Calibri"/>
+          <w:lang w:eastAsia="es-CO"/>
+        </w:rPr>
+        <w:t>Maps</w:t>
+      </w:r>
+      <w:proofErr w:type="spellEnd"/>
+      <w:r>
+        <w:rPr>
+          <w:rFonts w:cs="Calibri"/>
+          <w:lang w:eastAsia="es-CO"/>
+        </w:rPr>
+        <w:t xml:space="preserve"> y WhatsApp Business.</w:t>
+      </w:r>
+    </w:p>
+    <w:p>
+      <w:pPr>
+        <w:pStyle w:val="Prrafodelista"/>
+        <w:numPr>
+          <w:ilvl w:val="0"/>
+          <w:numId w:val="36"/>
+        </w:numPr>
+        <w:spacing w:before="0" w:after="0"/>
+        <w:ind w:left="993"/>
+        <w:rPr>
+          <w:rFonts w:cs="Calibri"/>
+          <w:b/>
+          <w:bCs/>
+          <w:lang w:eastAsia="es-CO"/>
+        </w:rPr>
+      </w:pPr>
+      <w:r>
+        <w:rPr>
+          <w:rFonts w:cs="Calibri"/>
+          <w:b/>
+          <w:bCs/>
+          <w:lang w:eastAsia="es-CO"/>
+        </w:rPr>
+        <w:t>Rutas de distribución</w:t>
+      </w:r>
+    </w:p>
+    <w:p>
+      <w:pPr>
+        <w:spacing w:before="0" w:after="0"/>
+        <w:ind w:left="633" w:firstLine="360"/>
+        <w:rPr>
+          <w:rFonts w:cs="Calibri"/>
+          <w:lang w:eastAsia="es-CO"/>
+        </w:rPr>
+      </w:pPr>
+      <w:r>
+        <w:rPr>
+          <w:rFonts w:cs="Calibri"/>
+          <w:lang w:eastAsia="es-CO"/>
+        </w:rPr>
+        <w:t>Las rutas se organizan mediante zonificación geográfica, agrupando pedidos por sectores para optimizar tiempos de entrega y reducir costos de desplazamiento. Para planificar las rutas se utilizan herramientas de georreferenciación y sistemas GPS.</w:t>
+      </w:r>
+    </w:p>
+    <w:p>
+      <w:pPr>
+        <w:spacing w:before="0" w:after="0"/>
+        <w:ind w:left="633" w:firstLine="360"/>
+        <w:rPr>
+          <w:rFonts w:cs="Calibri"/>
+          <w:lang w:eastAsia="es-CO"/>
+        </w:rPr>
+      </w:pPr>
+      <w:r>
+        <w:rPr>
+          <w:rFonts w:cs="Calibri"/>
+          <w:lang w:eastAsia="es-CO"/>
+        </w:rPr>
+        <w:t>Las entregas se programan evitando las horas pico de Bogotá, especialmente entre 6:00 a. m. y 9:00 a. m., y entre 5:00 p. m. y 8:00 p. m. Para mejorar la operación, se establecen dos franjas: jornada mañana, de 9:00 a. m. a 12:00 p. m., y jornada tarde, de 2:00 p. m. a 5:00 p. m.</w:t>
+      </w:r>
+    </w:p>
+    <w:p>
+      <w:pPr>
+        <w:pStyle w:val="Prrafodelista"/>
+        <w:numPr>
+          <w:ilvl w:val="0"/>
+          <w:numId w:val="36"/>
+        </w:numPr>
+        <w:spacing w:before="0" w:after="0"/>
+        <w:ind w:left="993"/>
+        <w:rPr>
+          <w:rFonts w:cs="Calibri"/>
+          <w:b/>
+          <w:bCs/>
+          <w:lang w:eastAsia="es-CO"/>
+        </w:rPr>
+      </w:pPr>
+      <w:r>
+        <w:rPr>
+          <w:rFonts w:cs="Calibri"/>
+          <w:b/>
+          <w:bCs/>
+          <w:lang w:eastAsia="es-CO"/>
+        </w:rPr>
+        <w:t>Indicadores y mejora continua</w:t>
+      </w:r>
+    </w:p>
+    <w:p>
+      <w:pPr>
+        <w:spacing w:before="0" w:after="0"/>
+        <w:ind w:left="633" w:firstLine="360"/>
+        <w:rPr>
+          <w:rFonts w:cs="Calibri"/>
+          <w:lang w:eastAsia="es-CO"/>
+        </w:rPr>
+      </w:pPr>
+      <w:r>
+        <w:rPr>
+          <w:rFonts w:cs="Calibri"/>
+          <w:lang w:eastAsia="es-CO"/>
+        </w:rPr>
+        <w:t xml:space="preserve">El desempeño del plan puede medirse con indicadores como tiempo de entrega menor a dos horas, 95 % de entregas efectivas, 90 % de satisfacción </w:t>
+      </w:r>
+      <w:r>
+        <w:rPr>
+          <w:rFonts w:cs="Calibri"/>
+          <w:lang w:eastAsia="es-CO"/>
+        </w:rPr>
+        <w:lastRenderedPageBreak/>
+        <w:t>positiva del cliente y reducción progresiva de costos logísticos mediante optimización de rutas.</w:t>
+      </w:r>
+    </w:p>
+    <w:p>
+      <w:pPr>
+        <w:spacing w:before="0" w:after="0"/>
+        <w:ind w:left="633" w:firstLine="360"/>
+        <w:rPr>
+          <w:rFonts w:cs="Calibri"/>
+          <w:lang w:eastAsia="es-CO"/>
+        </w:rPr>
+      </w:pPr>
+      <w:r>
+        <w:rPr>
+          <w:rFonts w:cs="Calibri"/>
+          <w:lang w:eastAsia="es-CO"/>
+        </w:rPr>
+        <w:t>La mejora continua se realiza mediante el análisis periódico de indicadores, lo que permite ajustar rutas, ampliar zonas de cobertura y optimizar los procesos logísticos de acuerdo con el comportamiento de la demanda y las condiciones del entorno.</w:t>
+      </w:r>
+    </w:p>
+    <w:p>
+      <w:pPr>
+        <w:spacing w:before="0" w:after="0"/>
+        <w:ind w:left="633" w:firstLine="360"/>
+        <w:rPr>
+          <w:rFonts w:cs="Calibri"/>
+          <w:lang w:eastAsia="es-CO"/>
+        </w:rPr>
+      </w:pPr>
+      <w:r>
+        <w:rPr>
+          <w:rFonts w:cs="Calibri"/>
+          <w:lang w:eastAsia="es-CO"/>
+        </w:rPr>
+        <w:t>Este ejemplo evidencia cómo la planificación de la distribución integra aspectos estratégicos, logísticos y tecnológicos. La organización de canales, rutas, recursos e indicadores permite mejorar la eficiencia operativa, optimizar recursos y fortalecer la experiencia del cliente en un entorno urbano.</w:t>
+      </w:r>
+    </w:p>
+    <w:p>
+      <w:pPr>
+        <w:spacing w:before="0" w:after="0"/>
+        <w:ind w:left="633" w:firstLine="360"/>
         <w:rPr>
           <w:rFonts w:cs="Calibri"/>
           <w:lang w:eastAsia="es-CO"/>
@@ -15348,824 +16317,6 @@
           <w:bCs/>
           <w:lang w:eastAsia="es-CO"/>
         </w:rPr>
-        <w:t>Etapas del plan de distribución</w:t>
-      </w:r>
-    </w:p>
-    <w:p>
-      <w:pPr>
-        <w:spacing w:before="0" w:after="0"/>
-        <w:ind w:left="349" w:firstLine="360"/>
-        <w:rPr>
-          <w:rFonts w:cs="Calibri"/>
-          <w:lang w:eastAsia="es-CO"/>
-        </w:rPr>
-      </w:pPr>
-      <w:r>
-        <w:rPr>
-          <w:rFonts w:cs="Calibri"/>
-          <w:lang w:eastAsia="es-CO"/>
-        </w:rPr>
-        <w:t>El desarrollo del plan de distribución implica una serie de etapas que permiten su diseño, ejecución, seguimiento y mejora. Estas etapas ayudan a organizar el proceso de manera ordenada y facilitan la toma de decisiones.</w:t>
-      </w:r>
-    </w:p>
-    <w:p>
-      <w:pPr>
-        <w:pStyle w:val="Prrafodelista"/>
-        <w:numPr>
-          <w:ilvl w:val="0"/>
-          <w:numId w:val="34"/>
-        </w:numPr>
-        <w:spacing w:before="0" w:after="0"/>
-        <w:ind w:left="1134"/>
-        <w:rPr>
-          <w:rFonts w:cs="Calibri"/>
-          <w:b/>
-          <w:bCs/>
-          <w:lang w:eastAsia="es-CO"/>
-        </w:rPr>
-      </w:pPr>
-      <w:r>
-        <w:rPr>
-          <w:rFonts w:cs="Calibri"/>
-          <w:b/>
-          <w:bCs/>
-          <w:lang w:eastAsia="es-CO"/>
-        </w:rPr>
-        <w:t>Etapas para construir un plan de distribución</w:t>
-      </w:r>
-    </w:p>
-    <w:p>
-      <w:pPr>
-        <w:pStyle w:val="Prrafodelista"/>
-        <w:numPr>
-          <w:ilvl w:val="0"/>
-          <w:numId w:val="35"/>
-        </w:numPr>
-        <w:spacing w:before="0" w:after="0"/>
-        <w:rPr>
-          <w:rFonts w:cs="Calibri"/>
-          <w:b/>
-          <w:bCs/>
-          <w:lang w:eastAsia="es-CO"/>
-        </w:rPr>
-      </w:pPr>
-      <w:r>
-        <w:rPr>
-          <w:rFonts w:cs="Calibri"/>
-          <w:b/>
-          <w:bCs/>
-          <w:lang w:eastAsia="es-CO"/>
-        </w:rPr>
-        <w:t>Análisis</w:t>
-      </w:r>
-    </w:p>
-    <w:p>
-      <w:pPr>
-        <w:spacing w:before="0" w:after="0"/>
-        <w:ind w:left="1416" w:firstLine="1"/>
-        <w:rPr>
-          <w:rFonts w:cs="Calibri"/>
-          <w:lang w:eastAsia="es-CO"/>
-        </w:rPr>
-      </w:pPr>
-      <w:r>
-        <w:rPr>
-          <w:rFonts w:cs="Calibri"/>
-          <w:lang w:eastAsia="es-CO"/>
-        </w:rPr>
-        <w:t>Se evalúan el mercado, la demanda y las condiciones logísticas. Esta etapa permite identificar necesidades del cliente y condiciones del entorno.</w:t>
-      </w:r>
-    </w:p>
-    <w:p>
-      <w:pPr>
-        <w:pStyle w:val="Prrafodelista"/>
-        <w:numPr>
-          <w:ilvl w:val="0"/>
-          <w:numId w:val="35"/>
-        </w:numPr>
-        <w:spacing w:before="0" w:after="0"/>
-        <w:rPr>
-          <w:rFonts w:cs="Calibri"/>
-          <w:b/>
-          <w:bCs/>
-          <w:lang w:eastAsia="es-CO"/>
-        </w:rPr>
-      </w:pPr>
-      <w:r>
-        <w:rPr>
-          <w:rFonts w:cs="Calibri"/>
-          <w:b/>
-          <w:bCs/>
-          <w:lang w:eastAsia="es-CO"/>
-        </w:rPr>
-        <w:t>Planeación</w:t>
-      </w:r>
-    </w:p>
-    <w:p>
-      <w:pPr>
-        <w:spacing w:before="0" w:after="0"/>
-        <w:ind w:left="1416" w:firstLine="0"/>
-        <w:rPr>
-          <w:rFonts w:cs="Calibri"/>
-          <w:lang w:eastAsia="es-CO"/>
-        </w:rPr>
-      </w:pPr>
-      <w:r>
-        <w:rPr>
-          <w:rFonts w:cs="Calibri"/>
-          <w:lang w:eastAsia="es-CO"/>
-        </w:rPr>
-        <w:t>Se definen estrategias, canales, rutas, recursos e indicadores. Esta etapa permite diseñar el plan de distribución.</w:t>
-      </w:r>
-    </w:p>
-    <w:p>
-      <w:pPr>
-        <w:pStyle w:val="Prrafodelista"/>
-        <w:numPr>
-          <w:ilvl w:val="0"/>
-          <w:numId w:val="35"/>
-        </w:numPr>
-        <w:spacing w:before="0" w:after="0"/>
-        <w:rPr>
-          <w:rFonts w:cs="Calibri"/>
-          <w:b/>
-          <w:bCs/>
-          <w:lang w:eastAsia="es-CO"/>
-        </w:rPr>
-      </w:pPr>
-      <w:r>
-        <w:rPr>
-          <w:rFonts w:cs="Calibri"/>
-          <w:b/>
-          <w:bCs/>
-          <w:lang w:eastAsia="es-CO"/>
-        </w:rPr>
-        <w:t>Implementación</w:t>
-      </w:r>
-    </w:p>
-    <w:p>
-      <w:pPr>
-        <w:spacing w:before="0" w:after="0"/>
-        <w:ind w:left="1416" w:firstLine="0"/>
-        <w:rPr>
-          <w:rFonts w:cs="Calibri"/>
-          <w:lang w:eastAsia="es-CO"/>
-        </w:rPr>
-      </w:pPr>
-      <w:r>
-        <w:rPr>
-          <w:rFonts w:cs="Calibri"/>
-          <w:lang w:eastAsia="es-CO"/>
-        </w:rPr>
-        <w:t>Se ejecutan las acciones definidas. Esta etapa corresponde a la operación logística y a la distribución del producto.</w:t>
-      </w:r>
-    </w:p>
-    <w:p>
-      <w:pPr>
-        <w:pStyle w:val="Prrafodelista"/>
-        <w:numPr>
-          <w:ilvl w:val="0"/>
-          <w:numId w:val="35"/>
-        </w:numPr>
-        <w:spacing w:before="0" w:after="0"/>
-        <w:rPr>
-          <w:rFonts w:cs="Calibri"/>
-          <w:b/>
-          <w:bCs/>
-          <w:lang w:eastAsia="es-CO"/>
-        </w:rPr>
-      </w:pPr>
-      <w:r>
-        <w:rPr>
-          <w:rFonts w:cs="Calibri"/>
-          <w:b/>
-          <w:bCs/>
-          <w:lang w:eastAsia="es-CO"/>
-        </w:rPr>
-        <w:t>Control</w:t>
-      </w:r>
-    </w:p>
-    <w:p>
-      <w:pPr>
-        <w:spacing w:before="0" w:after="0"/>
-        <w:ind w:left="1416" w:firstLine="0"/>
-        <w:rPr>
-          <w:rFonts w:cs="Calibri"/>
-          <w:lang w:eastAsia="es-CO"/>
-        </w:rPr>
-      </w:pPr>
-      <w:r>
-        <w:rPr>
-          <w:rFonts w:cs="Calibri"/>
-          <w:lang w:eastAsia="es-CO"/>
-        </w:rPr>
-        <w:t>Se realiza seguimiento y medición de resultados. Esta etapa permite evaluar indicadores y detectar oportunidades de mejora.</w:t>
-      </w:r>
-    </w:p>
-    <w:p>
-      <w:pPr>
-        <w:pStyle w:val="Prrafodelista"/>
-        <w:numPr>
-          <w:ilvl w:val="0"/>
-          <w:numId w:val="35"/>
-        </w:numPr>
-        <w:spacing w:before="0" w:after="0"/>
-        <w:rPr>
-          <w:rFonts w:cs="Calibri"/>
-          <w:b/>
-          <w:bCs/>
-          <w:lang w:eastAsia="es-CO"/>
-        </w:rPr>
-      </w:pPr>
-      <w:r>
-        <w:rPr>
-          <w:rFonts w:cs="Calibri"/>
-          <w:b/>
-          <w:bCs/>
-          <w:lang w:eastAsia="es-CO"/>
-        </w:rPr>
-        <w:t>Mejora</w:t>
-      </w:r>
-    </w:p>
-    <w:p>
-      <w:pPr>
-        <w:spacing w:before="0" w:after="0"/>
-        <w:ind w:left="1416" w:firstLine="0"/>
-        <w:rPr>
-          <w:rFonts w:cs="Calibri"/>
-          <w:lang w:eastAsia="es-CO"/>
-        </w:rPr>
-      </w:pPr>
-      <w:r>
-        <w:rPr>
-          <w:rFonts w:cs="Calibri"/>
-          <w:lang w:eastAsia="es-CO"/>
-        </w:rPr>
-        <w:t>Se ajusta el plan según los resultados obtenidos. Esta etapa permite optimizar rutas, recursos, cobertura y procesos logísticos.</w:t>
-      </w:r>
-    </w:p>
-    <w:p>
-      <w:pPr>
-        <w:spacing w:before="0" w:after="0"/>
-        <w:ind w:left="708" w:firstLine="708"/>
-        <w:rPr>
-          <w:rFonts w:cs="Calibri"/>
-          <w:lang w:eastAsia="es-CO"/>
-        </w:rPr>
-      </w:pPr>
-      <w:r>
-        <w:rPr>
-          <w:rFonts w:cs="Calibri"/>
-          <w:lang w:eastAsia="es-CO"/>
-        </w:rPr>
-        <w:lastRenderedPageBreak/>
-        <w:t>En el contexto actual, las empresas pueden ajustar constantemente sus planes de distribución para responder a la demanda del mercado, reducir tiempos de entrega y mejorar el servicio al cliente mediante el análisis continuo de datos logísticos.</w:t>
-      </w:r>
-    </w:p>
-    <w:p>
-      <w:pPr>
-        <w:spacing w:before="0" w:after="0"/>
-        <w:ind w:left="708" w:firstLine="708"/>
-        <w:rPr>
-          <w:rFonts w:cs="Calibri"/>
-          <w:lang w:eastAsia="es-CO"/>
-        </w:rPr>
-      </w:pPr>
-    </w:p>
-    <w:p>
-      <w:pPr>
-        <w:spacing w:before="0" w:after="0"/>
-        <w:ind w:firstLine="708"/>
-        <w:rPr>
-          <w:rFonts w:cs="Calibri"/>
-          <w:b/>
-          <w:bCs/>
-          <w:lang w:eastAsia="es-CO"/>
-        </w:rPr>
-      </w:pPr>
-      <w:r>
-        <w:rPr>
-          <w:rFonts w:cs="Calibri"/>
-          <w:b/>
-          <w:bCs/>
-          <w:lang w:eastAsia="es-CO"/>
-        </w:rPr>
-        <w:t>Ejemplo aplicado de plan de distribución</w:t>
-      </w:r>
-    </w:p>
-    <w:p>
-      <w:pPr>
-        <w:spacing w:before="0" w:after="0"/>
-        <w:ind w:firstLine="708"/>
-        <w:rPr>
-          <w:rFonts w:cs="Calibri"/>
-          <w:lang w:eastAsia="es-CO"/>
-        </w:rPr>
-      </w:pPr>
-      <w:r>
-        <w:rPr>
-          <w:rFonts w:cs="Calibri"/>
-          <w:lang w:eastAsia="es-CO"/>
-        </w:rPr>
-        <w:t>A continuación, se presenta un ejemplo hipotético de plan de distribución para una empresa ficticia dedicada a la comercialización de manteca de cerdo a domicilio en la ciudad de Bogotá. El nombre Mantecas Bogotá S.A.S. se utiliza únicamente con fines educativos, para facilitar la comprensión de cómo se integran canales, estrategia, recursos, rutas, proceso de distribución, indicadores y mejora continua.</w:t>
-      </w:r>
-    </w:p>
-    <w:p>
-      <w:pPr>
-        <w:spacing w:before="0" w:after="0"/>
-        <w:ind w:firstLine="708"/>
-        <w:rPr>
-          <w:rFonts w:cs="Calibri"/>
-          <w:b/>
-          <w:bCs/>
-          <w:lang w:eastAsia="es-CO"/>
-        </w:rPr>
-      </w:pPr>
-    </w:p>
-    <w:p>
-      <w:pPr>
-        <w:pStyle w:val="Prrafodelista"/>
-        <w:numPr>
-          <w:ilvl w:val="0"/>
-          <w:numId w:val="26"/>
-        </w:numPr>
-        <w:spacing w:before="0" w:after="0"/>
-        <w:ind w:left="709"/>
-        <w:rPr>
-          <w:rFonts w:cs="Calibri"/>
-          <w:b/>
-          <w:bCs/>
-          <w:lang w:eastAsia="es-CO"/>
-        </w:rPr>
-      </w:pPr>
-      <w:r>
-        <w:rPr>
-          <w:rFonts w:cs="Calibri"/>
-          <w:b/>
-          <w:bCs/>
-          <w:lang w:eastAsia="es-CO"/>
-        </w:rPr>
-        <w:t>Plan de distribución de una empresa ficticia: Mantecas Bogotá S.A.S.</w:t>
-      </w:r>
-    </w:p>
-    <w:p>
-      <w:pPr>
-        <w:pStyle w:val="Prrafodelista"/>
-        <w:numPr>
-          <w:ilvl w:val="0"/>
-          <w:numId w:val="36"/>
-        </w:numPr>
-        <w:spacing w:before="0" w:after="0"/>
-        <w:ind w:left="993"/>
-        <w:rPr>
-          <w:rFonts w:cs="Calibri"/>
-          <w:b/>
-          <w:bCs/>
-          <w:lang w:eastAsia="es-CO"/>
-        </w:rPr>
-      </w:pPr>
-      <w:r>
-        <w:rPr>
-          <w:rFonts w:cs="Calibri"/>
-          <w:b/>
-          <w:bCs/>
-          <w:lang w:eastAsia="es-CO"/>
-        </w:rPr>
-        <w:t>Datos generales</w:t>
-      </w:r>
-    </w:p>
-    <w:p>
-      <w:pPr>
-        <w:spacing w:before="0" w:after="0"/>
-        <w:ind w:firstLine="708"/>
-        <w:rPr>
-          <w:rFonts w:cs="Calibri"/>
-          <w:lang w:eastAsia="es-CO"/>
-        </w:rPr>
-      </w:pPr>
-      <w:r>
-        <w:rPr>
-          <w:rFonts w:cs="Calibri"/>
-          <w:lang w:eastAsia="es-CO"/>
-        </w:rPr>
-        <w:t>Empresa: Mantecas Bogotá S.A.S.</w:t>
-      </w:r>
-    </w:p>
-    <w:p>
-      <w:pPr>
-        <w:spacing w:before="0" w:after="0"/>
-        <w:ind w:firstLine="708"/>
-        <w:rPr>
-          <w:rFonts w:cs="Calibri"/>
-          <w:lang w:eastAsia="es-CO"/>
-        </w:rPr>
-      </w:pPr>
-      <w:r>
-        <w:rPr>
-          <w:rFonts w:cs="Calibri"/>
-          <w:lang w:eastAsia="es-CO"/>
-        </w:rPr>
-        <w:t>Producto: manteca de cerdo 100 % natural.</w:t>
-      </w:r>
-    </w:p>
-    <w:p>
-      <w:pPr>
-        <w:spacing w:before="0" w:after="0"/>
-        <w:ind w:firstLine="708"/>
-        <w:rPr>
-          <w:rFonts w:cs="Calibri"/>
-          <w:lang w:eastAsia="es-CO"/>
-        </w:rPr>
-      </w:pPr>
-      <w:r>
-        <w:rPr>
-          <w:rFonts w:cs="Calibri"/>
-          <w:lang w:eastAsia="es-CO"/>
-        </w:rPr>
-        <w:t>Cobertura: Bogotá D. C.</w:t>
-      </w:r>
-    </w:p>
-    <w:p>
-      <w:pPr>
-        <w:spacing w:before="0" w:after="0"/>
-        <w:ind w:left="708" w:firstLine="0"/>
-        <w:rPr>
-          <w:rFonts w:cs="Calibri"/>
-          <w:lang w:eastAsia="es-CO"/>
-        </w:rPr>
-      </w:pPr>
-      <w:r>
-        <w:rPr>
-          <w:rFonts w:cs="Calibri"/>
-          <w:lang w:eastAsia="es-CO"/>
-        </w:rPr>
-        <w:t>Objetivo: garantizar la entrega eficiente del producto en diferentes zonas de la ciudad, optimizando tiempos de distribución, reduciendo costos logísticos y asegurando la calidad del producto hasta su entrega final.</w:t>
-      </w:r>
-    </w:p>
-    <w:p>
-      <w:pPr>
-        <w:pStyle w:val="Prrafodelista"/>
-        <w:numPr>
-          <w:ilvl w:val="0"/>
-          <w:numId w:val="36"/>
-        </w:numPr>
-        <w:spacing w:before="0" w:after="0"/>
-        <w:ind w:left="993"/>
-        <w:rPr>
-          <w:rFonts w:cs="Calibri"/>
-          <w:b/>
-          <w:bCs/>
-          <w:lang w:eastAsia="es-CO"/>
-        </w:rPr>
-      </w:pPr>
-      <w:r>
-        <w:rPr>
-          <w:rFonts w:cs="Calibri"/>
-          <w:b/>
-          <w:bCs/>
-          <w:lang w:eastAsia="es-CO"/>
-        </w:rPr>
-        <w:t>Mercado objetivo</w:t>
-      </w:r>
-    </w:p>
-    <w:p>
-      <w:pPr>
-        <w:spacing w:before="0" w:after="0"/>
-        <w:ind w:left="708" w:firstLine="0"/>
-        <w:rPr>
-          <w:rFonts w:cs="Calibri"/>
-          <w:lang w:eastAsia="es-CO"/>
-        </w:rPr>
-      </w:pPr>
-      <w:r>
-        <w:rPr>
-          <w:rFonts w:cs="Calibri"/>
-          <w:lang w:eastAsia="es-CO"/>
-        </w:rPr>
-        <w:t>El plan se dirige a hogares en zonas urbanas de estratos 2, 3 y 4, restaurantes pequeños, negocios de comida tradicional y emprendimientos gastronómicos.</w:t>
-      </w:r>
-    </w:p>
-    <w:p>
-      <w:pPr>
-        <w:spacing w:before="0" w:after="0"/>
-        <w:ind w:firstLine="708"/>
-        <w:rPr>
-          <w:rFonts w:cs="Calibri"/>
-          <w:lang w:eastAsia="es-CO"/>
-        </w:rPr>
-      </w:pPr>
-    </w:p>
-    <w:p>
-      <w:pPr>
-        <w:spacing w:before="0" w:after="0"/>
-        <w:ind w:firstLine="708"/>
-        <w:rPr>
-          <w:rFonts w:cs="Calibri"/>
-          <w:lang w:eastAsia="es-CO"/>
-        </w:rPr>
-      </w:pPr>
-    </w:p>
-    <w:p>
-      <w:pPr>
-        <w:pStyle w:val="Prrafodelista"/>
-        <w:numPr>
-          <w:ilvl w:val="0"/>
-          <w:numId w:val="36"/>
-        </w:numPr>
-        <w:spacing w:before="0" w:after="0"/>
-        <w:ind w:left="993"/>
-        <w:rPr>
-          <w:rFonts w:cs="Calibri"/>
-          <w:b/>
-          <w:bCs/>
-          <w:lang w:eastAsia="es-CO"/>
-        </w:rPr>
-      </w:pPr>
-      <w:r>
-        <w:rPr>
-          <w:rFonts w:cs="Calibri"/>
-          <w:b/>
-          <w:bCs/>
-          <w:lang w:eastAsia="es-CO"/>
-        </w:rPr>
-        <w:lastRenderedPageBreak/>
-        <w:t>Canales de distribución</w:t>
-      </w:r>
-    </w:p>
-    <w:p>
-      <w:pPr>
-        <w:spacing w:before="0" w:after="0"/>
-        <w:ind w:left="633" w:firstLine="360"/>
-        <w:rPr>
-          <w:rFonts w:cs="Calibri"/>
-          <w:lang w:eastAsia="es-CO"/>
-        </w:rPr>
-      </w:pPr>
-      <w:r>
-        <w:rPr>
-          <w:rFonts w:cs="Calibri"/>
-          <w:lang w:eastAsia="es-CO"/>
-        </w:rPr>
-        <w:t>Se utilizan tres canales principales. El canal directo digital permite recibir pedidos a través de WhatsApp Business y redes sociales. La plataforma digital permite ampliar cobertura mediante aplicaciones de domicilios. La distribución propia permite realizar entregas con personal de la empresa, mantener control del servicio y fortalecer la fidelización.</w:t>
-      </w:r>
-    </w:p>
-    <w:p>
-      <w:pPr>
-        <w:pStyle w:val="Prrafodelista"/>
-        <w:numPr>
-          <w:ilvl w:val="0"/>
-          <w:numId w:val="36"/>
-        </w:numPr>
-        <w:spacing w:before="0" w:after="0"/>
-        <w:ind w:left="993"/>
-        <w:rPr>
-          <w:rFonts w:cs="Calibri"/>
-          <w:b/>
-          <w:bCs/>
-          <w:lang w:eastAsia="es-CO"/>
-        </w:rPr>
-      </w:pPr>
-      <w:r>
-        <w:rPr>
-          <w:rFonts w:cs="Calibri"/>
-          <w:b/>
-          <w:bCs/>
-          <w:lang w:eastAsia="es-CO"/>
-        </w:rPr>
-        <w:t>Estrategia de distribución</w:t>
-      </w:r>
-    </w:p>
-    <w:p>
-      <w:pPr>
-        <w:spacing w:before="0" w:after="0"/>
-        <w:ind w:left="633" w:firstLine="360"/>
-        <w:rPr>
-          <w:rFonts w:cs="Calibri"/>
-          <w:lang w:eastAsia="es-CO"/>
-        </w:rPr>
-      </w:pPr>
-      <w:r>
-        <w:rPr>
-          <w:rFonts w:cs="Calibri"/>
-          <w:lang w:eastAsia="es-CO"/>
-        </w:rPr>
-        <w:t>Se implementa una distribución selectiva, priorizando zonas con mayor demanda y accesibilidad logística, como Kennedy, Suba, Bosa y Engativá. Esta estrategia permite optimizar recursos, reducir costos operativos y garantizar una cobertura eficiente del mercado.</w:t>
-      </w:r>
-    </w:p>
-    <w:p>
-      <w:pPr>
-        <w:pStyle w:val="Prrafodelista"/>
-        <w:numPr>
-          <w:ilvl w:val="0"/>
-          <w:numId w:val="36"/>
-        </w:numPr>
-        <w:spacing w:before="0" w:after="0"/>
-        <w:ind w:left="993"/>
-        <w:rPr>
-          <w:rFonts w:cs="Calibri"/>
-          <w:b/>
-          <w:bCs/>
-          <w:lang w:eastAsia="es-CO"/>
-        </w:rPr>
-      </w:pPr>
-      <w:r>
-        <w:rPr>
-          <w:rFonts w:cs="Calibri"/>
-          <w:b/>
-          <w:bCs/>
-          <w:lang w:eastAsia="es-CO"/>
-        </w:rPr>
-        <w:t>Recursos logísticos</w:t>
-      </w:r>
-    </w:p>
-    <w:p>
-      <w:pPr>
-        <w:spacing w:before="0" w:after="0"/>
-        <w:ind w:left="633" w:firstLine="360"/>
-        <w:rPr>
-          <w:rFonts w:cs="Calibri"/>
-          <w:lang w:eastAsia="es-CO"/>
-        </w:rPr>
-      </w:pPr>
-      <w:r>
-        <w:rPr>
-          <w:rFonts w:cs="Calibri"/>
-          <w:lang w:eastAsia="es-CO"/>
-        </w:rPr>
-        <w:t>El plan contempla dos motocicletas para entregas ágiles en zona urbana, dos domiciliarios, una persona responsable de la logística, un espacio con condiciones adecuadas para la conservación del producto y el uso de herramientas como GPS, Google Maps y WhatsApp Business.</w:t>
-      </w:r>
-    </w:p>
-    <w:p>
-      <w:pPr>
-        <w:pStyle w:val="Prrafodelista"/>
-        <w:numPr>
-          <w:ilvl w:val="0"/>
-          <w:numId w:val="36"/>
-        </w:numPr>
-        <w:spacing w:before="0" w:after="0"/>
-        <w:ind w:left="993"/>
-        <w:rPr>
-          <w:rFonts w:cs="Calibri"/>
-          <w:b/>
-          <w:bCs/>
-          <w:lang w:eastAsia="es-CO"/>
-        </w:rPr>
-      </w:pPr>
-      <w:r>
-        <w:rPr>
-          <w:rFonts w:cs="Calibri"/>
-          <w:b/>
-          <w:bCs/>
-          <w:lang w:eastAsia="es-CO"/>
-        </w:rPr>
-        <w:t>Rutas de distribución</w:t>
-      </w:r>
-    </w:p>
-    <w:p>
-      <w:pPr>
-        <w:spacing w:before="0" w:after="0"/>
-        <w:ind w:left="633" w:firstLine="360"/>
-        <w:rPr>
-          <w:rFonts w:cs="Calibri"/>
-          <w:lang w:eastAsia="es-CO"/>
-        </w:rPr>
-      </w:pPr>
-      <w:r>
-        <w:rPr>
-          <w:rFonts w:cs="Calibri"/>
-          <w:lang w:eastAsia="es-CO"/>
-        </w:rPr>
-        <w:t>Las rutas se organizan mediante zonificación geográfica, agrupando pedidos por sectores para optimizar tiempos de entrega y reducir costos de desplazamiento. Para planificar las rutas se utilizan herramientas de georreferenciación y sistemas GPS.</w:t>
-      </w:r>
-    </w:p>
-    <w:p>
-      <w:pPr>
-        <w:spacing w:before="0" w:after="0"/>
-        <w:ind w:left="633" w:firstLine="360"/>
-        <w:rPr>
-          <w:rFonts w:cs="Calibri"/>
-          <w:lang w:eastAsia="es-CO"/>
-        </w:rPr>
-      </w:pPr>
-      <w:r>
-        <w:rPr>
-          <w:rFonts w:cs="Calibri"/>
-          <w:lang w:eastAsia="es-CO"/>
-        </w:rPr>
-        <w:t>Las entregas se programan evitando las horas pico de Bogotá, especialmente entre 6:00 a. m. y 9:00 a. m., y entre 5:00 p. m. y 8:00 p. m. Para mejorar la operación, se establecen dos franjas: jornada mañana, de 9:00 a. m. a 12:00 p. m., y jornada tarde, de 2:00 p. m. a 5:00 p. m.</w:t>
-      </w:r>
-    </w:p>
-    <w:p>
-      <w:pPr>
-        <w:pStyle w:val="Prrafodelista"/>
-        <w:numPr>
-          <w:ilvl w:val="0"/>
-          <w:numId w:val="36"/>
-        </w:numPr>
-        <w:spacing w:before="0" w:after="0"/>
-        <w:ind w:left="993"/>
-        <w:rPr>
-          <w:rFonts w:cs="Calibri"/>
-          <w:b/>
-          <w:bCs/>
-          <w:lang w:eastAsia="es-CO"/>
-        </w:rPr>
-      </w:pPr>
-      <w:r>
-        <w:rPr>
-          <w:rFonts w:cs="Calibri"/>
-          <w:b/>
-          <w:bCs/>
-          <w:lang w:eastAsia="es-CO"/>
-        </w:rPr>
-        <w:lastRenderedPageBreak/>
-        <w:t>Indicadores y mejora continua</w:t>
-      </w:r>
-    </w:p>
-    <w:p>
-      <w:pPr>
-        <w:spacing w:before="0" w:after="0"/>
-        <w:ind w:left="633" w:firstLine="360"/>
-        <w:rPr>
-          <w:rFonts w:cs="Calibri"/>
-          <w:lang w:eastAsia="es-CO"/>
-        </w:rPr>
-      </w:pPr>
-      <w:r>
-        <w:rPr>
-          <w:rFonts w:cs="Calibri"/>
-          <w:lang w:eastAsia="es-CO"/>
-        </w:rPr>
-        <w:t>El desempeño del plan puede medirse con indicadores como tiempo de entrega menor a dos horas, 95 % de entregas efectivas, 90 % de satisfacción positiva del cliente y reducción progresiva de costos logísticos mediante optimización de rutas.</w:t>
-      </w:r>
-    </w:p>
-    <w:p>
-      <w:pPr>
-        <w:spacing w:before="0" w:after="0"/>
-        <w:ind w:left="633" w:firstLine="360"/>
-        <w:rPr>
-          <w:rFonts w:cs="Calibri"/>
-          <w:lang w:eastAsia="es-CO"/>
-        </w:rPr>
-      </w:pPr>
-      <w:r>
-        <w:rPr>
-          <w:rFonts w:cs="Calibri"/>
-          <w:lang w:eastAsia="es-CO"/>
-        </w:rPr>
-        <w:t>La mejora continua se realiza mediante el análisis periódico de indicadores, lo que permite ajustar rutas, ampliar zonas de cobertura y optimizar los procesos logísticos de acuerdo con el comportamiento de la demanda y las condiciones del entorno.</w:t>
-      </w:r>
-    </w:p>
-    <w:p>
-      <w:pPr>
-        <w:spacing w:before="0" w:after="0"/>
-        <w:ind w:left="633" w:firstLine="360"/>
-        <w:rPr>
-          <w:rFonts w:cs="Calibri"/>
-          <w:lang w:eastAsia="es-CO"/>
-        </w:rPr>
-      </w:pPr>
-      <w:r>
-        <w:rPr>
-          <w:rFonts w:cs="Calibri"/>
-          <w:lang w:eastAsia="es-CO"/>
-        </w:rPr>
-        <w:t>Este ejemplo evidencia cómo la planificación de la distribución integra aspectos estratégicos, logísticos y tecnológicos. La organización de canales, rutas, recursos e indicadores permite mejorar la eficiencia operativa, optimizar recursos y fortalecer la experiencia del cliente en un entorno urbano.</w:t>
-      </w:r>
-    </w:p>
-    <w:p>
-      <w:pPr>
-        <w:spacing w:before="0" w:after="0"/>
-        <w:ind w:left="633" w:firstLine="360"/>
-        <w:rPr>
-          <w:rFonts w:cs="Calibri"/>
-          <w:lang w:eastAsia="es-CO"/>
-        </w:rPr>
-      </w:pPr>
-    </w:p>
-    <w:p>
-      <w:pPr>
-        <w:pStyle w:val="Prrafodelista"/>
-        <w:numPr>
-          <w:ilvl w:val="0"/>
-          <w:numId w:val="26"/>
-        </w:numPr>
-        <w:spacing w:before="0" w:after="0"/>
-        <w:ind w:left="709"/>
-        <w:rPr>
-          <w:rFonts w:cs="Calibri"/>
-          <w:b/>
-          <w:bCs/>
-          <w:lang w:eastAsia="es-CO"/>
-        </w:rPr>
-      </w:pPr>
-      <w:r>
-        <w:rPr>
-          <w:rFonts w:cs="Calibri"/>
-          <w:b/>
-          <w:bCs/>
-          <w:lang w:eastAsia="es-CO"/>
-        </w:rPr>
         <w:t>Proceso de distribución aplicado</w:t>
       </w:r>
     </w:p>
@@ -16342,46 +16493,46 @@
           <w:bCs/>
           <w:lang w:eastAsia="es-CO"/>
         </w:rPr>
+        <w:t>Paso 3</w:t>
+      </w:r>
+    </w:p>
+    <w:p>
+      <w:pPr>
+        <w:pStyle w:val="Prrafodelista"/>
+        <w:spacing w:before="0" w:after="0"/>
+        <w:ind w:left="1134" w:firstLine="0"/>
+        <w:rPr>
+          <w:rFonts w:cs="Calibri"/>
+          <w:b/>
+          <w:bCs/>
+          <w:lang w:eastAsia="es-CO"/>
+        </w:rPr>
+      </w:pPr>
+      <w:r>
+        <w:rPr>
+          <w:rFonts w:cs="Calibri"/>
+          <w:b/>
+          <w:bCs/>
+          <w:lang w:eastAsia="es-CO"/>
+        </w:rPr>
+        <w:t>Preparación del producto</w:t>
+      </w:r>
+    </w:p>
+    <w:p>
+      <w:pPr>
+        <w:spacing w:before="0" w:after="0"/>
+        <w:ind w:left="1134" w:firstLine="0"/>
+        <w:rPr>
+          <w:rFonts w:cs="Calibri"/>
+          <w:lang w:eastAsia="es-CO"/>
+        </w:rPr>
+      </w:pPr>
+      <w:r>
+        <w:rPr>
+          <w:rFonts w:cs="Calibri"/>
+          <w:lang w:eastAsia="es-CO"/>
+        </w:rPr>
         <w:lastRenderedPageBreak/>
-        <w:t>Paso 3</w:t>
-      </w:r>
-    </w:p>
-    <w:p>
-      <w:pPr>
-        <w:pStyle w:val="Prrafodelista"/>
-        <w:spacing w:before="0" w:after="0"/>
-        <w:ind w:left="1134" w:firstLine="0"/>
-        <w:rPr>
-          <w:rFonts w:cs="Calibri"/>
-          <w:b/>
-          <w:bCs/>
-          <w:lang w:eastAsia="es-CO"/>
-        </w:rPr>
-      </w:pPr>
-      <w:r>
-        <w:rPr>
-          <w:rFonts w:cs="Calibri"/>
-          <w:b/>
-          <w:bCs/>
-          <w:lang w:eastAsia="es-CO"/>
-        </w:rPr>
-        <w:t>Preparación del producto</w:t>
-      </w:r>
-    </w:p>
-    <w:p>
-      <w:pPr>
-        <w:spacing w:before="0" w:after="0"/>
-        <w:ind w:left="1134" w:firstLine="0"/>
-        <w:rPr>
-          <w:rFonts w:cs="Calibri"/>
-          <w:lang w:eastAsia="es-CO"/>
-        </w:rPr>
-      </w:pPr>
-      <w:r>
-        <w:rPr>
-          <w:rFonts w:cs="Calibri"/>
-          <w:lang w:eastAsia="es-CO"/>
-        </w:rPr>
         <w:t>Se alista el pedido bajo condiciones adecuadas de manipulación, asegurando la calidad e inocuidad antes del despacho.</w:t>
       </w:r>
     </w:p>
@@ -16676,20 +16827,20 @@
           <w:rFonts w:cs="Calibri"/>
           <w:lang w:eastAsia="es-CO"/>
         </w:rPr>
+        <w:t>Durante la consulta del recurso, identifique cómo una empresa puede pasar de una idea general de entrega a un plan organizado, con decisiones claras sobre canales, tiempos, zonas de cobertura, recursos e indicadores de seguimiento.</w:t>
+      </w:r>
+    </w:p>
+    <w:p>
+      <w:pPr>
+        <w:rPr>
+          <w:lang w:eastAsia="es-CO"/>
+        </w:rPr>
+      </w:pPr>
+      <w:r>
+        <w:rPr>
+          <w:lang w:eastAsia="es-CO"/>
+        </w:rPr>
         <w:lastRenderedPageBreak/>
-        <w:t>Durante la consulta del recurso, identifique cómo una empresa puede pasar de una idea general de entrega a un plan organizado, con decisiones claras sobre canales, tiempos, zonas de cobertura, recursos e indicadores de seguimiento.</w:t>
-      </w:r>
-    </w:p>
-    <w:p>
-      <w:pPr>
-        <w:rPr>
-          <w:lang w:eastAsia="es-CO"/>
-        </w:rPr>
-      </w:pPr>
-      <w:r>
-        <w:rPr>
-          <w:lang w:eastAsia="es-CO"/>
-        </w:rPr>
         <w:t>Para complementar toda esta información</w:t>
       </w:r>
       <w:r>
@@ -16980,15 +17131,7 @@
                 <w:rFonts w:cs="Calibri"/>
                 <w:lang w:eastAsia="es-CO"/>
               </w:rPr>
-              <w:t xml:space="preserve">xactamente. El plan de distribución permite definir los canales que se usarán, las rutas de entrega, los recursos logísticos, los niveles de inventario, los tiempos de atención y los indicadores que ayudarán a evaluar el desempeño. Es </w:t>
-            </w:r>
-            <w:r>
-              <w:rPr>
-                <w:rFonts w:cs="Calibri"/>
-                <w:lang w:eastAsia="es-CO"/>
-              </w:rPr>
-              <w:lastRenderedPageBreak/>
-              <w:t>como una hoja de ruta. Si está clara, la empresa puede avanzar con más seguridad y responder mejor a las condiciones del mercado.</w:t>
+              <w:t>xactamente. El plan de distribución permite definir los canales que se usarán, las rutas de entrega, los recursos logísticos, los niveles de inventario, los tiempos de atención y los indicadores que ayudarán a evaluar el desempeño. Es como una hoja de ruta. Si está clara, la empresa puede avanzar con más seguridad y responder mejor a las condiciones del mercado.</w:t>
             </w:r>
           </w:p>
           <w:p>
@@ -17047,6 +17190,7 @@
                 <w:bCs/>
                 <w:lang w:eastAsia="es-CO"/>
               </w:rPr>
+              <w:lastRenderedPageBreak/>
               <w:t>Locutor 1:</w:t>
             </w:r>
             <w:r>
@@ -17357,15 +17501,7 @@
                 <w:rFonts w:cs="Calibri"/>
                 <w:lang w:eastAsia="es-CO"/>
               </w:rPr>
-              <w:t xml:space="preserve">sí es. Si el plan se aplica correctamente, la empresa puede entregar más rápido, reducir desplazamientos innecesarios, cuidar la calidad del producto y mejorar la satisfacción del cliente. Pero si no se tiene en cuenta, pueden </w:t>
-            </w:r>
-            <w:r>
-              <w:rPr>
-                <w:rFonts w:cs="Calibri"/>
-                <w:lang w:eastAsia="es-CO"/>
-              </w:rPr>
-              <w:lastRenderedPageBreak/>
-              <w:t>aparecer entregas tardías, errores en direcciones, aumento de costos, clientes molestos y pérdida de oportunidades de venta.</w:t>
+              <w:t>sí es. Si el plan se aplica correctamente, la empresa puede entregar más rápido, reducir desplazamientos innecesarios, cuidar la calidad del producto y mejorar la satisfacción del cliente. Pero si no se tiene en cuenta, pueden aparecer entregas tardías, errores en direcciones, aumento de costos, clientes molestos y pérdida de oportunidades de venta.</w:t>
             </w:r>
           </w:p>
           <w:p>
@@ -17424,6 +17560,7 @@
                 <w:bCs/>
                 <w:lang w:eastAsia="es-CO"/>
               </w:rPr>
+              <w:lastRenderedPageBreak/>
               <w:t>Locutor 1:</w:t>
             </w:r>
             <w:r>
@@ -17611,10 +17748,50 @@
       </w:pPr>
       <w:bookmarkStart w:id="24" w:name="_Toc236327542"/>
       <w:r>
+        <w:t>Síntesis</w:t>
+      </w:r>
+      <w:bookmarkEnd w:id="24"/>
+    </w:p>
+    <w:p>
+      <w:pPr>
+        <w:spacing w:before="0" w:after="0"/>
+        <w:ind w:firstLine="708"/>
+        <w:rPr>
+          <w:rFonts w:cs="Calibri"/>
+          <w:lang w:eastAsia="es-CO"/>
+        </w:rPr>
+      </w:pPr>
+      <w:r>
+        <w:rPr>
+          <w:rFonts w:cs="Calibri"/>
+          <w:lang w:eastAsia="es-CO"/>
+        </w:rPr>
+        <w:t xml:space="preserve">La gestión de la distribución comercial permite comprender cómo los productos llegan al cliente final de manera oportuna, eficiente y acorde con las condiciones del </w:t>
+      </w:r>
+      <w:r>
+        <w:rPr>
+          <w:rFonts w:cs="Calibri"/>
+          <w:lang w:eastAsia="es-CO"/>
+        </w:rPr>
         <w:lastRenderedPageBreak/>
-        <w:t>Síntesis</w:t>
-      </w:r>
-      <w:bookmarkEnd w:id="24"/>
+        <w:t xml:space="preserve">mercado. Para ello, se integran decisiones relacionadas con la distribución, los canales, los intermediarios, los </w:t>
+      </w:r>
+      <w:proofErr w:type="gramStart"/>
+      <w:r>
+        <w:rPr>
+          <w:rFonts w:cs="Calibri"/>
+          <w:lang w:eastAsia="es-CO"/>
+        </w:rPr>
+        <w:t>acuerdos comerciales y los formatos comerciales</w:t>
+      </w:r>
+      <w:proofErr w:type="gramEnd"/>
+      <w:r>
+        <w:rPr>
+          <w:rFonts w:cs="Calibri"/>
+          <w:lang w:eastAsia="es-CO"/>
+        </w:rPr>
+        <w:t>, elementos que orientan la forma en que una empresa organiza su presencia en el mercado y facilita el acceso del cliente al producto.</w:t>
+      </w:r>
     </w:p>
     <w:p>
       <w:pPr>
@@ -17630,7 +17807,35 @@
           <w:rFonts w:cs="Calibri"/>
           <w:lang w:eastAsia="es-CO"/>
         </w:rPr>
-        <w:t>La gestión de la distribución comercial permite comprender cómo los productos llegan al cliente final de manera oportuna, eficiente y acorde con las condiciones del mercado. Para ello, se integran decisiones relacionadas con la distribución, los canales, los intermediarios, los acuerdos comerciales y los formatos comerciales, elementos que orientan la forma en que una empresa organiza su presencia en el mercado y facilita el acceso del cliente al producto.</w:t>
+        <w:t xml:space="preserve">Asimismo, la logística y la logística inversa fortalecen la eficiencia de la distribución, al coordinar actividades como transporte, almacenamiento, manejo de pedidos, devoluciones, recuperación de productos y disposición final. Estos procesos se complementan con la gestión de inventarios, la rotación, los métodos de control, el manejo del </w:t>
+      </w:r>
+      <w:r>
+        <w:rPr>
+          <w:rStyle w:val="Extranjerismo"/>
+          <w:lang w:eastAsia="es-CO"/>
+        </w:rPr>
+        <w:t>stock</w:t>
+      </w:r>
+      <w:r>
+        <w:rPr>
+          <w:rFonts w:cs="Calibri"/>
+          <w:lang w:eastAsia="es-CO"/>
+        </w:rPr>
+        <w:t xml:space="preserve"> y el uso de </w:t>
+      </w:r>
+      <w:r>
+        <w:rPr>
+          <w:rStyle w:val="Extranjerismo"/>
+          <w:lang w:eastAsia="es-CO"/>
+        </w:rPr>
+        <w:t>software </w:t>
+      </w:r>
+      <w:r>
+        <w:rPr>
+          <w:rFonts w:cs="Calibri"/>
+          <w:lang w:eastAsia="es-CO"/>
+        </w:rPr>
+        <w:t>para georreferenciación, herramientas que apoyan la disponibilidad del producto, la reducción de costos y la toma de decisiones.</w:t>
       </w:r>
     </w:p>
     <w:p>
@@ -17647,51 +17852,6 @@
           <w:rFonts w:cs="Calibri"/>
           <w:lang w:eastAsia="es-CO"/>
         </w:rPr>
-        <w:t xml:space="preserve">Asimismo, la logística y la logística inversa fortalecen la eficiencia de la distribución, al coordinar actividades como transporte, almacenamiento, manejo de pedidos, devoluciones, recuperación de productos y disposición final. Estos procesos se complementan con la gestión de inventarios, la rotación, los métodos de control, el manejo del </w:t>
-      </w:r>
-      <w:r>
-        <w:rPr>
-          <w:rStyle w:val="Extranjerismo"/>
-          <w:lang w:eastAsia="es-CO"/>
-        </w:rPr>
-        <w:t>stock</w:t>
-      </w:r>
-      <w:r>
-        <w:rPr>
-          <w:rFonts w:cs="Calibri"/>
-          <w:lang w:eastAsia="es-CO"/>
-        </w:rPr>
-        <w:t xml:space="preserve"> y el uso de </w:t>
-      </w:r>
-      <w:r>
-        <w:rPr>
-          <w:rStyle w:val="Extranjerismo"/>
-          <w:lang w:eastAsia="es-CO"/>
-        </w:rPr>
-        <w:t>software </w:t>
-      </w:r>
-      <w:r>
-        <w:rPr>
-          <w:rFonts w:cs="Calibri"/>
-          <w:lang w:eastAsia="es-CO"/>
-        </w:rPr>
-        <w:t>para georreferenciación, herramientas que apoyan la disponibilidad del producto, la reducción de costos y la toma de decisiones.</w:t>
-      </w:r>
-    </w:p>
-    <w:p>
-      <w:pPr>
-        <w:spacing w:before="0" w:after="0"/>
-        <w:ind w:firstLine="708"/>
-        <w:rPr>
-          <w:rFonts w:cs="Calibri"/>
-          <w:lang w:eastAsia="es-CO"/>
-        </w:rPr>
-      </w:pPr>
-      <w:r>
-        <w:rPr>
-          <w:rFonts w:cs="Calibri"/>
-          <w:lang w:eastAsia="es-CO"/>
-        </w:rPr>
         <w:t>Finalmente, el plan de distribución articula los elementos estratégicos, logísticos y tecnológicos necesarios para definir canales, rutas, recursos, tiempos e indicadores de desempeño. Su correcta estructuración permite seleccionar estrategias de distribución coherentes con el mercado, optimizar la operación comercial y mejorar la experiencia del cliente en diferentes contextos empresariales.</w:t>
       </w:r>
     </w:p>
@@ -17710,7 +17870,6 @@
           <w:noProof/>
           <w:lang w:eastAsia="es-CO"/>
         </w:rPr>
-        <w:lastRenderedPageBreak/>
         <w:drawing>
           <wp:inline distT="0" distB="0" distL="0" distR="0" wp14:anchorId="328F9099" wp14:editId="2A4EED53">
             <wp:extent cx="6332220" cy="3110230"/>
@@ -17911,7 +18070,6 @@
       <w:bookmarkStart w:id="25" w:name="_Toc176443725"/>
       <w:bookmarkStart w:id="26" w:name="_Toc236327543"/>
       <w:r>
-        <w:lastRenderedPageBreak/>
         <w:t>Glosario</w:t>
       </w:r>
       <w:bookmarkEnd w:id="25"/>
@@ -18041,6 +18199,7 @@
           <w:bCs/>
           <w:lang w:eastAsia="es-CO"/>
         </w:rPr>
+        <w:lastRenderedPageBreak/>
         <w:t>Cobertura de mercado: </w:t>
       </w:r>
       <w:r>
@@ -18230,169 +18389,169 @@
           <w:bCs/>
           <w:lang w:eastAsia="es-CO"/>
         </w:rPr>
+        <w:t>Logística: </w:t>
+      </w:r>
+      <w:r>
+        <w:rPr>
+          <w:rFonts w:cs="Calibri"/>
+          <w:bCs/>
+          <w:lang w:eastAsia="es-CO"/>
+        </w:rPr>
+        <w:t>gestión del flujo de productos, información y recursos desde el origen hasta el consumidor final.</w:t>
+      </w:r>
+    </w:p>
+    <w:p>
+      <w:pPr>
+        <w:spacing w:before="0" w:after="0"/>
+        <w:rPr>
+          <w:rFonts w:cs="Calibri"/>
+          <w:bCs/>
+          <w:lang w:eastAsia="es-CO"/>
+        </w:rPr>
+      </w:pPr>
+      <w:r>
+        <w:rPr>
+          <w:rFonts w:cs="Calibri"/>
+          <w:b/>
+          <w:bCs/>
+          <w:lang w:eastAsia="es-CO"/>
+        </w:rPr>
+        <w:t>Logística inversa: </w:t>
+      </w:r>
+      <w:r>
+        <w:rPr>
+          <w:rFonts w:cs="Calibri"/>
+          <w:bCs/>
+          <w:lang w:eastAsia="es-CO"/>
+        </w:rPr>
+        <w:t>proceso de retorno de productos hacia la empresa para devolución, reutilización, recuperación, reciclaje o disposición final.</w:t>
+      </w:r>
+    </w:p>
+    <w:p>
+      <w:pPr>
+        <w:spacing w:before="0" w:after="0"/>
+        <w:rPr>
+          <w:rFonts w:cs="Calibri"/>
+          <w:bCs/>
+          <w:lang w:eastAsia="es-CO"/>
+        </w:rPr>
+      </w:pPr>
+      <w:r>
+        <w:rPr>
+          <w:rFonts w:cs="Calibri"/>
+          <w:b/>
+          <w:bCs/>
+          <w:lang w:eastAsia="es-CO"/>
+        </w:rPr>
+        <w:t>Mayorista: </w:t>
+      </w:r>
+      <w:r>
+        <w:rPr>
+          <w:rFonts w:cs="Calibri"/>
+          <w:bCs/>
+          <w:lang w:eastAsia="es-CO"/>
+        </w:rPr>
+        <w:t>intermediario que compra grandes volúmenes de productos para venderlos a minoristas, empresas o distribuidores.</w:t>
+      </w:r>
+    </w:p>
+    <w:p>
+      <w:pPr>
+        <w:spacing w:before="0" w:after="0"/>
+        <w:rPr>
+          <w:rFonts w:cs="Calibri"/>
+          <w:bCs/>
+          <w:lang w:eastAsia="es-CO"/>
+        </w:rPr>
+      </w:pPr>
+      <w:r>
+        <w:rPr>
+          <w:rFonts w:cs="Calibri"/>
+          <w:b/>
+          <w:bCs/>
+          <w:lang w:eastAsia="es-CO"/>
+        </w:rPr>
+        <w:t>Minorista: </w:t>
+      </w:r>
+      <w:r>
+        <w:rPr>
+          <w:rFonts w:cs="Calibri"/>
+          <w:bCs/>
+          <w:lang w:eastAsia="es-CO"/>
+        </w:rPr>
+        <w:t>intermediario que vende productos directamente al consumidor final.</w:t>
+      </w:r>
+    </w:p>
+    <w:p>
+      <w:pPr>
+        <w:spacing w:before="0" w:after="0"/>
+        <w:rPr>
+          <w:rFonts w:cs="Calibri"/>
+          <w:bCs/>
+          <w:lang w:eastAsia="es-CO"/>
+        </w:rPr>
+      </w:pPr>
+      <w:r>
+        <w:rPr>
+          <w:rFonts w:cs="Calibri"/>
+          <w:b/>
+          <w:bCs/>
+          <w:lang w:eastAsia="es-CO"/>
+        </w:rPr>
+        <w:t>Plan de distribución: </w:t>
+      </w:r>
+      <w:r>
+        <w:rPr>
+          <w:rFonts w:cs="Calibri"/>
+          <w:bCs/>
+          <w:lang w:eastAsia="es-CO"/>
+        </w:rPr>
+        <w:t>documento que organiza las acciones, recursos, canales, rutas e indicadores necesarios para llevar los productos al mercado.</w:t>
+      </w:r>
+    </w:p>
+    <w:p>
+      <w:pPr>
+        <w:spacing w:before="0" w:after="0"/>
+        <w:rPr>
+          <w:rFonts w:cs="Calibri"/>
+          <w:bCs/>
+          <w:lang w:eastAsia="es-CO"/>
+        </w:rPr>
+      </w:pPr>
+      <w:r>
+        <w:rPr>
+          <w:rFonts w:cs="Calibri"/>
+          <w:b/>
+          <w:bCs/>
+          <w:lang w:eastAsia="es-CO"/>
+        </w:rPr>
+        <w:t>Punto de entrega: </w:t>
+      </w:r>
+      <w:r>
+        <w:rPr>
+          <w:rFonts w:cs="Calibri"/>
+          <w:bCs/>
+          <w:lang w:eastAsia="es-CO"/>
+        </w:rPr>
+        <w:t>lugar donde el producto es recibido por el cliente o intermediario.</w:t>
+      </w:r>
+    </w:p>
+    <w:p>
+      <w:pPr>
+        <w:spacing w:before="0" w:after="0"/>
+        <w:rPr>
+          <w:rFonts w:cs="Calibri"/>
+          <w:bCs/>
+          <w:lang w:eastAsia="es-CO"/>
+        </w:rPr>
+      </w:pPr>
+      <w:r>
+        <w:rPr>
+          <w:rFonts w:cs="Calibri"/>
+          <w:b/>
+          <w:bCs/>
+          <w:lang w:eastAsia="es-CO"/>
+        </w:rPr>
         <w:lastRenderedPageBreak/>
-        <w:t>Logística: </w:t>
-      </w:r>
-      <w:r>
-        <w:rPr>
-          <w:rFonts w:cs="Calibri"/>
-          <w:bCs/>
-          <w:lang w:eastAsia="es-CO"/>
-        </w:rPr>
-        <w:t>gestión del flujo de productos, información y recursos desde el origen hasta el consumidor final.</w:t>
-      </w:r>
-    </w:p>
-    <w:p>
-      <w:pPr>
-        <w:spacing w:before="0" w:after="0"/>
-        <w:rPr>
-          <w:rFonts w:cs="Calibri"/>
-          <w:bCs/>
-          <w:lang w:eastAsia="es-CO"/>
-        </w:rPr>
-      </w:pPr>
-      <w:r>
-        <w:rPr>
-          <w:rFonts w:cs="Calibri"/>
-          <w:b/>
-          <w:bCs/>
-          <w:lang w:eastAsia="es-CO"/>
-        </w:rPr>
-        <w:t>Logística inversa: </w:t>
-      </w:r>
-      <w:r>
-        <w:rPr>
-          <w:rFonts w:cs="Calibri"/>
-          <w:bCs/>
-          <w:lang w:eastAsia="es-CO"/>
-        </w:rPr>
-        <w:t>proceso de retorno de productos hacia la empresa para devolución, reutilización, recuperación, reciclaje o disposición final.</w:t>
-      </w:r>
-    </w:p>
-    <w:p>
-      <w:pPr>
-        <w:spacing w:before="0" w:after="0"/>
-        <w:rPr>
-          <w:rFonts w:cs="Calibri"/>
-          <w:bCs/>
-          <w:lang w:eastAsia="es-CO"/>
-        </w:rPr>
-      </w:pPr>
-      <w:r>
-        <w:rPr>
-          <w:rFonts w:cs="Calibri"/>
-          <w:b/>
-          <w:bCs/>
-          <w:lang w:eastAsia="es-CO"/>
-        </w:rPr>
-        <w:t>Mayorista: </w:t>
-      </w:r>
-      <w:r>
-        <w:rPr>
-          <w:rFonts w:cs="Calibri"/>
-          <w:bCs/>
-          <w:lang w:eastAsia="es-CO"/>
-        </w:rPr>
-        <w:t>intermediario que compra grandes volúmenes de productos para venderlos a minoristas, empresas o distribuidores.</w:t>
-      </w:r>
-    </w:p>
-    <w:p>
-      <w:pPr>
-        <w:spacing w:before="0" w:after="0"/>
-        <w:rPr>
-          <w:rFonts w:cs="Calibri"/>
-          <w:bCs/>
-          <w:lang w:eastAsia="es-CO"/>
-        </w:rPr>
-      </w:pPr>
-      <w:r>
-        <w:rPr>
-          <w:rFonts w:cs="Calibri"/>
-          <w:b/>
-          <w:bCs/>
-          <w:lang w:eastAsia="es-CO"/>
-        </w:rPr>
-        <w:t>Minorista: </w:t>
-      </w:r>
-      <w:r>
-        <w:rPr>
-          <w:rFonts w:cs="Calibri"/>
-          <w:bCs/>
-          <w:lang w:eastAsia="es-CO"/>
-        </w:rPr>
-        <w:t>intermediario que vende productos directamente al consumidor final.</w:t>
-      </w:r>
-    </w:p>
-    <w:p>
-      <w:pPr>
-        <w:spacing w:before="0" w:after="0"/>
-        <w:rPr>
-          <w:rFonts w:cs="Calibri"/>
-          <w:bCs/>
-          <w:lang w:eastAsia="es-CO"/>
-        </w:rPr>
-      </w:pPr>
-      <w:r>
-        <w:rPr>
-          <w:rFonts w:cs="Calibri"/>
-          <w:b/>
-          <w:bCs/>
-          <w:lang w:eastAsia="es-CO"/>
-        </w:rPr>
-        <w:t>Plan de distribución: </w:t>
-      </w:r>
-      <w:r>
-        <w:rPr>
-          <w:rFonts w:cs="Calibri"/>
-          <w:bCs/>
-          <w:lang w:eastAsia="es-CO"/>
-        </w:rPr>
-        <w:t>documento que organiza las acciones, recursos, canales, rutas e indicadores necesarios para llevar los productos al mercado.</w:t>
-      </w:r>
-    </w:p>
-    <w:p>
-      <w:pPr>
-        <w:spacing w:before="0" w:after="0"/>
-        <w:rPr>
-          <w:rFonts w:cs="Calibri"/>
-          <w:bCs/>
-          <w:lang w:eastAsia="es-CO"/>
-        </w:rPr>
-      </w:pPr>
-      <w:r>
-        <w:rPr>
-          <w:rFonts w:cs="Calibri"/>
-          <w:b/>
-          <w:bCs/>
-          <w:lang w:eastAsia="es-CO"/>
-        </w:rPr>
-        <w:t>Punto de entrega: </w:t>
-      </w:r>
-      <w:r>
-        <w:rPr>
-          <w:rFonts w:cs="Calibri"/>
-          <w:bCs/>
-          <w:lang w:eastAsia="es-CO"/>
-        </w:rPr>
-        <w:t>lugar donde el producto es recibido por el cliente o intermediario.</w:t>
-      </w:r>
-    </w:p>
-    <w:p>
-      <w:pPr>
-        <w:spacing w:before="0" w:after="0"/>
-        <w:rPr>
-          <w:rFonts w:cs="Calibri"/>
-          <w:bCs/>
-          <w:lang w:eastAsia="es-CO"/>
-        </w:rPr>
-      </w:pPr>
-      <w:r>
-        <w:rPr>
-          <w:rFonts w:cs="Calibri"/>
-          <w:b/>
-          <w:bCs/>
-          <w:lang w:eastAsia="es-CO"/>
-        </w:rPr>
         <w:t>Rotación de inventario: </w:t>
       </w:r>
       <w:r>
@@ -18554,7 +18713,6 @@
       <w:bookmarkStart w:id="27" w:name="_Toc176443726"/>
       <w:bookmarkStart w:id="28" w:name="_Toc236327544"/>
       <w:r>
-        <w:lastRenderedPageBreak/>
         <w:t>Referencias bibliográficas</w:t>
       </w:r>
       <w:bookmarkEnd w:id="27"/>
@@ -18664,12 +18822,21 @@
           <w:lang w:eastAsia="es-CO"/>
         </w:rPr>
       </w:pPr>
-      <w:r>
-        <w:rPr>
-          <w:rFonts w:cs="Calibri"/>
-          <w:lang w:eastAsia="es-CO"/>
-        </w:rPr>
-        <w:t>Esri. (2023). </w:t>
+      <w:proofErr w:type="spellStart"/>
+      <w:r>
+        <w:rPr>
+          <w:rFonts w:cs="Calibri"/>
+          <w:lang w:eastAsia="es-CO"/>
+        </w:rPr>
+        <w:t>Esri</w:t>
+      </w:r>
+      <w:proofErr w:type="spellEnd"/>
+      <w:r>
+        <w:rPr>
+          <w:rFonts w:cs="Calibri"/>
+          <w:lang w:eastAsia="es-CO"/>
+        </w:rPr>
+        <w:t>. (2023). </w:t>
       </w:r>
       <w:r>
         <w:rPr>
@@ -18733,6 +18900,7 @@
           <w:rFonts w:cs="Calibri"/>
           <w:lang w:eastAsia="es-CO"/>
         </w:rPr>
+        <w:lastRenderedPageBreak/>
         <w:t>Kotler, P., &amp; Keller, K. L. (2016). </w:t>
       </w:r>
       <w:r>
@@ -18813,7 +18981,23 @@
           <w:rFonts w:cs="Calibri"/>
           <w:lang w:eastAsia="es-CO"/>
         </w:rPr>
-        <w:t>. Ecoe Ediciones.</w:t>
+        <w:t xml:space="preserve">. </w:t>
+      </w:r>
+      <w:proofErr w:type="spellStart"/>
+      <w:r>
+        <w:rPr>
+          <w:rFonts w:cs="Calibri"/>
+          <w:lang w:eastAsia="es-CO"/>
+        </w:rPr>
+        <w:t>Ecoe</w:t>
+      </w:r>
+      <w:proofErr w:type="spellEnd"/>
+      <w:r>
+        <w:rPr>
+          <w:rFonts w:cs="Calibri"/>
+          <w:lang w:eastAsia="es-CO"/>
+        </w:rPr>
+        <w:t xml:space="preserve"> Ediciones.</w:t>
       </w:r>
     </w:p>
     <w:p>
@@ -18888,12 +19072,21 @@
           <w:lang w:eastAsia="es-CO"/>
         </w:rPr>
       </w:pPr>
-      <w:r>
-        <w:rPr>
-          <w:rFonts w:cs="Calibri"/>
-          <w:lang w:eastAsia="es-CO"/>
-        </w:rPr>
-        <w:t>Soret, I. (2013). </w:t>
+      <w:proofErr w:type="spellStart"/>
+      <w:r>
+        <w:rPr>
+          <w:rFonts w:cs="Calibri"/>
+          <w:lang w:eastAsia="es-CO"/>
+        </w:rPr>
+        <w:t>Soret</w:t>
+      </w:r>
+      <w:proofErr w:type="spellEnd"/>
+      <w:r>
+        <w:rPr>
+          <w:rFonts w:cs="Calibri"/>
+          <w:lang w:eastAsia="es-CO"/>
+        </w:rPr>
+        <w:t>, I. (2013). </w:t>
       </w:r>
       <w:r>
         <w:rPr>
@@ -18978,7 +19171,6 @@
       <w:bookmarkStart w:id="29" w:name="_Toc176443727"/>
       <w:bookmarkStart w:id="30" w:name="_Toc236327545"/>
       <w:r>
-        <w:lastRenderedPageBreak/>
         <w:t>Créditos</w:t>
       </w:r>
       <w:bookmarkEnd w:id="29"/>
@@ -19265,6 +19457,7 @@
                 <w:sz w:val="28"/>
                 <w:szCs w:val="28"/>
               </w:rPr>
+              <w:lastRenderedPageBreak/>
               <w:t>Mario Morales Cabrera</w:t>
             </w:r>
           </w:p>
@@ -19762,7 +19955,7 @@
 </file>
 
 <file path=word/endnotes.xml><?xml version="1.0" encoding="utf-8"?>
-<w:endnotes xmlns:wpc="http://schemas.microsoft.com/office/word/2010/wordprocessingCanvas" xmlns:cx="http://schemas.microsoft.com/office/drawing/2014/chartex" xmlns:cx1="http://schemas.microsoft.com/office/drawing/2015/9/8/chartex" xmlns:cx2="http://schemas.microsoft.com/office/drawing/2015/10/21/chartex" xmlns:cx3="http://schemas.microsoft.com/office/drawing/2016/5/9/chartex" xmlns:cx4="http://schemas.microsoft.com/office/drawing/2016/5/10/chartex" xmlns:cx5="http://schemas.microsoft.com/office/drawing/2016/5/11/chartex" xmlns:cx6="http://schemas.microsoft.com/office/drawing/2016/5/12/chartex" xmlns:cx7="http://schemas.microsoft.com/office/drawing/2016/5/13/chartex" xmlns:cx8="http://schemas.microsoft.com/office/drawing/2016/5/14/chartex" xmlns:mc="http://schemas.openxmlformats.org/markup-compatibility/2006" xmlns:aink="http://schemas.microsoft.com/office/drawing/2016/ink" xmlns:am3d="http://schemas.microsoft.com/office/drawing/2017/model3d" xmlns:o="urn:schemas-microsoft-com:office:office" xmlns:oel="http://schemas.microsoft.com/office/2019/extlst" xmlns:r="http://schemas.openxmlformats.org/officeDocument/2006/relationships" xmlns:m="http://schemas.openxmlformats.org/officeDocument/2006/math" xmlns:v="urn:schemas-microsoft-com:vml" xmlns:wp14="http://schemas.microsoft.com/office/word/2010/wordprocessingDrawing" xmlns:wp="http://schemas.openxmlformats.org/drawingml/2006/wordprocessingDrawing" xmlns:w10="urn:schemas-microsoft-com:office:word" xmlns:w="http://schemas.openxmlformats.org/wordprocessingml/2006/main" xmlns:w14="http://schemas.microsoft.com/office/word/2010/wordml" xmlns:w15="http://schemas.microsoft.com/office/word/2012/wordml" xmlns:w16cei="http://schemas.microsoft.com/office/word/2026/wordml/cei" xmlns:w16cex="http://schemas.microsoft.com/office/word/2018/wordml/cex" xmlns:w16cid="http://schemas.microsoft.com/office/word/2016/wordml/cid" xmlns:w16="http://schemas.microsoft.com/office/word/2018/wordml" xmlns:w16du="http://schemas.microsoft.com/office/word/2023/wordml/word16du" xmlns:w16sdtdh="http://schemas.microsoft.com/office/word/2020/wordml/sdtdatahash" xmlns:w16sdtfl="http://schemas.microsoft.com/office/word/2024/wordml/sdtformatlock" xmlns:w16se="http://schemas.microsoft.com/office/word/2015/wordml/symex" xmlns:wpg="http://schemas.microsoft.com/office/word/2010/wordprocessingGroup" xmlns:wpi="http://schemas.microsoft.com/office/word/2010/wordprocessingInk" xmlns:wne="http://schemas.microsoft.com/office/word/2006/wordml" xmlns:wps="http://schemas.microsoft.com/office/word/2010/wordprocessingShape" mc:Ignorable="w14 w15 w16se w16cid w16 w16cex w16sdtdh w16sdtfl w16du wp14">
+<w:endnotes xmlns:wpc="http://schemas.microsoft.com/office/word/2010/wordprocessingCanvas" xmlns:cx="http://schemas.microsoft.com/office/drawing/2014/chartex" xmlns:cx1="http://schemas.microsoft.com/office/drawing/2015/9/8/chartex" xmlns:cx2="http://schemas.microsoft.com/office/drawing/2015/10/21/chartex" xmlns:cx3="http://schemas.microsoft.com/office/drawing/2016/5/9/chartex" xmlns:cx4="http://schemas.microsoft.com/office/drawing/2016/5/10/chartex" xmlns:cx5="http://schemas.microsoft.com/office/drawing/2016/5/11/chartex" xmlns:cx6="http://schemas.microsoft.com/office/drawing/2016/5/12/chartex" xmlns:cx7="http://schemas.microsoft.com/office/drawing/2016/5/13/chartex" xmlns:cx8="http://schemas.microsoft.com/office/drawing/2016/5/14/chartex" xmlns:mc="http://schemas.openxmlformats.org/markup-compatibility/2006" xmlns:aink="http://schemas.microsoft.com/office/drawing/2016/ink" xmlns:am3d="http://schemas.microsoft.com/office/drawing/2017/model3d" xmlns:o="urn:schemas-microsoft-com:office:office" xmlns:oel="http://schemas.microsoft.com/office/2019/extlst" xmlns:r="http://schemas.openxmlformats.org/officeDocument/2006/relationships" xmlns:m="http://schemas.openxmlformats.org/officeDocument/2006/math" xmlns:v="urn:schemas-microsoft-com:vml" xmlns:wp14="http://schemas.microsoft.com/office/word/2010/wordprocessingDrawing" xmlns:wp="http://schemas.openxmlformats.org/drawingml/2006/wordprocessingDrawing" xmlns:w10="urn:schemas-microsoft-com:office:word" xmlns:w="http://schemas.openxmlformats.org/wordprocessingml/2006/main" xmlns:w14="http://schemas.microsoft.com/office/word/2010/wordml" xmlns:w15="http://schemas.microsoft.com/office/word/2012/wordml" xmlns:w16cex="http://schemas.microsoft.com/office/word/2018/wordml/cex" xmlns:w16cid="http://schemas.microsoft.com/office/word/2016/wordml/cid" xmlns:w16="http://schemas.microsoft.com/office/word/2018/wordml" xmlns:w16du="http://schemas.microsoft.com/office/word/2023/wordml/word16du" xmlns:w16sdtdh="http://schemas.microsoft.com/office/word/2020/wordml/sdtdatahash" xmlns:w16sdtfl="http://schemas.microsoft.com/office/word/2024/wordml/sdtformatlock" xmlns:w16se="http://schemas.microsoft.com/office/word/2015/wordml/symex" xmlns:wpg="http://schemas.microsoft.com/office/word/2010/wordprocessingGroup" xmlns:wpi="http://schemas.microsoft.com/office/word/2010/wordprocessingInk" xmlns:wne="http://schemas.microsoft.com/office/word/2006/wordml" xmlns:wps="http://schemas.microsoft.com/office/word/2010/wordprocessingShape" mc:Ignorable="w14 w15 w16se w16cid w16 w16cex w16sdtdh w16sdtfl w16du wp14">
   <w:endnote w:type="separator" w:id="-1">
     <w:p>
       <w:pPr>
@@ -19787,7 +19980,7 @@
 </file>
 
 <file path=word/footer1.xml><?xml version="1.0" encoding="utf-8"?>
-<w:ftr xmlns:wpc="http://schemas.microsoft.com/office/word/2010/wordprocessingCanvas" xmlns:cx="http://schemas.microsoft.com/office/drawing/2014/chartex" xmlns:cx1="http://schemas.microsoft.com/office/drawing/2015/9/8/chartex" xmlns:cx2="http://schemas.microsoft.com/office/drawing/2015/10/21/chartex" xmlns:cx3="http://schemas.microsoft.com/office/drawing/2016/5/9/chartex" xmlns:cx4="http://schemas.microsoft.com/office/drawing/2016/5/10/chartex" xmlns:cx5="http://schemas.microsoft.com/office/drawing/2016/5/11/chartex" xmlns:cx6="http://schemas.microsoft.com/office/drawing/2016/5/12/chartex" xmlns:cx7="http://schemas.microsoft.com/office/drawing/2016/5/13/chartex" xmlns:cx8="http://schemas.microsoft.com/office/drawing/2016/5/14/chartex" xmlns:mc="http://schemas.openxmlformats.org/markup-compatibility/2006" xmlns:aink="http://schemas.microsoft.com/office/drawing/2016/ink" xmlns:am3d="http://schemas.microsoft.com/office/drawing/2017/model3d" xmlns:o="urn:schemas-microsoft-com:office:office" xmlns:oel="http://schemas.microsoft.com/office/2019/extlst" xmlns:r="http://schemas.openxmlformats.org/officeDocument/2006/relationships" xmlns:m="http://schemas.openxmlformats.org/officeDocument/2006/math" xmlns:v="urn:schemas-microsoft-com:vml" xmlns:wp14="http://schemas.microsoft.com/office/word/2010/wordprocessingDrawing" xmlns:wp="http://schemas.openxmlformats.org/drawingml/2006/wordprocessingDrawing" xmlns:w10="urn:schemas-microsoft-com:office:word" xmlns:w="http://schemas.openxmlformats.org/wordprocessingml/2006/main" xmlns:w14="http://schemas.microsoft.com/office/word/2010/wordml" xmlns:w15="http://schemas.microsoft.com/office/word/2012/wordml" xmlns:w16cei="http://schemas.microsoft.com/office/word/2026/wordml/cei" xmlns:w16cex="http://schemas.microsoft.com/office/word/2018/wordml/cex" xmlns:w16cid="http://schemas.microsoft.com/office/word/2016/wordml/cid" xmlns:w16="http://schemas.microsoft.com/office/word/2018/wordml" xmlns:w16du="http://schemas.microsoft.com/office/word/2023/wordml/word16du" xmlns:w16sdtdh="http://schemas.microsoft.com/office/word/2020/wordml/sdtdatahash" xmlns:w16sdtfl="http://schemas.microsoft.com/office/word/2024/wordml/sdtformatlock" xmlns:w16se="http://schemas.microsoft.com/office/word/2015/wordml/symex" xmlns:wpg="http://schemas.microsoft.com/office/word/2010/wordprocessingGroup" xmlns:wpi="http://schemas.microsoft.com/office/word/2010/wordprocessingInk" xmlns:wne="http://schemas.microsoft.com/office/word/2006/wordml" xmlns:wps="http://schemas.microsoft.com/office/word/2010/wordprocessingShape" mc:Ignorable="w14 w15 w16se w16cid w16 w16cex w16sdtdh w16sdtfl w16du wp14">
+<w:ftr xmlns:wpc="http://schemas.microsoft.com/office/word/2010/wordprocessingCanvas" xmlns:cx="http://schemas.microsoft.com/office/drawing/2014/chartex" xmlns:cx1="http://schemas.microsoft.com/office/drawing/2015/9/8/chartex" xmlns:cx2="http://schemas.microsoft.com/office/drawing/2015/10/21/chartex" xmlns:cx3="http://schemas.microsoft.com/office/drawing/2016/5/9/chartex" xmlns:cx4="http://schemas.microsoft.com/office/drawing/2016/5/10/chartex" xmlns:cx5="http://schemas.microsoft.com/office/drawing/2016/5/11/chartex" xmlns:cx6="http://schemas.microsoft.com/office/drawing/2016/5/12/chartex" xmlns:cx7="http://schemas.microsoft.com/office/drawing/2016/5/13/chartex" xmlns:cx8="http://schemas.microsoft.com/office/drawing/2016/5/14/chartex" xmlns:mc="http://schemas.openxmlformats.org/markup-compatibility/2006" xmlns:aink="http://schemas.microsoft.com/office/drawing/2016/ink" xmlns:am3d="http://schemas.microsoft.com/office/drawing/2017/model3d" xmlns:o="urn:schemas-microsoft-com:office:office" xmlns:oel="http://schemas.microsoft.com/office/2019/extlst" xmlns:r="http://schemas.openxmlformats.org/officeDocument/2006/relationships" xmlns:m="http://schemas.openxmlformats.org/officeDocument/2006/math" xmlns:v="urn:schemas-microsoft-com:vml" xmlns:wp14="http://schemas.microsoft.com/office/word/2010/wordprocessingDrawing" xmlns:wp="http://schemas.openxmlformats.org/drawingml/2006/wordprocessingDrawing" xmlns:w10="urn:schemas-microsoft-com:office:word" xmlns:w="http://schemas.openxmlformats.org/wordprocessingml/2006/main" xmlns:w14="http://schemas.microsoft.com/office/word/2010/wordml" xmlns:w15="http://schemas.microsoft.com/office/word/2012/wordml" xmlns:w16cex="http://schemas.microsoft.com/office/word/2018/wordml/cex" xmlns:w16cid="http://schemas.microsoft.com/office/word/2016/wordml/cid" xmlns:w16="http://schemas.microsoft.com/office/word/2018/wordml" xmlns:w16du="http://schemas.microsoft.com/office/word/2023/wordml/word16du" xmlns:w16sdtdh="http://schemas.microsoft.com/office/word/2020/wordml/sdtdatahash" xmlns:w16sdtfl="http://schemas.microsoft.com/office/word/2024/wordml/sdtformatlock" xmlns:w16se="http://schemas.microsoft.com/office/word/2015/wordml/symex" xmlns:wpg="http://schemas.microsoft.com/office/word/2010/wordprocessingGroup" xmlns:wpi="http://schemas.microsoft.com/office/word/2010/wordprocessingInk" xmlns:wne="http://schemas.microsoft.com/office/word/2006/wordml" xmlns:wps="http://schemas.microsoft.com/office/word/2010/wordprocessingShape" mc:Ignorable="w14 w15 w16se w16cid w16 w16cex w16sdtdh w16sdtfl w16du wp14">
   <w:p>
     <w:pPr>
       <w:pStyle w:val="Piedepgina"/>
@@ -19923,7 +20116,7 @@
 </file>
 
 <file path=word/footnotes.xml><?xml version="1.0" encoding="utf-8"?>
-<w:footnotes xmlns:wpc="http://schemas.microsoft.com/office/word/2010/wordprocessingCanvas" xmlns:cx="http://schemas.microsoft.com/office/drawing/2014/chartex" xmlns:cx1="http://schemas.microsoft.com/office/drawing/2015/9/8/chartex" xmlns:cx2="http://schemas.microsoft.com/office/drawing/2015/10/21/chartex" xmlns:cx3="http://schemas.microsoft.com/office/drawing/2016/5/9/chartex" xmlns:cx4="http://schemas.microsoft.com/office/drawing/2016/5/10/chartex" xmlns:cx5="http://schemas.microsoft.com/office/drawing/2016/5/11/chartex" xmlns:cx6="http://schemas.microsoft.com/office/drawing/2016/5/12/chartex" xmlns:cx7="http://schemas.microsoft.com/office/drawing/2016/5/13/chartex" xmlns:cx8="http://schemas.microsoft.com/office/drawing/2016/5/14/chartex" xmlns:mc="http://schemas.openxmlformats.org/markup-compatibility/2006" xmlns:aink="http://schemas.microsoft.com/office/drawing/2016/ink" xmlns:am3d="http://schemas.microsoft.com/office/drawing/2017/model3d" xmlns:o="urn:schemas-microsoft-com:office:office" xmlns:oel="http://schemas.microsoft.com/office/2019/extlst" xmlns:r="http://schemas.openxmlformats.org/officeDocument/2006/relationships" xmlns:m="http://schemas.openxmlformats.org/officeDocument/2006/math" xmlns:v="urn:schemas-microsoft-com:vml" xmlns:wp14="http://schemas.microsoft.com/office/word/2010/wordprocessingDrawing" xmlns:wp="http://schemas.openxmlformats.org/drawingml/2006/wordprocessingDrawing" xmlns:w10="urn:schemas-microsoft-com:office:word" xmlns:w="http://schemas.openxmlformats.org/wordprocessingml/2006/main" xmlns:w14="http://schemas.microsoft.com/office/word/2010/wordml" xmlns:w15="http://schemas.microsoft.com/office/word/2012/wordml" xmlns:w16cei="http://schemas.microsoft.com/office/word/2026/wordml/cei" xmlns:w16cex="http://schemas.microsoft.com/office/word/2018/wordml/cex" xmlns:w16cid="http://schemas.microsoft.com/office/word/2016/wordml/cid" xmlns:w16="http://schemas.microsoft.com/office/word/2018/wordml" xmlns:w16du="http://schemas.microsoft.com/office/word/2023/wordml/word16du" xmlns:w16sdtdh="http://schemas.microsoft.com/office/word/2020/wordml/sdtdatahash" xmlns:w16sdtfl="http://schemas.microsoft.com/office/word/2024/wordml/sdtformatlock" xmlns:w16se="http://schemas.microsoft.com/office/word/2015/wordml/symex" xmlns:wpg="http://schemas.microsoft.com/office/word/2010/wordprocessingGroup" xmlns:wpi="http://schemas.microsoft.com/office/word/2010/wordprocessingInk" xmlns:wne="http://schemas.microsoft.com/office/word/2006/wordml" xmlns:wps="http://schemas.microsoft.com/office/word/2010/wordprocessingShape" mc:Ignorable="w14 w15 w16se w16cid w16 w16cex w16sdtdh w16sdtfl w16du wp14">
+<w:footnotes xmlns:wpc="http://schemas.microsoft.com/office/word/2010/wordprocessingCanvas" xmlns:cx="http://schemas.microsoft.com/office/drawing/2014/chartex" xmlns:cx1="http://schemas.microsoft.com/office/drawing/2015/9/8/chartex" xmlns:cx2="http://schemas.microsoft.com/office/drawing/2015/10/21/chartex" xmlns:cx3="http://schemas.microsoft.com/office/drawing/2016/5/9/chartex" xmlns:cx4="http://schemas.microsoft.com/office/drawing/2016/5/10/chartex" xmlns:cx5="http://schemas.microsoft.com/office/drawing/2016/5/11/chartex" xmlns:cx6="http://schemas.microsoft.com/office/drawing/2016/5/12/chartex" xmlns:cx7="http://schemas.microsoft.com/office/drawing/2016/5/13/chartex" xmlns:cx8="http://schemas.microsoft.com/office/drawing/2016/5/14/chartex" xmlns:mc="http://schemas.openxmlformats.org/markup-compatibility/2006" xmlns:aink="http://schemas.microsoft.com/office/drawing/2016/ink" xmlns:am3d="http://schemas.microsoft.com/office/drawing/2017/model3d" xmlns:o="urn:schemas-microsoft-com:office:office" xmlns:oel="http://schemas.microsoft.com/office/2019/extlst" xmlns:r="http://schemas.openxmlformats.org/officeDocument/2006/relationships" xmlns:m="http://schemas.openxmlformats.org/officeDocument/2006/math" xmlns:v="urn:schemas-microsoft-com:vml" xmlns:wp14="http://schemas.microsoft.com/office/word/2010/wordprocessingDrawing" xmlns:wp="http://schemas.openxmlformats.org/drawingml/2006/wordprocessingDrawing" xmlns:w10="urn:schemas-microsoft-com:office:word" xmlns:w="http://schemas.openxmlformats.org/wordprocessingml/2006/main" xmlns:w14="http://schemas.microsoft.com/office/word/2010/wordml" xmlns:w15="http://schemas.microsoft.com/office/word/2012/wordml" xmlns:w16cex="http://schemas.microsoft.com/office/word/2018/wordml/cex" xmlns:w16cid="http://schemas.microsoft.com/office/word/2016/wordml/cid" xmlns:w16="http://schemas.microsoft.com/office/word/2018/wordml" xmlns:w16du="http://schemas.microsoft.com/office/word/2023/wordml/word16du" xmlns:w16sdtdh="http://schemas.microsoft.com/office/word/2020/wordml/sdtdatahash" xmlns:w16sdtfl="http://schemas.microsoft.com/office/word/2024/wordml/sdtformatlock" xmlns:w16se="http://schemas.microsoft.com/office/word/2015/wordml/symex" xmlns:wpg="http://schemas.microsoft.com/office/word/2010/wordprocessingGroup" xmlns:wpi="http://schemas.microsoft.com/office/word/2010/wordprocessingInk" xmlns:wne="http://schemas.microsoft.com/office/word/2006/wordml" xmlns:wps="http://schemas.microsoft.com/office/word/2010/wordprocessingShape" mc:Ignorable="w14 w15 w16se w16cid w16 w16cex w16sdtdh w16sdtfl w16du wp14">
   <w:footnote w:type="separator" w:id="-1">
     <w:p>
       <w:pPr>
@@ -19948,7 +20141,7 @@
 </file>
 
 <file path=word/header1.xml><?xml version="1.0" encoding="utf-8"?>
-<w:hdr xmlns:wpc="http://schemas.microsoft.com/office/word/2010/wordprocessingCanvas" xmlns:cx="http://schemas.microsoft.com/office/drawing/2014/chartex" xmlns:cx1="http://schemas.microsoft.com/office/drawing/2015/9/8/chartex" xmlns:cx2="http://schemas.microsoft.com/office/drawing/2015/10/21/chartex" xmlns:cx3="http://schemas.microsoft.com/office/drawing/2016/5/9/chartex" xmlns:cx4="http://schemas.microsoft.com/office/drawing/2016/5/10/chartex" xmlns:cx5="http://schemas.microsoft.com/office/drawing/2016/5/11/chartex" xmlns:cx6="http://schemas.microsoft.com/office/drawing/2016/5/12/chartex" xmlns:cx7="http://schemas.microsoft.com/office/drawing/2016/5/13/chartex" xmlns:cx8="http://schemas.microsoft.com/office/drawing/2016/5/14/chartex" xmlns:mc="http://schemas.openxmlformats.org/markup-compatibility/2006" xmlns:aink="http://schemas.microsoft.com/office/drawing/2016/ink" xmlns:am3d="http://schemas.microsoft.com/office/drawing/2017/model3d" xmlns:o="urn:schemas-microsoft-com:office:office" xmlns:oel="http://schemas.microsoft.com/office/2019/extlst" xmlns:r="http://schemas.openxmlformats.org/officeDocument/2006/relationships" xmlns:m="http://schemas.openxmlformats.org/officeDocument/2006/math" xmlns:v="urn:schemas-microsoft-com:vml" xmlns:wp14="http://schemas.microsoft.com/office/word/2010/wordprocessingDrawing" xmlns:wp="http://schemas.openxmlformats.org/drawingml/2006/wordprocessingDrawing" xmlns:w10="urn:schemas-microsoft-com:office:word" xmlns:w="http://schemas.openxmlformats.org/wordprocessingml/2006/main" xmlns:w14="http://schemas.microsoft.com/office/word/2010/wordml" xmlns:w15="http://schemas.microsoft.com/office/word/2012/wordml" xmlns:w16cei="http://schemas.microsoft.com/office/word/2026/wordml/cei" xmlns:w16cex="http://schemas.microsoft.com/office/word/2018/wordml/cex" xmlns:w16cid="http://schemas.microsoft.com/office/word/2016/wordml/cid" xmlns:w16="http://schemas.microsoft.com/office/word/2018/wordml" xmlns:w16du="http://schemas.microsoft.com/office/word/2023/wordml/word16du" xmlns:w16sdtdh="http://schemas.microsoft.com/office/word/2020/wordml/sdtdatahash" xmlns:w16sdtfl="http://schemas.microsoft.com/office/word/2024/wordml/sdtformatlock" xmlns:w16se="http://schemas.microsoft.com/office/word/2015/wordml/symex" xmlns:wpg="http://schemas.microsoft.com/office/word/2010/wordprocessingGroup" xmlns:wpi="http://schemas.microsoft.com/office/word/2010/wordprocessingInk" xmlns:wne="http://schemas.microsoft.com/office/word/2006/wordml" xmlns:wps="http://schemas.microsoft.com/office/word/2010/wordprocessingShape" mc:Ignorable="w14 w15 w16se w16cid w16 w16cex w16sdtdh w16sdtfl w16du wp14">
+<w:hdr xmlns:wpc="http://schemas.microsoft.com/office/word/2010/wordprocessingCanvas" xmlns:cx="http://schemas.microsoft.com/office/drawing/2014/chartex" xmlns:cx1="http://schemas.microsoft.com/office/drawing/2015/9/8/chartex" xmlns:cx2="http://schemas.microsoft.com/office/drawing/2015/10/21/chartex" xmlns:cx3="http://schemas.microsoft.com/office/drawing/2016/5/9/chartex" xmlns:cx4="http://schemas.microsoft.com/office/drawing/2016/5/10/chartex" xmlns:cx5="http://schemas.microsoft.com/office/drawing/2016/5/11/chartex" xmlns:cx6="http://schemas.microsoft.com/office/drawing/2016/5/12/chartex" xmlns:cx7="http://schemas.microsoft.com/office/drawing/2016/5/13/chartex" xmlns:cx8="http://schemas.microsoft.com/office/drawing/2016/5/14/chartex" xmlns:mc="http://schemas.openxmlformats.org/markup-compatibility/2006" xmlns:aink="http://schemas.microsoft.com/office/drawing/2016/ink" xmlns:am3d="http://schemas.microsoft.com/office/drawing/2017/model3d" xmlns:o="urn:schemas-microsoft-com:office:office" xmlns:oel="http://schemas.microsoft.com/office/2019/extlst" xmlns:r="http://schemas.openxmlformats.org/officeDocument/2006/relationships" xmlns:m="http://schemas.openxmlformats.org/officeDocument/2006/math" xmlns:v="urn:schemas-microsoft-com:vml" xmlns:wp14="http://schemas.microsoft.com/office/word/2010/wordprocessingDrawing" xmlns:wp="http://schemas.openxmlformats.org/drawingml/2006/wordprocessingDrawing" xmlns:w10="urn:schemas-microsoft-com:office:word" xmlns:w="http://schemas.openxmlformats.org/wordprocessingml/2006/main" xmlns:w14="http://schemas.microsoft.com/office/word/2010/wordml" xmlns:w15="http://schemas.microsoft.com/office/word/2012/wordml" xmlns:w16cex="http://schemas.microsoft.com/office/word/2018/wordml/cex" xmlns:w16cid="http://schemas.microsoft.com/office/word/2016/wordml/cid" xmlns:w16="http://schemas.microsoft.com/office/word/2018/wordml" xmlns:w16du="http://schemas.microsoft.com/office/word/2023/wordml/word16du" xmlns:w16sdtdh="http://schemas.microsoft.com/office/word/2020/wordml/sdtdatahash" xmlns:w16sdtfl="http://schemas.microsoft.com/office/word/2024/wordml/sdtformatlock" xmlns:w16se="http://schemas.microsoft.com/office/word/2015/wordml/symex" xmlns:wpg="http://schemas.microsoft.com/office/word/2010/wordprocessingGroup" xmlns:wpi="http://schemas.microsoft.com/office/word/2010/wordprocessingInk" xmlns:wne="http://schemas.microsoft.com/office/word/2006/wordml" xmlns:wps="http://schemas.microsoft.com/office/word/2010/wordprocessingShape" mc:Ignorable="w14 w15 w16se w16cid w16 w16cex w16sdtdh w16sdtfl w16du wp14">
   <w:p>
     <w:pPr>
       <w:pStyle w:val="Encabezado"/>
@@ -20025,7 +20218,7 @@
 </file>
 
 <file path=word/numbering.xml><?xml version="1.0" encoding="utf-8"?>
-<w:numbering xmlns:wpc="http://schemas.microsoft.com/office/word/2010/wordprocessingCanvas" xmlns:cx="http://schemas.microsoft.com/office/drawing/2014/chartex" xmlns:cx1="http://schemas.microsoft.com/office/drawing/2015/9/8/chartex" xmlns:cx2="http://schemas.microsoft.com/office/drawing/2015/10/21/chartex" xmlns:cx3="http://schemas.microsoft.com/office/drawing/2016/5/9/chartex" xmlns:cx4="http://schemas.microsoft.com/office/drawing/2016/5/10/chartex" xmlns:cx5="http://schemas.microsoft.com/office/drawing/2016/5/11/chartex" xmlns:cx6="http://schemas.microsoft.com/office/drawing/2016/5/12/chartex" xmlns:cx7="http://schemas.microsoft.com/office/drawing/2016/5/13/chartex" xmlns:cx8="http://schemas.microsoft.com/office/drawing/2016/5/14/chartex" xmlns:mc="http://schemas.openxmlformats.org/markup-compatibility/2006" xmlns:aink="http://schemas.microsoft.com/office/drawing/2016/ink" xmlns:am3d="http://schemas.microsoft.com/office/drawing/2017/model3d" xmlns:o="urn:schemas-microsoft-com:office:office" xmlns:oel="http://schemas.microsoft.com/office/2019/extlst" xmlns:r="http://schemas.openxmlformats.org/officeDocument/2006/relationships" xmlns:m="http://schemas.openxmlformats.org/officeDocument/2006/math" xmlns:v="urn:schemas-microsoft-com:vml" xmlns:wp14="http://schemas.microsoft.com/office/word/2010/wordprocessingDrawing" xmlns:wp="http://schemas.openxmlformats.org/drawingml/2006/wordprocessingDrawing" xmlns:w10="urn:schemas-microsoft-com:office:word" xmlns:w="http://schemas.openxmlformats.org/wordprocessingml/2006/main" xmlns:w14="http://schemas.microsoft.com/office/word/2010/wordml" xmlns:w15="http://schemas.microsoft.com/office/word/2012/wordml" xmlns:w16cei="http://schemas.microsoft.com/office/word/2026/wordml/cei" xmlns:w16cex="http://schemas.microsoft.com/office/word/2018/wordml/cex" xmlns:w16cid="http://schemas.microsoft.com/office/word/2016/wordml/cid" xmlns:w16="http://schemas.microsoft.com/office/word/2018/wordml" xmlns:w16du="http://schemas.microsoft.com/office/word/2023/wordml/word16du" xmlns:w16sdtdh="http://schemas.microsoft.com/office/word/2020/wordml/sdtdatahash" xmlns:w16sdtfl="http://schemas.microsoft.com/office/word/2024/wordml/sdtformatlock" xmlns:w16se="http://schemas.microsoft.com/office/word/2015/wordml/symex" xmlns:wpg="http://schemas.microsoft.com/office/word/2010/wordprocessingGroup" xmlns:wpi="http://schemas.microsoft.com/office/word/2010/wordprocessingInk" xmlns:wne="http://schemas.microsoft.com/office/word/2006/wordml" xmlns:wps="http://schemas.microsoft.com/office/word/2010/wordprocessingShape" mc:Ignorable="w14 w15 w16se w16cid w16 w16cex w16sdtdh w16sdtfl w16du wp14">
+<w:numbering xmlns:wpc="http://schemas.microsoft.com/office/word/2010/wordprocessingCanvas" xmlns:cx="http://schemas.microsoft.com/office/drawing/2014/chartex" xmlns:cx1="http://schemas.microsoft.com/office/drawing/2015/9/8/chartex" xmlns:cx2="http://schemas.microsoft.com/office/drawing/2015/10/21/chartex" xmlns:cx3="http://schemas.microsoft.com/office/drawing/2016/5/9/chartex" xmlns:cx4="http://schemas.microsoft.com/office/drawing/2016/5/10/chartex" xmlns:cx5="http://schemas.microsoft.com/office/drawing/2016/5/11/chartex" xmlns:cx6="http://schemas.microsoft.com/office/drawing/2016/5/12/chartex" xmlns:cx7="http://schemas.microsoft.com/office/drawing/2016/5/13/chartex" xmlns:cx8="http://schemas.microsoft.com/office/drawing/2016/5/14/chartex" xmlns:mc="http://schemas.openxmlformats.org/markup-compatibility/2006" xmlns:aink="http://schemas.microsoft.com/office/drawing/2016/ink" xmlns:am3d="http://schemas.microsoft.com/office/drawing/2017/model3d" xmlns:o="urn:schemas-microsoft-com:office:office" xmlns:oel="http://schemas.microsoft.com/office/2019/extlst" xmlns:r="http://schemas.openxmlformats.org/officeDocument/2006/relationships" xmlns:m="http://schemas.openxmlformats.org/officeDocument/2006/math" xmlns:v="urn:schemas-microsoft-com:vml" xmlns:wp14="http://schemas.microsoft.com/office/word/2010/wordprocessingDrawing" xmlns:wp="http://schemas.openxmlformats.org/drawingml/2006/wordprocessingDrawing" xmlns:w10="urn:schemas-microsoft-com:office:word" xmlns:w="http://schemas.openxmlformats.org/wordprocessingml/2006/main" xmlns:w14="http://schemas.microsoft.com/office/word/2010/wordml" xmlns:w15="http://schemas.microsoft.com/office/word/2012/wordml" xmlns:w16cex="http://schemas.microsoft.com/office/word/2018/wordml/cex" xmlns:w16cid="http://schemas.microsoft.com/office/word/2016/wordml/cid" xmlns:w16="http://schemas.microsoft.com/office/word/2018/wordml" xmlns:w16du="http://schemas.microsoft.com/office/word/2023/wordml/word16du" xmlns:w16sdtdh="http://schemas.microsoft.com/office/word/2020/wordml/sdtdatahash" xmlns:w16sdtfl="http://schemas.microsoft.com/office/word/2024/wordml/sdtformatlock" xmlns:w16se="http://schemas.microsoft.com/office/word/2015/wordml/symex" xmlns:wpg="http://schemas.microsoft.com/office/word/2010/wordprocessingGroup" xmlns:wpi="http://schemas.microsoft.com/office/word/2010/wordprocessingInk" xmlns:wne="http://schemas.microsoft.com/office/word/2006/wordml" xmlns:wps="http://schemas.microsoft.com/office/word/2010/wordprocessingShape" mc:Ignorable="w14 w15 w16se w16cid w16 w16cex w16sdtdh w16sdtfl w16du wp14">
   <w:abstractNum w:abstractNumId="0" w15:restartNumberingAfterBreak="0">
     <w:nsid w:val="FFFFFF89"/>
     <w:multiLevelType w:val="singleLevel"/>
@@ -22589,17 +22782,17 @@
   <w:abstractNum w:abstractNumId="24" w15:restartNumberingAfterBreak="0">
     <w:nsid w:val="50DA05D3"/>
     <w:multiLevelType w:val="hybridMultilevel"/>
-    <w:tmpl w:val="6DA48E54"/>
-    <w:lvl w:ilvl="0" w:tplc="240A0001">
-      <w:start w:val="1"/>
-      <w:numFmt w:val="bullet"/>
-      <w:lvlText w:val=""/>
+    <w:tmpl w:val="E5FA604A"/>
+    <w:lvl w:ilvl="0" w:tplc="240A0005">
+      <w:start w:val="1"/>
+      <w:numFmt w:val="bullet"/>
+      <w:lvlText w:val=""/>
       <w:lvlJc w:val="left"/>
       <w:pPr>
         <w:ind w:left="1428" w:hanging="360"/>
       </w:pPr>
       <w:rPr>
-        <w:rFonts w:ascii="Symbol" w:hAnsi="Symbol" w:hint="default"/>
+        <w:rFonts w:ascii="Wingdings" w:hAnsi="Wingdings" w:hint="default"/>
       </w:rPr>
     </w:lvl>
     <w:lvl w:ilvl="1" w:tplc="240A0003" w:tentative="1">
@@ -23815,6 +24008,119 @@
     </w:lvl>
   </w:abstractNum>
   <w:abstractNum w:abstractNumId="35" w15:restartNumberingAfterBreak="0">
+    <w:nsid w:val="6F670880"/>
+    <w:multiLevelType w:val="hybridMultilevel"/>
+    <w:tmpl w:val="B2C246B6"/>
+    <w:lvl w:ilvl="0" w:tplc="240A0001">
+      <w:start w:val="1"/>
+      <w:numFmt w:val="bullet"/>
+      <w:lvlText w:val=""/>
+      <w:lvlJc w:val="left"/>
+      <w:pPr>
+        <w:ind w:left="709" w:hanging="360"/>
+      </w:pPr>
+      <w:rPr>
+        <w:rFonts w:ascii="Symbol" w:hAnsi="Symbol" w:hint="default"/>
+      </w:rPr>
+    </w:lvl>
+    <w:lvl w:ilvl="1" w:tplc="FFFFFFFF" w:tentative="1">
+      <w:start w:val="1"/>
+      <w:numFmt w:val="bullet"/>
+      <w:lvlText w:val="o"/>
+      <w:lvlJc w:val="left"/>
+      <w:pPr>
+        <w:ind w:left="1429" w:hanging="360"/>
+      </w:pPr>
+      <w:rPr>
+        <w:rFonts w:ascii="Courier New" w:hAnsi="Courier New" w:cs="Courier New" w:hint="default"/>
+      </w:rPr>
+    </w:lvl>
+    <w:lvl w:ilvl="2" w:tplc="FFFFFFFF" w:tentative="1">
+      <w:start w:val="1"/>
+      <w:numFmt w:val="bullet"/>
+      <w:lvlText w:val=""/>
+      <w:lvlJc w:val="left"/>
+      <w:pPr>
+        <w:ind w:left="2149" w:hanging="360"/>
+      </w:pPr>
+      <w:rPr>
+        <w:rFonts w:ascii="Wingdings" w:hAnsi="Wingdings" w:hint="default"/>
+      </w:rPr>
+    </w:lvl>
+    <w:lvl w:ilvl="3" w:tplc="FFFFFFFF" w:tentative="1">
+      <w:start w:val="1"/>
+      <w:numFmt w:val="bullet"/>
+      <w:lvlText w:val=""/>
+      <w:lvlJc w:val="left"/>
+      <w:pPr>
+        <w:ind w:left="2869" w:hanging="360"/>
+      </w:pPr>
+      <w:rPr>
+        <w:rFonts w:ascii="Symbol" w:hAnsi="Symbol" w:hint="default"/>
+      </w:rPr>
+    </w:lvl>
+    <w:lvl w:ilvl="4" w:tplc="FFFFFFFF" w:tentative="1">
+      <w:start w:val="1"/>
+      <w:numFmt w:val="bullet"/>
+      <w:lvlText w:val="o"/>
+      <w:lvlJc w:val="left"/>
+      <w:pPr>
+        <w:ind w:left="3589" w:hanging="360"/>
+      </w:pPr>
+      <w:rPr>
+        <w:rFonts w:ascii="Courier New" w:hAnsi="Courier New" w:cs="Courier New" w:hint="default"/>
+      </w:rPr>
+    </w:lvl>
+    <w:lvl w:ilvl="5" w:tplc="FFFFFFFF" w:tentative="1">
+      <w:start w:val="1"/>
+      <w:numFmt w:val="bullet"/>
+      <w:lvlText w:val=""/>
+      <w:lvlJc w:val="left"/>
+      <w:pPr>
+        <w:ind w:left="4309" w:hanging="360"/>
+      </w:pPr>
+      <w:rPr>
+        <w:rFonts w:ascii="Wingdings" w:hAnsi="Wingdings" w:hint="default"/>
+      </w:rPr>
+    </w:lvl>
+    <w:lvl w:ilvl="6" w:tplc="FFFFFFFF" w:tentative="1">
+      <w:start w:val="1"/>
+      <w:numFmt w:val="bullet"/>
+      <w:lvlText w:val=""/>
+      <w:lvlJc w:val="left"/>
+      <w:pPr>
+        <w:ind w:left="5029" w:hanging="360"/>
+      </w:pPr>
+      <w:rPr>
+        <w:rFonts w:ascii="Symbol" w:hAnsi="Symbol" w:hint="default"/>
+      </w:rPr>
+    </w:lvl>
+    <w:lvl w:ilvl="7" w:tplc="FFFFFFFF" w:tentative="1">
+      <w:start w:val="1"/>
+      <w:numFmt w:val="bullet"/>
+      <w:lvlText w:val="o"/>
+      <w:lvlJc w:val="left"/>
+      <w:pPr>
+        <w:ind w:left="5749" w:hanging="360"/>
+      </w:pPr>
+      <w:rPr>
+        <w:rFonts w:ascii="Courier New" w:hAnsi="Courier New" w:cs="Courier New" w:hint="default"/>
+      </w:rPr>
+    </w:lvl>
+    <w:lvl w:ilvl="8" w:tplc="FFFFFFFF" w:tentative="1">
+      <w:start w:val="1"/>
+      <w:numFmt w:val="bullet"/>
+      <w:lvlText w:val=""/>
+      <w:lvlJc w:val="left"/>
+      <w:pPr>
+        <w:ind w:left="6469" w:hanging="360"/>
+      </w:pPr>
+      <w:rPr>
+        <w:rFonts w:ascii="Wingdings" w:hAnsi="Wingdings" w:hint="default"/>
+      </w:rPr>
+    </w:lvl>
+  </w:abstractNum>
+  <w:abstractNum w:abstractNumId="36" w15:restartNumberingAfterBreak="0">
     <w:nsid w:val="71EC44B3"/>
     <w:multiLevelType w:val="hybridMultilevel"/>
     <w:tmpl w:val="D2E29D74"/>
@@ -23927,7 +24233,7 @@
       </w:rPr>
     </w:lvl>
   </w:abstractNum>
-  <w:abstractNum w:abstractNumId="36" w15:restartNumberingAfterBreak="0">
+  <w:abstractNum w:abstractNumId="37" w15:restartNumberingAfterBreak="0">
     <w:nsid w:val="79963E85"/>
     <w:multiLevelType w:val="hybridMultilevel"/>
     <w:tmpl w:val="7C74CD64"/>
@@ -24040,7 +24346,7 @@
       </w:rPr>
     </w:lvl>
   </w:abstractNum>
-  <w:abstractNum w:abstractNumId="37" w15:restartNumberingAfterBreak="0">
+  <w:abstractNum w:abstractNumId="38" w15:restartNumberingAfterBreak="0">
     <w:nsid w:val="7CBE45E0"/>
     <w:multiLevelType w:val="hybridMultilevel"/>
     <w:tmpl w:val="1D0A6A86"/>
@@ -24153,7 +24459,7 @@
       </w:rPr>
     </w:lvl>
   </w:abstractNum>
-  <w:abstractNum w:abstractNumId="38" w15:restartNumberingAfterBreak="0">
+  <w:abstractNum w:abstractNumId="39" w15:restartNumberingAfterBreak="0">
     <w:nsid w:val="7D9F2190"/>
     <w:multiLevelType w:val="multilevel"/>
     <w:tmpl w:val="C310D260"/>
@@ -24302,7 +24608,7 @@
       </w:rPr>
     </w:lvl>
   </w:abstractNum>
-  <w:abstractNum w:abstractNumId="39" w15:restartNumberingAfterBreak="0">
+  <w:abstractNum w:abstractNumId="40" w15:restartNumberingAfterBreak="0">
     <w:nsid w:val="7E8E589B"/>
     <w:multiLevelType w:val="hybridMultilevel"/>
     <w:tmpl w:val="46B0342C"/>
@@ -24494,7 +24800,7 @@
     <w:abstractNumId w:val="24"/>
   </w:num>
   <w:num w:numId="27" w16cid:durableId="603537878">
-    <w:abstractNumId w:val="36"/>
+    <w:abstractNumId w:val="37"/>
   </w:num>
   <w:num w:numId="28" w16cid:durableId="287397507">
     <w:abstractNumId w:val="10"/>
@@ -24503,13 +24809,13 @@
     <w:abstractNumId w:val="9"/>
   </w:num>
   <w:num w:numId="30" w16cid:durableId="1826895598">
-    <w:abstractNumId w:val="37"/>
+    <w:abstractNumId w:val="38"/>
   </w:num>
   <w:num w:numId="31" w16cid:durableId="1484084394">
     <w:abstractNumId w:val="14"/>
   </w:num>
   <w:num w:numId="32" w16cid:durableId="1204752978">
-    <w:abstractNumId w:val="39"/>
+    <w:abstractNumId w:val="40"/>
   </w:num>
   <w:num w:numId="33" w16cid:durableId="278951451">
     <w:abstractNumId w:val="9"/>
@@ -24533,16 +24839,19 @@
     <w:abstractNumId w:val="32"/>
   </w:num>
   <w:num w:numId="40" w16cid:durableId="1172259863">
-    <w:abstractNumId w:val="38"/>
+    <w:abstractNumId w:val="39"/>
   </w:num>
   <w:num w:numId="41" w16cid:durableId="1622689243">
     <w:abstractNumId w:val="6"/>
   </w:num>
   <w:num w:numId="42" w16cid:durableId="949123409">
-    <w:abstractNumId w:val="35"/>
+    <w:abstractNumId w:val="36"/>
   </w:num>
   <w:num w:numId="43" w16cid:durableId="176891974">
     <w:abstractNumId w:val="31"/>
+  </w:num>
+  <w:num w:numId="44" w16cid:durableId="1220164310">
+    <w:abstractNumId w:val="35"/>
   </w:num>
   <w:numIdMacAtCleanup w:val="16"/>
 </w:numbering>
@@ -25146,6 +25455,7 @@
   <w:style w:type="character" w:default="1" w:styleId="Fuentedeprrafopredeter">
     <w:name w:val="Default Paragraph Font"/>
     <w:uiPriority w:val="1"/>
+    <w:semiHidden/>
     <w:unhideWhenUsed/>
   </w:style>
   <w:style w:type="table" w:default="1" w:styleId="Tablanormal">
@@ -26379,6 +26689,19 @@
 </file>
 
 <file path=customXml/item1.xml><?xml version="1.0" encoding="utf-8"?>
+<?mso-contentType ?>
+<FormTemplates xmlns="http://schemas.microsoft.com/sharepoint/v3/contenttype/forms">
+  <Display>DocumentLibraryForm</Display>
+  <Edit>DocumentLibraryForm</Edit>
+  <New>DocumentLibraryForm</New>
+</FormTemplates>
+</file>
+
+<file path=customXml/item2.xml><?xml version="1.0" encoding="utf-8"?>
+<b:Sources xmlns:b="http://schemas.openxmlformats.org/officeDocument/2006/bibliography" xmlns="http://schemas.openxmlformats.org/officeDocument/2006/bibliography" SelectedStyle="\APASixthEditionOfficeOnline.xsl" StyleName="APA" Version="6"/>
+</file>
+
+<file path=customXml/item3.xml><?xml version="1.0" encoding="utf-8"?>
 <ct:contentTypeSchema xmlns:ct="http://schemas.microsoft.com/office/2006/metadata/contentType" xmlns:ma="http://schemas.microsoft.com/office/2006/metadata/properties/metaAttributes" ct:_="" ma:_="" ma:contentTypeName="Documento" ma:contentTypeID="0x0101006A81D6BD42E8DF4C91013959704817E1" ma:contentTypeVersion="15" ma:contentTypeDescription="Crear nuevo documento." ma:contentTypeScope="" ma:versionID="bf4f72ffd194f0963ff564daca6869f7">
   <xsd:schema xmlns:xsd="http://www.w3.org/2001/XMLSchema" xmlns:xs="http://www.w3.org/2001/XMLSchema" xmlns:p="http://schemas.microsoft.com/office/2006/metadata/properties" xmlns:ns2="13c90a0b-73bc-4dc0-be5f-28d77b615beb" xmlns:ns3="13c93bba-48ce-428c-bfe5-88b42c19b028" targetNamespace="http://schemas.microsoft.com/office/2006/metadata/properties" ma:root="true" ma:fieldsID="8718d6f4873a5b1392a45044efa78385" ns2:_="" ns3:_="">
     <xsd:import namespace="13c90a0b-73bc-4dc0-be5f-28d77b615beb"/>
@@ -26613,19 +26936,6 @@
 </ct:contentTypeSchema>
 </file>
 
-<file path=customXml/item2.xml><?xml version="1.0" encoding="utf-8"?>
-<b:Sources xmlns:b="http://schemas.openxmlformats.org/officeDocument/2006/bibliography" xmlns="http://schemas.openxmlformats.org/officeDocument/2006/bibliography" SelectedStyle="\APASixthEditionOfficeOnline.xsl" StyleName="APA" Version="6"/>
-</file>
-
-<file path=customXml/item3.xml><?xml version="1.0" encoding="utf-8"?>
-<?mso-contentType ?>
-<FormTemplates xmlns="http://schemas.microsoft.com/sharepoint/v3/contenttype/forms">
-  <Display>DocumentLibraryForm</Display>
-  <Edit>DocumentLibraryForm</Edit>
-  <New>DocumentLibraryForm</New>
-</FormTemplates>
-</file>
-
 <file path=customXml/item4.xml><?xml version="1.0" encoding="utf-8"?>
 <p:properties xmlns:p="http://schemas.microsoft.com/office/2006/metadata/properties" xmlns:xsi="http://www.w3.org/2001/XMLSchema-instance" xmlns:pc="http://schemas.microsoft.com/office/infopath/2007/PartnerControls">
   <documentManagement>
@@ -26638,6 +26948,22 @@
 </file>
 
 <file path=customXml/itemProps1.xml><?xml version="1.0" encoding="utf-8"?>
+<ds:datastoreItem xmlns:ds="http://schemas.openxmlformats.org/officeDocument/2006/customXml" ds:itemID="{91756AAB-0645-4FFC-990B-34BB6096B23B}">
+  <ds:schemaRefs>
+    <ds:schemaRef ds:uri="http://schemas.microsoft.com/sharepoint/v3/contenttype/forms"/>
+  </ds:schemaRefs>
+</ds:datastoreItem>
+</file>
+
+<file path=customXml/itemProps2.xml><?xml version="1.0" encoding="utf-8"?>
+<ds:datastoreItem xmlns:ds="http://schemas.openxmlformats.org/officeDocument/2006/customXml" ds:itemID="{1AF2C25B-FB23-49D7-861B-D97474F002D2}">
+  <ds:schemaRefs>
+    <ds:schemaRef ds:uri="http://schemas.openxmlformats.org/officeDocument/2006/bibliography"/>
+  </ds:schemaRefs>
+</ds:datastoreItem>
+</file>
+
+<file path=customXml/itemProps3.xml><?xml version="1.0" encoding="utf-8"?>
 <ds:datastoreItem xmlns:ds="http://schemas.openxmlformats.org/officeDocument/2006/customXml" ds:itemID="{4B3C6E78-634C-4AE7-B2E1-4D68F5BA9D52}">
   <ds:schemaRefs>
     <ds:schemaRef ds:uri="http://schemas.microsoft.com/office/2006/metadata/contentType"/>
@@ -26656,22 +26982,6 @@
 </ds:datastoreItem>
 </file>
 
-<file path=customXml/itemProps2.xml><?xml version="1.0" encoding="utf-8"?>
-<ds:datastoreItem xmlns:ds="http://schemas.openxmlformats.org/officeDocument/2006/customXml" ds:itemID="{1AF2C25B-FB23-49D7-861B-D97474F002D2}">
-  <ds:schemaRefs>
-    <ds:schemaRef ds:uri="http://schemas.openxmlformats.org/officeDocument/2006/bibliography"/>
-  </ds:schemaRefs>
-</ds:datastoreItem>
-</file>
-
-<file path=customXml/itemProps3.xml><?xml version="1.0" encoding="utf-8"?>
-<ds:datastoreItem xmlns:ds="http://schemas.openxmlformats.org/officeDocument/2006/customXml" ds:itemID="{91756AAB-0645-4FFC-990B-34BB6096B23B}">
-  <ds:schemaRefs>
-    <ds:schemaRef ds:uri="http://schemas.microsoft.com/sharepoint/v3/contenttype/forms"/>
-  </ds:schemaRefs>
-</ds:datastoreItem>
-</file>
-
 <file path=customXml/itemProps4.xml><?xml version="1.0" encoding="utf-8"?>
 <ds:datastoreItem xmlns:ds="http://schemas.openxmlformats.org/officeDocument/2006/customXml" ds:itemID="{CEECB56F-E1D8-45BF-A0A3-B5258E7263D4}">
   <ds:schemaRefs>

</xml_diff>